<commit_message>
fix: usar selectedPlantilla en vista previa tiempo real en lugar de plantilla fija
</commit_message>
<xml_diff>
--- a/backend/templates/EDOMEX_AP_M_SOLTERA.docx
+++ b/backend/templates/EDOMEX_AP_M_SOLTERA.docx
@@ -123,8 +123,8 @@
         </w:rPr>
         <w:t>VOLUMEN NÚMERO</w:t>
       </w:r>
-      <w:bookmarkStart w:id="0" w:name="_Hlk25759886"/>
-      <w:bookmarkStart w:id="1" w:name="_Hlk30500945"/>
+      <w:bookmarkStart w:id="0" w:name="_Hlk30500945"/>
+      <w:bookmarkStart w:id="1" w:name="_Hlk25759886"/>
       <w:r>
         <w:rPr>
           <w:rFonts w:ascii="Arial" w:hAnsi="Arial" w:cs="Arial"/>
@@ -235,62 +235,62 @@
         </w:rPr>
         <w:t>/</w:t>
       </w:r>
+      <w:bookmarkEnd w:id="0"/>
+      <w:r>
+        <w:rPr>
+          <w:rFonts w:ascii="Arial" w:hAnsi="Arial" w:cs="Arial"/>
+          <w:sz w:val="14"/>
+          <w:szCs w:val="14"/>
+          <w:lang w:val="pt-PT"/>
+        </w:rPr>
+        <w:t>JCOR</w:t>
+      </w:r>
+      <w:r>
+        <w:rPr>
+          <w:rFonts w:ascii="Arial" w:hAnsi="Arial" w:cs="Arial"/>
+          <w:sz w:val="14"/>
+          <w:szCs w:val="14"/>
+          <w:lang w:val="pt-PT"/>
+        </w:rPr>
+        <w:t>/</w:t>
+      </w:r>
+      <w:r>
+        <w:rPr>
+          <w:rFonts w:ascii="Arial" w:hAnsi="Arial" w:cs="Arial"/>
+          <w:sz w:val="14"/>
+          <w:szCs w:val="14"/>
+          <w:lang w:val="pt-PT"/>
+        </w:rPr>
+        <w:t xml:space="preserve">    </w:t>
+      </w:r>
+      <w:r>
+        <w:rPr>
+          <w:rFonts w:ascii="Arial" w:hAnsi="Arial" w:cs="Arial"/>
+          <w:sz w:val="14"/>
+          <w:szCs w:val="14"/>
+          <w:lang w:val="pt-PT"/>
+        </w:rPr>
+        <w:t>/</w:t>
+      </w:r>
+      <w:r>
+        <w:rPr>
+          <w:rFonts w:ascii="Arial" w:hAnsi="Arial" w:cs="Arial"/>
+          <w:sz w:val="14"/>
+          <w:szCs w:val="14"/>
+          <w:lang w:val="pt-PT"/>
+        </w:rPr>
+        <w:t xml:space="preserve">    </w:t>
+      </w:r>
+      <w:r>
+        <w:rPr>
+          <w:rFonts w:ascii="Arial" w:hAnsi="Arial" w:cs="Arial"/>
+          <w:sz w:val="14"/>
+          <w:szCs w:val="14"/>
+          <w:lang w:val="pt-PT"/>
+        </w:rPr>
+        <w:t xml:space="preserve">/    </w:t>
+      </w:r>
       <w:bookmarkEnd w:id="1"/>
-      <w:r>
-        <w:rPr>
-          <w:rFonts w:ascii="Arial" w:hAnsi="Arial" w:cs="Arial"/>
-          <w:sz w:val="14"/>
-          <w:szCs w:val="14"/>
-          <w:lang w:val="pt-PT"/>
-        </w:rPr>
-        <w:t>JCOR</w:t>
-      </w:r>
-      <w:r>
-        <w:rPr>
-          <w:rFonts w:ascii="Arial" w:hAnsi="Arial" w:cs="Arial"/>
-          <w:sz w:val="14"/>
-          <w:szCs w:val="14"/>
-          <w:lang w:val="pt-PT"/>
-        </w:rPr>
-        <w:t>/</w:t>
-      </w:r>
-      <w:r>
-        <w:rPr>
-          <w:rFonts w:ascii="Arial" w:hAnsi="Arial" w:cs="Arial"/>
-          <w:sz w:val="14"/>
-          <w:szCs w:val="14"/>
-          <w:lang w:val="pt-PT"/>
-        </w:rPr>
-        <w:t xml:space="preserve">    </w:t>
-      </w:r>
-      <w:r>
-        <w:rPr>
-          <w:rFonts w:ascii="Arial" w:hAnsi="Arial" w:cs="Arial"/>
-          <w:sz w:val="14"/>
-          <w:szCs w:val="14"/>
-          <w:lang w:val="pt-PT"/>
-        </w:rPr>
-        <w:t>/</w:t>
-      </w:r>
-      <w:r>
-        <w:rPr>
-          <w:rFonts w:ascii="Arial" w:hAnsi="Arial" w:cs="Arial"/>
-          <w:sz w:val="14"/>
-          <w:szCs w:val="14"/>
-          <w:lang w:val="pt-PT"/>
-        </w:rPr>
-        <w:t xml:space="preserve">    </w:t>
-      </w:r>
-      <w:r>
-        <w:rPr>
-          <w:rFonts w:ascii="Arial" w:hAnsi="Arial" w:cs="Arial"/>
-          <w:sz w:val="14"/>
-          <w:szCs w:val="14"/>
-          <w:lang w:val="pt-PT"/>
-        </w:rPr>
-        <w:t xml:space="preserve">/    </w:t>
-      </w:r>
-      <w:bookmarkEnd w:id="0"/>
       <w:r>
         <w:rPr>
           <w:rFonts w:ascii="Arial" w:hAnsi="Arial" w:cs="Arial"/>
@@ -356,8 +356,8 @@
         </w:rPr>
         <w:tab/>
       </w:r>
-      <w:bookmarkStart w:id="2" w:name="_Hlk15562154"/>
-      <w:bookmarkStart w:id="3" w:name="_Hlk43303158"/>
+      <w:bookmarkStart w:id="2" w:name="_Hlk43303158"/>
+      <w:bookmarkStart w:id="3" w:name="_Hlk15562154"/>
     </w:p>
     <w:p>
       <w:pPr>
@@ -549,6 +549,126 @@
         </w:rPr>
         <w:t xml:space="preserve">A FAVOR DE LA SEÑORA </w:t>
       </w:r>
+      <w:proofErr w:type="gramStart"/>
+      <w:r>
+        <w:rPr>
+          <w:rFonts w:ascii="Arial" w:hAnsi="Arial" w:cs="Arial"/>
+          <w:b/>
+          <w:sz w:val="14"/>
+          <w:szCs w:val="14"/>
+          <w:lang w:val="es-MX"/>
+        </w:rPr>
+        <w:t xml:space="preserve">{{ </w:t>
+      </w:r>
+      <w:proofErr w:type="spellStart"/>
+      <w:r>
+        <w:rPr>
+          <w:rFonts w:ascii="Arial" w:hAnsi="Arial" w:cs="Arial"/>
+          <w:b/>
+          <w:sz w:val="14"/>
+          <w:szCs w:val="14"/>
+          <w:lang w:val="es-MX"/>
+        </w:rPr>
+        <w:t>nombre</w:t>
+      </w:r>
+      <w:proofErr w:type="gramEnd"/>
+      <w:r>
+        <w:rPr>
+          <w:rFonts w:ascii="Arial" w:hAnsi="Arial" w:cs="Arial"/>
+          <w:b/>
+          <w:sz w:val="14"/>
+          <w:szCs w:val="14"/>
+          <w:lang w:val="es-MX"/>
+        </w:rPr>
+        <w:t>_</w:t>
+      </w:r>
+      <w:proofErr w:type="gramStart"/>
+      <w:r>
+        <w:rPr>
+          <w:rFonts w:ascii="Arial" w:hAnsi="Arial" w:cs="Arial"/>
+          <w:b/>
+          <w:sz w:val="14"/>
+          <w:szCs w:val="14"/>
+          <w:lang w:val="es-MX"/>
+        </w:rPr>
+        <w:t>acreditado</w:t>
+      </w:r>
+      <w:proofErr w:type="spellEnd"/>
+      <w:r>
+        <w:rPr>
+          <w:rFonts w:ascii="Arial" w:hAnsi="Arial" w:cs="Arial"/>
+          <w:b/>
+          <w:sz w:val="14"/>
+          <w:szCs w:val="14"/>
+          <w:lang w:val="es-MX"/>
+        </w:rPr>
+        <w:t xml:space="preserve"> }</w:t>
+      </w:r>
+      <w:proofErr w:type="gramEnd"/>
+      <w:r>
+        <w:rPr>
+          <w:rFonts w:ascii="Arial" w:hAnsi="Arial" w:cs="Arial"/>
+          <w:b/>
+          <w:sz w:val="14"/>
+          <w:szCs w:val="14"/>
+          <w:lang w:val="es-MX"/>
+        </w:rPr>
+        <w:t>}</w:t>
+      </w:r>
+      <w:r>
+        <w:rPr>
+          <w:rFonts w:ascii="Arial" w:hAnsi="Arial" w:cs="Arial"/>
+          <w:bCs/>
+          <w:sz w:val="14"/>
+          <w:szCs w:val="14"/>
+        </w:rPr>
+        <w:t xml:space="preserve"> </w:t>
+      </w:r>
+      <w:r>
+        <w:rPr>
+          <w:rFonts w:ascii="Arial" w:hAnsi="Arial" w:cs="Arial"/>
+          <w:bCs/>
+          <w:sz w:val="14"/>
+          <w:szCs w:val="14"/>
+        </w:rPr>
+        <w:t>EN LO SUCESIVO “</w:t>
+      </w:r>
+      <w:r>
+        <w:rPr>
+          <w:rFonts w:ascii="Arial" w:hAnsi="Arial" w:cs="Arial"/>
+          <w:b/>
+          <w:sz w:val="14"/>
+          <w:szCs w:val="14"/>
+        </w:rPr>
+        <w:t>LA</w:t>
+      </w:r>
+      <w:r>
+        <w:rPr>
+          <w:rFonts w:ascii="Arial" w:hAnsi="Arial" w:cs="Arial"/>
+          <w:b/>
+          <w:sz w:val="14"/>
+          <w:szCs w:val="14"/>
+        </w:rPr>
+        <w:t xml:space="preserve"> ACREDITAD</w:t>
+      </w:r>
+      <w:r>
+        <w:rPr>
+          <w:rFonts w:ascii="Arial" w:hAnsi="Arial" w:cs="Arial"/>
+          <w:b/>
+          <w:sz w:val="14"/>
+          <w:szCs w:val="14"/>
+        </w:rPr>
+        <w:t>A</w:t>
+      </w:r>
+      <w:r>
+        <w:rPr>
+          <w:rFonts w:ascii="Arial" w:hAnsi="Arial" w:cs="Arial"/>
+          <w:bCs/>
+          <w:sz w:val="14"/>
+          <w:szCs w:val="14"/>
+        </w:rPr>
+        <w:t>”</w:t>
+      </w:r>
       <w:r>
         <w:rPr>
           <w:rFonts w:ascii="Arial" w:hAnsi="Arial" w:cs="Arial"/>
@@ -558,71 +678,6 @@
           <w:szCs w:val="14"/>
           <w:lang w:val="es-ES"/>
         </w:rPr>
-        <w:t>***</w:t>
-      </w:r>
-      <w:r>
-        <w:rPr>
-          <w:rFonts w:ascii="Arial" w:hAnsi="Arial" w:cs="Arial"/>
-          <w:bCs/>
-          <w:sz w:val="14"/>
-          <w:szCs w:val="14"/>
-        </w:rPr>
-        <w:t xml:space="preserve"> </w:t>
-      </w:r>
-      <w:r>
-        <w:rPr>
-          <w:rFonts w:ascii="Arial" w:hAnsi="Arial" w:cs="Arial"/>
-          <w:bCs/>
-          <w:sz w:val="14"/>
-          <w:szCs w:val="14"/>
-        </w:rPr>
-        <w:t>EN LO SUCESIVO “</w:t>
-      </w:r>
-      <w:r>
-        <w:rPr>
-          <w:rFonts w:ascii="Arial" w:hAnsi="Arial" w:cs="Arial"/>
-          <w:b/>
-          <w:sz w:val="14"/>
-          <w:szCs w:val="14"/>
-        </w:rPr>
-        <w:t>LA</w:t>
-      </w:r>
-      <w:r>
-        <w:rPr>
-          <w:rFonts w:ascii="Arial" w:hAnsi="Arial" w:cs="Arial"/>
-          <w:b/>
-          <w:sz w:val="14"/>
-          <w:szCs w:val="14"/>
-        </w:rPr>
-        <w:t xml:space="preserve"> ACREDITAD</w:t>
-      </w:r>
-      <w:r>
-        <w:rPr>
-          <w:rFonts w:ascii="Arial" w:hAnsi="Arial" w:cs="Arial"/>
-          <w:b/>
-          <w:sz w:val="14"/>
-          <w:szCs w:val="14"/>
-        </w:rPr>
-        <w:t>A</w:t>
-      </w:r>
-      <w:r>
-        <w:rPr>
-          <w:rFonts w:ascii="Arial" w:hAnsi="Arial" w:cs="Arial"/>
-          <w:bCs/>
-          <w:sz w:val="14"/>
-          <w:szCs w:val="14"/>
-        </w:rPr>
-        <w:t>”</w:t>
-      </w:r>
-      <w:r>
-        <w:rPr>
-          <w:rFonts w:ascii="Arial" w:hAnsi="Arial" w:cs="Arial"/>
-          <w:b/>
-          <w:bCs/>
-          <w:sz w:val="14"/>
-          <w:szCs w:val="14"/>
-          <w:lang w:val="es-ES"/>
-        </w:rPr>
         <w:t>.</w:t>
       </w:r>
       <w:r>
@@ -634,7 +689,7 @@
         </w:rPr>
         <w:tab/>
       </w:r>
-      <w:bookmarkEnd w:id="3"/>
+      <w:bookmarkEnd w:id="2"/>
     </w:p>
     <w:p>
       <w:pPr>
@@ -899,7 +954,7 @@
         <w:t>--------------------------------------------------------------------------------------------------------------------------------------------------------------------------------------</w:t>
       </w:r>
     </w:p>
-    <w:bookmarkEnd w:id="2"/>
+    <w:bookmarkEnd w:id="3"/>
     <w:p>
       <w:pPr>
         <w:pStyle w:val="Sinespaciado"/>
@@ -1321,25 +1376,26 @@
           <w:szCs w:val="14"/>
           <w:lang w:val="es-ES"/>
         </w:rPr>
-        <w:t>OTORGAMIENTO DE CRÉDITO Y CONSTITUCIÓN DE GARANTÍA HIPOTECARIA</w:t>
-      </w:r>
-      <w:r>
-        <w:rPr>
-          <w:rFonts w:ascii="Arial" w:eastAsia="Batang" w:hAnsi="Arial" w:cs="Arial"/>
-          <w:b/>
-          <w:sz w:val="14"/>
-          <w:szCs w:val="14"/>
-        </w:rPr>
-        <w:t>.</w:t>
-      </w:r>
-      <w:r>
-        <w:rPr>
-          <w:rFonts w:ascii="Arial" w:eastAsia="Batang" w:hAnsi="Arial" w:cs="Arial"/>
-          <w:b/>
-          <w:sz w:val="14"/>
-          <w:szCs w:val="14"/>
-        </w:rPr>
-        <w:t>-</w:t>
+        <w:t xml:space="preserve">OTORGAMIENTO DE CRÉDITO Y CONSTITUCIÓN DE GARANTÍA </w:t>
+      </w:r>
+      <w:r>
+        <w:rPr>
+          <w:rFonts w:ascii="Arial" w:eastAsia="Batang" w:hAnsi="Arial" w:cs="Arial"/>
+          <w:b/>
+          <w:sz w:val="14"/>
+          <w:szCs w:val="14"/>
+          <w:lang w:val="es-ES"/>
+        </w:rPr>
+        <w:t>HIPOTECARIA</w:t>
+      </w:r>
+      <w:r>
+        <w:rPr>
+          <w:rFonts w:ascii="Arial" w:eastAsia="Batang" w:hAnsi="Arial" w:cs="Arial"/>
+          <w:b/>
+          <w:sz w:val="14"/>
+          <w:szCs w:val="14"/>
+        </w:rPr>
+        <w:t>. -</w:t>
       </w:r>
       <w:r>
         <w:rPr>
@@ -1381,6 +1437,651 @@
           <w:szCs w:val="14"/>
         </w:rPr>
         <w:t xml:space="preserve"> número</w:t>
+      </w:r>
+      <w:r>
+        <w:rPr>
+          <w:rFonts w:ascii="Arial" w:eastAsia="Batang" w:hAnsi="Arial" w:cs="Arial"/>
+          <w:sz w:val="14"/>
+          <w:szCs w:val="14"/>
+        </w:rPr>
+        <w:t xml:space="preserve"> </w:t>
+      </w:r>
+      <w:r>
+        <w:rPr>
+          <w:rFonts w:ascii="Arial" w:eastAsia="Batang" w:hAnsi="Arial" w:cs="Arial"/>
+          <w:b/>
+          <w:bCs/>
+          <w:sz w:val="14"/>
+          <w:szCs w:val="14"/>
+          <w:lang w:val="es-MX"/>
+        </w:rPr>
+        <w:t xml:space="preserve">{{ </w:t>
+      </w:r>
+      <w:proofErr w:type="spellStart"/>
+      <w:r>
+        <w:rPr>
+          <w:rFonts w:ascii="Arial" w:eastAsia="Batang" w:hAnsi="Arial" w:cs="Arial"/>
+          <w:b/>
+          <w:bCs/>
+          <w:sz w:val="14"/>
+          <w:szCs w:val="14"/>
+          <w:lang w:val="es-MX"/>
+        </w:rPr>
+        <w:t>numero_carta</w:t>
+      </w:r>
+      <w:proofErr w:type="spellEnd"/>
+      <w:r>
+        <w:rPr>
+          <w:rFonts w:ascii="Arial" w:eastAsia="Batang" w:hAnsi="Arial" w:cs="Arial"/>
+          <w:b/>
+          <w:bCs/>
+          <w:sz w:val="14"/>
+          <w:szCs w:val="14"/>
+          <w:lang w:val="es-MX"/>
+        </w:rPr>
+        <w:t xml:space="preserve"> }}</w:t>
+      </w:r>
+      <w:r>
+        <w:rPr>
+          <w:rFonts w:ascii="Arial" w:eastAsia="Batang" w:hAnsi="Arial" w:cs="Arial"/>
+          <w:sz w:val="14"/>
+          <w:szCs w:val="14"/>
+        </w:rPr>
+        <w:t>,</w:t>
+      </w:r>
+      <w:r>
+        <w:rPr>
+          <w:rFonts w:ascii="Arial" w:eastAsia="Batang" w:hAnsi="Arial" w:cs="Arial"/>
+          <w:sz w:val="14"/>
+          <w:szCs w:val="14"/>
+        </w:rPr>
+        <w:t xml:space="preserve"> </w:t>
+      </w:r>
+      <w:r>
+        <w:rPr>
+          <w:rFonts w:ascii="Arial" w:eastAsia="Batang" w:hAnsi="Arial" w:cs="Arial"/>
+          <w:sz w:val="14"/>
+          <w:szCs w:val="14"/>
+        </w:rPr>
+        <w:t>de fecha</w:t>
+      </w:r>
+      <w:r>
+        <w:rPr>
+          <w:rFonts w:ascii="Arial" w:eastAsia="Batang" w:hAnsi="Arial" w:cs="Arial"/>
+          <w:sz w:val="14"/>
+          <w:szCs w:val="14"/>
+        </w:rPr>
+        <w:t xml:space="preserve"> </w:t>
+      </w:r>
+      <w:r>
+        <w:rPr>
+          <w:rFonts w:ascii="Arial" w:eastAsia="Batang" w:hAnsi="Arial" w:cs="Arial"/>
+          <w:sz w:val="14"/>
+          <w:szCs w:val="14"/>
+          <w:lang w:val="es-MX"/>
+        </w:rPr>
+        <w:t xml:space="preserve">{{ </w:t>
+      </w:r>
+      <w:proofErr w:type="spellStart"/>
+      <w:r>
+        <w:rPr>
+          <w:rFonts w:ascii="Arial" w:eastAsia="Batang" w:hAnsi="Arial" w:cs="Arial"/>
+          <w:sz w:val="14"/>
+          <w:szCs w:val="14"/>
+          <w:lang w:val="es-MX"/>
+        </w:rPr>
+        <w:t>fecha</w:t>
+      </w:r>
+      <w:r>
+        <w:rPr>
+          <w:rFonts w:ascii="Arial" w:eastAsia="Batang" w:hAnsi="Arial" w:cs="Arial"/>
+          <w:sz w:val="14"/>
+          <w:szCs w:val="14"/>
+          <w:lang w:val="es-MX"/>
+        </w:rPr>
+        <w:t>_expedicion</w:t>
+      </w:r>
+      <w:proofErr w:type="spellEnd"/>
+      <w:r>
+        <w:rPr>
+          <w:rFonts w:ascii="Arial" w:eastAsia="Batang" w:hAnsi="Arial" w:cs="Arial"/>
+          <w:sz w:val="14"/>
+          <w:szCs w:val="14"/>
+          <w:lang w:val="es-MX"/>
+        </w:rPr>
+        <w:t xml:space="preserve"> }}</w:t>
+      </w:r>
+      <w:r>
+        <w:rPr>
+          <w:rFonts w:ascii="Arial" w:eastAsia="Batang" w:hAnsi="Arial" w:cs="Arial"/>
+          <w:sz w:val="14"/>
+          <w:szCs w:val="14"/>
+        </w:rPr>
+        <w:t>,</w:t>
+      </w:r>
+      <w:bookmarkStart w:id="4" w:name="_Hlk150194100"/>
+      <w:r>
+        <w:rPr>
+          <w:rFonts w:ascii="Arial" w:eastAsia="Batang" w:hAnsi="Arial" w:cs="Arial"/>
+          <w:sz w:val="14"/>
+          <w:szCs w:val="14"/>
+        </w:rPr>
+        <w:t xml:space="preserve"> </w:t>
+      </w:r>
+      <w:r>
+        <w:rPr>
+          <w:rFonts w:ascii="Arial" w:eastAsia="Batang" w:hAnsi="Arial" w:cs="Arial"/>
+          <w:sz w:val="14"/>
+          <w:szCs w:val="14"/>
+          <w:lang w:val="es-ES"/>
+        </w:rPr>
+        <w:t>otorgado ante</w:t>
+      </w:r>
+      <w:bookmarkEnd w:id="4"/>
+      <w:r>
+        <w:rPr>
+          <w:rFonts w:ascii="Arial" w:eastAsia="Batang" w:hAnsi="Arial" w:cs="Arial"/>
+          <w:sz w:val="14"/>
+          <w:szCs w:val="14"/>
+          <w:lang w:val="es-ES"/>
+        </w:rPr>
+        <w:t xml:space="preserve"> la fe del Licenciado</w:t>
+      </w:r>
+      <w:r>
+        <w:rPr>
+          <w:rFonts w:ascii="Arial" w:eastAsia="Batang" w:hAnsi="Arial" w:cs="Arial"/>
+          <w:sz w:val="14"/>
+          <w:szCs w:val="14"/>
+          <w:lang w:val="es-ES"/>
+        </w:rPr>
+        <w:t xml:space="preserve"> </w:t>
+      </w:r>
+      <w:r>
+        <w:rPr>
+          <w:rFonts w:ascii="Arial" w:eastAsia="Batang" w:hAnsi="Arial" w:cs="Arial"/>
+          <w:bCs/>
+          <w:sz w:val="14"/>
+          <w:szCs w:val="14"/>
+          <w:lang w:val="es-MX"/>
+        </w:rPr>
+        <w:t xml:space="preserve">{{ </w:t>
+      </w:r>
+      <w:proofErr w:type="spellStart"/>
+      <w:r>
+        <w:rPr>
+          <w:rFonts w:ascii="Arial" w:eastAsia="Batang" w:hAnsi="Arial" w:cs="Arial"/>
+          <w:bCs/>
+          <w:sz w:val="14"/>
+          <w:szCs w:val="14"/>
+          <w:lang w:val="es-MX"/>
+        </w:rPr>
+        <w:t>nombre_notario</w:t>
+      </w:r>
+      <w:proofErr w:type="spellEnd"/>
+      <w:r>
+        <w:rPr>
+          <w:rFonts w:ascii="Arial" w:eastAsia="Batang" w:hAnsi="Arial" w:cs="Arial"/>
+          <w:bCs/>
+          <w:sz w:val="14"/>
+          <w:szCs w:val="14"/>
+          <w:lang w:val="es-MX"/>
+        </w:rPr>
+        <w:t xml:space="preserve"> }}</w:t>
+      </w:r>
+      <w:r>
+        <w:rPr>
+          <w:rFonts w:ascii="Arial" w:eastAsia="Batang" w:hAnsi="Arial" w:cs="Arial"/>
+          <w:sz w:val="14"/>
+          <w:szCs w:val="14"/>
+        </w:rPr>
+        <w:t>,</w:t>
+      </w:r>
+      <w:r>
+        <w:rPr>
+          <w:rFonts w:ascii="Arial" w:eastAsia="Batang" w:hAnsi="Arial" w:cs="Arial"/>
+          <w:sz w:val="14"/>
+          <w:szCs w:val="14"/>
+        </w:rPr>
+        <w:t xml:space="preserve"> </w:t>
+      </w:r>
+      <w:r>
+        <w:rPr>
+          <w:rFonts w:ascii="Arial" w:eastAsia="Batang" w:hAnsi="Arial" w:cs="Arial"/>
+          <w:sz w:val="14"/>
+          <w:szCs w:val="14"/>
+        </w:rPr>
+        <w:t xml:space="preserve">se hizo constar </w:t>
+      </w:r>
+      <w:r>
+        <w:rPr>
+          <w:rFonts w:ascii="Arial" w:eastAsia="Batang" w:hAnsi="Arial" w:cs="Arial"/>
+          <w:sz w:val="14"/>
+          <w:szCs w:val="14"/>
+        </w:rPr>
+        <w:t>entre otros actos</w:t>
+      </w:r>
+      <w:r>
+        <w:rPr>
+          <w:rFonts w:ascii="Arial" w:eastAsia="Batang" w:hAnsi="Arial" w:cs="Arial"/>
+          <w:sz w:val="14"/>
+          <w:szCs w:val="14"/>
+        </w:rPr>
+        <w:t>,</w:t>
+      </w:r>
+      <w:r>
+        <w:rPr>
+          <w:rFonts w:ascii="Arial" w:eastAsia="Batang" w:hAnsi="Arial" w:cs="Arial"/>
+          <w:sz w:val="14"/>
+          <w:szCs w:val="14"/>
+        </w:rPr>
+        <w:t xml:space="preserve"> </w:t>
+      </w:r>
+      <w:r>
+        <w:rPr>
+          <w:rFonts w:ascii="Arial" w:eastAsia="Batang" w:hAnsi="Arial" w:cs="Arial"/>
+          <w:bCs/>
+          <w:sz w:val="14"/>
+          <w:szCs w:val="14"/>
+        </w:rPr>
+        <w:t xml:space="preserve">el </w:t>
+      </w:r>
+      <w:r>
+        <w:rPr>
+          <w:rFonts w:ascii="Arial" w:eastAsia="Batang" w:hAnsi="Arial" w:cs="Arial"/>
+          <w:bCs/>
+          <w:sz w:val="14"/>
+          <w:szCs w:val="14"/>
+        </w:rPr>
+        <w:t>otorgamiento de crédito y constitución de garantía hipotecaria</w:t>
+      </w:r>
+      <w:r>
+        <w:rPr>
+          <w:rFonts w:ascii="Arial" w:eastAsia="Batang" w:hAnsi="Arial" w:cs="Arial"/>
+          <w:bCs/>
+          <w:sz w:val="14"/>
+          <w:szCs w:val="14"/>
+        </w:rPr>
+        <w:t>,</w:t>
+      </w:r>
+      <w:r>
+        <w:rPr>
+          <w:rFonts w:ascii="Arial" w:eastAsia="Batang" w:hAnsi="Arial" w:cs="Arial"/>
+          <w:b/>
+          <w:sz w:val="14"/>
+          <w:szCs w:val="14"/>
+        </w:rPr>
+        <w:t xml:space="preserve"> </w:t>
+      </w:r>
+      <w:r>
+        <w:rPr>
+          <w:rFonts w:ascii="Arial" w:eastAsia="Batang" w:hAnsi="Arial" w:cs="Arial"/>
+          <w:sz w:val="14"/>
+          <w:szCs w:val="14"/>
+        </w:rPr>
+        <w:t>por medio del cual</w:t>
+      </w:r>
+      <w:r>
+        <w:rPr>
+          <w:rFonts w:ascii="Arial" w:eastAsia="Batang" w:hAnsi="Arial" w:cs="Arial"/>
+          <w:sz w:val="14"/>
+          <w:szCs w:val="14"/>
+        </w:rPr>
+        <w:t xml:space="preserve"> el</w:t>
+      </w:r>
+      <w:r>
+        <w:rPr>
+          <w:rFonts w:ascii="Arial" w:eastAsia="Batang" w:hAnsi="Arial" w:cs="Arial"/>
+          <w:sz w:val="14"/>
+          <w:szCs w:val="14"/>
+        </w:rPr>
+        <w:t xml:space="preserve"> </w:t>
+      </w:r>
+      <w:r>
+        <w:rPr>
+          <w:rFonts w:ascii="Arial" w:eastAsia="Batang" w:hAnsi="Arial" w:cs="Arial"/>
+          <w:b/>
+          <w:sz w:val="14"/>
+          <w:szCs w:val="14"/>
+        </w:rPr>
+        <w:t xml:space="preserve">INSTITUTO DEL FONDO NACIONAL </w:t>
+      </w:r>
+      <w:r>
+        <w:rPr>
+          <w:rFonts w:ascii="Arial" w:eastAsia="Batang" w:hAnsi="Arial" w:cs="Arial"/>
+          <w:b/>
+          <w:sz w:val="14"/>
+          <w:szCs w:val="14"/>
+        </w:rPr>
+        <w:t xml:space="preserve">DE LA VIVIENDA </w:t>
+      </w:r>
+      <w:r>
+        <w:rPr>
+          <w:rFonts w:ascii="Arial" w:eastAsia="Batang" w:hAnsi="Arial" w:cs="Arial"/>
+          <w:b/>
+          <w:sz w:val="14"/>
+          <w:szCs w:val="14"/>
+        </w:rPr>
+        <w:t>PARA LOS TRABAJADORES</w:t>
+      </w:r>
+      <w:r>
+        <w:rPr>
+          <w:rFonts w:ascii="Arial" w:eastAsia="Batang" w:hAnsi="Arial" w:cs="Arial"/>
+          <w:sz w:val="14"/>
+          <w:szCs w:val="14"/>
+        </w:rPr>
+        <w:t>,</w:t>
+      </w:r>
+      <w:r>
+        <w:rPr>
+          <w:rFonts w:ascii="Arial" w:eastAsia="Batang" w:hAnsi="Arial" w:cs="Arial"/>
+          <w:b/>
+          <w:sz w:val="14"/>
+          <w:szCs w:val="14"/>
+        </w:rPr>
+        <w:t xml:space="preserve"> </w:t>
+      </w:r>
+      <w:r>
+        <w:rPr>
+          <w:rFonts w:ascii="Arial" w:eastAsia="Batang" w:hAnsi="Arial" w:cs="Arial"/>
+          <w:sz w:val="14"/>
+          <w:szCs w:val="14"/>
+        </w:rPr>
+        <w:t>otorg</w:t>
+      </w:r>
+      <w:r>
+        <w:rPr>
+          <w:rFonts w:ascii="Arial" w:eastAsia="Batang" w:hAnsi="Arial" w:cs="Arial"/>
+          <w:sz w:val="14"/>
+          <w:szCs w:val="14"/>
+        </w:rPr>
+        <w:t>ó</w:t>
+      </w:r>
+      <w:r>
+        <w:rPr>
+          <w:rFonts w:ascii="Arial" w:eastAsia="Batang" w:hAnsi="Arial" w:cs="Arial"/>
+          <w:sz w:val="14"/>
+          <w:szCs w:val="14"/>
+        </w:rPr>
+        <w:t xml:space="preserve"> </w:t>
+      </w:r>
+      <w:r>
+        <w:rPr>
+          <w:rFonts w:ascii="Arial" w:eastAsia="Batang" w:hAnsi="Arial" w:cs="Arial"/>
+          <w:sz w:val="14"/>
+          <w:szCs w:val="14"/>
+        </w:rPr>
+        <w:t xml:space="preserve">a la </w:t>
+      </w:r>
+      <w:r>
+        <w:rPr>
+          <w:rFonts w:ascii="Arial" w:eastAsia="Batang" w:hAnsi="Arial" w:cs="Arial"/>
+          <w:sz w:val="14"/>
+          <w:szCs w:val="14"/>
+        </w:rPr>
+        <w:t>señor</w:t>
+      </w:r>
+      <w:r>
+        <w:rPr>
+          <w:rFonts w:ascii="Arial" w:eastAsia="Batang" w:hAnsi="Arial" w:cs="Arial"/>
+          <w:sz w:val="14"/>
+          <w:szCs w:val="14"/>
+        </w:rPr>
+        <w:t>a</w:t>
+      </w:r>
+      <w:r>
+        <w:rPr>
+          <w:rFonts w:ascii="Arial" w:hAnsi="Arial" w:cs="Arial"/>
+          <w:b/>
+          <w:bCs/>
+          <w:sz w:val="14"/>
+          <w:szCs w:val="14"/>
+          <w:lang w:val="es-ES"/>
+        </w:rPr>
+        <w:t xml:space="preserve"> </w:t>
+      </w:r>
+      <w:r>
+        <w:rPr>
+          <w:rFonts w:ascii="Arial" w:hAnsi="Arial" w:cs="Arial"/>
+          <w:b/>
+          <w:sz w:val="14"/>
+          <w:szCs w:val="14"/>
+          <w:lang w:val="es-MX"/>
+        </w:rPr>
+        <w:t xml:space="preserve">{{ </w:t>
+      </w:r>
+      <w:proofErr w:type="spellStart"/>
+      <w:r>
+        <w:rPr>
+          <w:rFonts w:ascii="Arial" w:hAnsi="Arial" w:cs="Arial"/>
+          <w:b/>
+          <w:sz w:val="14"/>
+          <w:szCs w:val="14"/>
+          <w:lang w:val="es-MX"/>
+        </w:rPr>
+        <w:t>nombre_acreditado</w:t>
+      </w:r>
+      <w:proofErr w:type="spellEnd"/>
+      <w:r>
+        <w:rPr>
+          <w:rFonts w:ascii="Arial" w:hAnsi="Arial" w:cs="Arial"/>
+          <w:b/>
+          <w:sz w:val="14"/>
+          <w:szCs w:val="14"/>
+          <w:lang w:val="es-MX"/>
+        </w:rPr>
+        <w:t xml:space="preserve"> }}</w:t>
+      </w:r>
+      <w:r>
+        <w:rPr>
+          <w:rFonts w:ascii="Arial" w:hAnsi="Arial" w:cs="Arial"/>
+          <w:bCs/>
+          <w:sz w:val="14"/>
+          <w:szCs w:val="14"/>
+        </w:rPr>
+        <w:t xml:space="preserve">, </w:t>
+      </w:r>
+      <w:r>
+        <w:rPr>
+          <w:rFonts w:ascii="Arial" w:eastAsia="Batang" w:hAnsi="Arial" w:cs="Arial"/>
+          <w:bCs/>
+          <w:sz w:val="14"/>
+          <w:szCs w:val="14"/>
+        </w:rPr>
+        <w:t xml:space="preserve">un crédito </w:t>
+      </w:r>
+      <w:r>
+        <w:rPr>
+          <w:rFonts w:ascii="Arial" w:eastAsia="Batang" w:hAnsi="Arial" w:cs="Arial"/>
+          <w:sz w:val="14"/>
+          <w:szCs w:val="14"/>
+        </w:rPr>
+        <w:t>hasta</w:t>
+      </w:r>
+      <w:r>
+        <w:rPr>
+          <w:rFonts w:ascii="Arial" w:eastAsia="Batang" w:hAnsi="Arial" w:cs="Arial"/>
+          <w:sz w:val="14"/>
+          <w:szCs w:val="14"/>
+        </w:rPr>
+        <w:t xml:space="preserve"> </w:t>
+      </w:r>
+      <w:r>
+        <w:rPr>
+          <w:rFonts w:ascii="Arial" w:eastAsia="Batang" w:hAnsi="Arial" w:cs="Arial"/>
+          <w:sz w:val="14"/>
+          <w:szCs w:val="14"/>
+        </w:rPr>
+        <w:t>por</w:t>
+      </w:r>
+      <w:r>
+        <w:rPr>
+          <w:rFonts w:ascii="Arial" w:eastAsia="Batang" w:hAnsi="Arial" w:cs="Arial"/>
+          <w:sz w:val="14"/>
+          <w:szCs w:val="14"/>
+        </w:rPr>
+        <w:t xml:space="preserve"> {{ </w:t>
+      </w:r>
+      <w:proofErr w:type="spellStart"/>
+      <w:r>
+        <w:rPr>
+          <w:rFonts w:ascii="Arial" w:eastAsia="Batang" w:hAnsi="Arial" w:cs="Arial"/>
+          <w:sz w:val="14"/>
+          <w:szCs w:val="14"/>
+        </w:rPr>
+        <w:t>crédito_a_salario</w:t>
+      </w:r>
+      <w:proofErr w:type="spellEnd"/>
+      <w:r>
+        <w:rPr>
+          <w:rFonts w:ascii="Arial" w:eastAsia="Batang" w:hAnsi="Arial" w:cs="Arial"/>
+          <w:sz w:val="14"/>
+          <w:szCs w:val="14"/>
+        </w:rPr>
+        <w:t xml:space="preserve"> }}</w:t>
+      </w:r>
+      <w:r>
+        <w:rPr>
+          <w:rFonts w:ascii="Arial" w:eastAsia="Batang" w:hAnsi="Arial" w:cs="Arial"/>
+          <w:sz w:val="14"/>
+          <w:szCs w:val="14"/>
+        </w:rPr>
+        <w:t xml:space="preserve"> </w:t>
+      </w:r>
+      <w:r>
+        <w:rPr>
+          <w:rFonts w:ascii="Arial" w:eastAsia="Batang" w:hAnsi="Arial" w:cs="Arial"/>
+          <w:sz w:val="14"/>
+          <w:szCs w:val="14"/>
+        </w:rPr>
+        <w:t>veces el salario mínimo mensual vigente en ese entonces</w:t>
+      </w:r>
+      <w:r>
+        <w:rPr>
+          <w:rFonts w:ascii="Arial" w:eastAsia="Batang" w:hAnsi="Arial" w:cs="Arial"/>
+          <w:sz w:val="14"/>
+          <w:szCs w:val="14"/>
+        </w:rPr>
+        <w:t xml:space="preserve"> en el Distrito Federal</w:t>
+      </w:r>
+      <w:r>
+        <w:rPr>
+          <w:rFonts w:ascii="Arial" w:eastAsia="Batang" w:hAnsi="Arial" w:cs="Arial"/>
+          <w:b/>
+          <w:bCs/>
+          <w:iCs/>
+          <w:sz w:val="14"/>
+          <w:szCs w:val="14"/>
+          <w:lang w:val="es-MX"/>
+        </w:rPr>
+        <w:t xml:space="preserve">, </w:t>
+      </w:r>
+      <w:r>
+        <w:rPr>
+          <w:rFonts w:ascii="Arial" w:eastAsia="Batang" w:hAnsi="Arial" w:cs="Arial"/>
+          <w:iCs/>
+          <w:sz w:val="14"/>
+          <w:szCs w:val="14"/>
+        </w:rPr>
+        <w:t xml:space="preserve">equivalente a esa fecha a la cantidad de </w:t>
+      </w:r>
+      <w:r>
+        <w:rPr>
+          <w:rFonts w:ascii="Arial" w:eastAsia="Batang" w:hAnsi="Arial" w:cs="Arial"/>
+          <w:b/>
+          <w:bCs/>
+          <w:iCs/>
+          <w:sz w:val="14"/>
+          <w:szCs w:val="14"/>
+        </w:rPr>
+        <w:t xml:space="preserve">{{ </w:t>
+      </w:r>
+      <w:proofErr w:type="spellStart"/>
+      <w:r>
+        <w:rPr>
+          <w:rFonts w:ascii="Arial" w:eastAsia="Batang" w:hAnsi="Arial" w:cs="Arial"/>
+          <w:b/>
+          <w:bCs/>
+          <w:iCs/>
+          <w:sz w:val="14"/>
+          <w:szCs w:val="14"/>
+        </w:rPr>
+        <w:t>monto_credito</w:t>
+      </w:r>
+      <w:proofErr w:type="spellEnd"/>
+      <w:r>
+        <w:rPr>
+          <w:rFonts w:ascii="Arial" w:eastAsia="Batang" w:hAnsi="Arial" w:cs="Arial"/>
+          <w:b/>
+          <w:bCs/>
+          <w:iCs/>
+          <w:sz w:val="14"/>
+          <w:szCs w:val="14"/>
+        </w:rPr>
+        <w:t xml:space="preserve"> }}</w:t>
+      </w:r>
+      <w:r>
+        <w:rPr>
+          <w:rFonts w:ascii="Arial" w:eastAsia="Batang" w:hAnsi="Arial" w:cs="Arial"/>
+          <w:b/>
+          <w:bCs/>
+          <w:iCs/>
+          <w:sz w:val="14"/>
+          <w:szCs w:val="14"/>
+          <w:lang w:val="es-MX"/>
+        </w:rPr>
+        <w:t>,</w:t>
+      </w:r>
+      <w:r>
+        <w:rPr>
+          <w:rFonts w:ascii="Arial" w:eastAsia="Batang" w:hAnsi="Arial" w:cs="Arial"/>
+          <w:b/>
+          <w:bCs/>
+          <w:iCs/>
+          <w:sz w:val="14"/>
+          <w:szCs w:val="14"/>
+          <w:lang w:val="es-MX"/>
+        </w:rPr>
+        <w:t xml:space="preserve"> </w:t>
+      </w:r>
+      <w:r>
+        <w:rPr>
+          <w:rFonts w:ascii="Arial" w:eastAsia="Batang" w:hAnsi="Arial" w:cs="Arial"/>
+          <w:sz w:val="14"/>
+          <w:szCs w:val="14"/>
+        </w:rPr>
+        <w:t xml:space="preserve">con los intereses y demás </w:t>
+      </w:r>
+      <w:r>
+        <w:rPr>
+          <w:rFonts w:ascii="Arial" w:eastAsia="Batang" w:hAnsi="Arial" w:cs="Arial"/>
+          <w:sz w:val="14"/>
+          <w:szCs w:val="14"/>
+        </w:rPr>
+        <w:t xml:space="preserve">accesorios legales </w:t>
+      </w:r>
+      <w:r>
+        <w:rPr>
+          <w:rFonts w:ascii="Arial" w:eastAsia="Batang" w:hAnsi="Arial" w:cs="Arial"/>
+          <w:sz w:val="14"/>
+          <w:szCs w:val="14"/>
+        </w:rPr>
+        <w:t>ahí precisado</w:t>
+      </w:r>
+      <w:r>
+        <w:rPr>
+          <w:rFonts w:ascii="Arial" w:eastAsia="Batang" w:hAnsi="Arial" w:cs="Arial"/>
+          <w:sz w:val="14"/>
+          <w:szCs w:val="14"/>
+        </w:rPr>
+        <w:t>s.</w:t>
+      </w:r>
+      <w:r>
+        <w:rPr>
+          <w:rFonts w:ascii="Arial" w:eastAsia="Batang" w:hAnsi="Arial" w:cs="Arial"/>
+          <w:sz w:val="14"/>
+          <w:szCs w:val="14"/>
+        </w:rPr>
+        <w:tab/>
       </w:r>
     </w:p>
     <w:p>
@@ -1395,22 +2096,97 @@
         <w:jc w:val="both"/>
         <w:rPr>
           <w:rFonts w:ascii="Arial" w:eastAsia="Batang" w:hAnsi="Arial" w:cs="Arial"/>
+          <w:b/>
+          <w:bCs/>
+          <w:sz w:val="14"/>
+          <w:szCs w:val="14"/>
+        </w:rPr>
+      </w:pPr>
+      <w:r>
+        <w:rPr>
+          <w:rFonts w:ascii="Arial" w:hAnsi="Arial" w:cs="Arial"/>
+          <w:sz w:val="14"/>
+          <w:szCs w:val="14"/>
+          <w:lang w:val="es-MX"/>
+        </w:rPr>
+        <w:t xml:space="preserve">-------- </w:t>
+      </w:r>
+      <w:r>
+        <w:rPr>
+          <w:rFonts w:ascii="Arial" w:eastAsia="Batang" w:hAnsi="Arial" w:cs="Arial"/>
+          <w:sz w:val="14"/>
+          <w:szCs w:val="14"/>
+        </w:rPr>
+        <w:t>P</w:t>
+      </w:r>
+      <w:r>
+        <w:rPr>
+          <w:rFonts w:ascii="Arial" w:eastAsia="Batang" w:hAnsi="Arial" w:cs="Arial"/>
+          <w:sz w:val="14"/>
+          <w:szCs w:val="14"/>
+        </w:rPr>
+        <w:t xml:space="preserve">ara garantizar el puntual y preferente pago del adeudo, </w:t>
+      </w:r>
+      <w:r>
+        <w:rPr>
+          <w:rFonts w:ascii="Arial" w:hAnsi="Arial" w:cs="Arial"/>
+          <w:bCs/>
+          <w:sz w:val="14"/>
+          <w:szCs w:val="14"/>
+        </w:rPr>
+        <w:t>“</w:t>
+      </w:r>
+      <w:r>
+        <w:rPr>
+          <w:rFonts w:ascii="Arial" w:hAnsi="Arial" w:cs="Arial"/>
+          <w:b/>
+          <w:sz w:val="14"/>
+          <w:szCs w:val="14"/>
+        </w:rPr>
+        <w:t>LA</w:t>
+      </w:r>
+      <w:r>
+        <w:rPr>
+          <w:rFonts w:ascii="Arial" w:hAnsi="Arial" w:cs="Arial"/>
+          <w:b/>
+          <w:sz w:val="14"/>
+          <w:szCs w:val="14"/>
+        </w:rPr>
+        <w:t xml:space="preserve"> ACREDITAD</w:t>
+      </w:r>
+      <w:r>
+        <w:rPr>
+          <w:rFonts w:ascii="Arial" w:hAnsi="Arial" w:cs="Arial"/>
+          <w:b/>
+          <w:sz w:val="14"/>
+          <w:szCs w:val="14"/>
+        </w:rPr>
+        <w:t>A</w:t>
+      </w:r>
+      <w:r>
+        <w:rPr>
+          <w:rFonts w:ascii="Arial" w:hAnsi="Arial" w:cs="Arial"/>
+          <w:bCs/>
+          <w:sz w:val="14"/>
+          <w:szCs w:val="14"/>
+        </w:rPr>
+        <w:t>”</w:t>
+      </w:r>
+      <w:r>
+        <w:rPr>
+          <w:rFonts w:ascii="Arial" w:hAnsi="Arial" w:cs="Arial"/>
+          <w:b/>
+          <w:bCs/>
           <w:sz w:val="14"/>
           <w:szCs w:val="14"/>
           <w:lang w:val="es-ES"/>
         </w:rPr>
-      </w:pPr>
-      <w:r>
-        <w:rPr>
-          <w:rFonts w:ascii="Arial" w:eastAsia="Batang" w:hAnsi="Arial" w:cs="Arial"/>
-          <w:sz w:val="14"/>
-          <w:szCs w:val="14"/>
-        </w:rPr>
         <w:t>,</w:t>
       </w:r>
       <w:r>
         <w:rPr>
           <w:rFonts w:ascii="Arial" w:eastAsia="Batang" w:hAnsi="Arial" w:cs="Arial"/>
+          <w:b/>
           <w:sz w:val="14"/>
           <w:szCs w:val="14"/>
         </w:rPr>
@@ -1422,25 +2198,82 @@
           <w:sz w:val="14"/>
           <w:szCs w:val="14"/>
         </w:rPr>
-        <w:t>de fecha</w:t>
-      </w:r>
-      <w:r>
-        <w:rPr>
-          <w:rFonts w:ascii="Arial" w:eastAsia="Batang" w:hAnsi="Arial" w:cs="Arial"/>
-          <w:sz w:val="14"/>
-          <w:szCs w:val="14"/>
-        </w:rPr>
-        <w:t xml:space="preserve">                         </w:t>
-      </w:r>
-      <w:r>
-        <w:rPr>
-          <w:rFonts w:ascii="Arial" w:eastAsia="Batang" w:hAnsi="Arial" w:cs="Arial"/>
+        <w:t>constituy</w:t>
+      </w:r>
+      <w:r>
+        <w:rPr>
+          <w:rFonts w:ascii="Arial" w:eastAsia="Batang" w:hAnsi="Arial" w:cs="Arial"/>
+          <w:sz w:val="14"/>
+          <w:szCs w:val="14"/>
+        </w:rPr>
+        <w:t>ó</w:t>
+      </w:r>
+      <w:r>
+        <w:rPr>
+          <w:rFonts w:ascii="Arial" w:eastAsia="Batang" w:hAnsi="Arial" w:cs="Arial"/>
+          <w:sz w:val="14"/>
+          <w:szCs w:val="14"/>
+        </w:rPr>
+        <w:t xml:space="preserve"> </w:t>
+      </w:r>
+      <w:r>
+        <w:rPr>
+          <w:rFonts w:ascii="Arial" w:eastAsia="Batang" w:hAnsi="Arial" w:cs="Arial"/>
+          <w:sz w:val="14"/>
+          <w:szCs w:val="14"/>
+        </w:rPr>
+        <w:t>hipoteca en primer</w:t>
+      </w:r>
+      <w:r>
+        <w:rPr>
+          <w:rFonts w:ascii="Arial" w:eastAsia="Batang" w:hAnsi="Arial" w:cs="Arial"/>
+          <w:sz w:val="14"/>
+          <w:szCs w:val="14"/>
+        </w:rPr>
+        <w:t xml:space="preserve"> lugar y </w:t>
+      </w:r>
+      <w:r>
+        <w:rPr>
+          <w:rFonts w:ascii="Arial" w:eastAsia="Batang" w:hAnsi="Arial" w:cs="Arial"/>
+          <w:sz w:val="14"/>
+          <w:szCs w:val="14"/>
+        </w:rPr>
+        <w:t xml:space="preserve">grado, </w:t>
+      </w:r>
+      <w:r>
+        <w:rPr>
+          <w:rFonts w:ascii="Arial" w:eastAsia="Batang" w:hAnsi="Arial" w:cs="Arial"/>
+          <w:sz w:val="14"/>
+          <w:szCs w:val="14"/>
+        </w:rPr>
+        <w:t>a</w:t>
+      </w:r>
+      <w:r>
+        <w:rPr>
+          <w:rFonts w:ascii="Arial" w:eastAsia="Batang" w:hAnsi="Arial" w:cs="Arial"/>
+          <w:sz w:val="14"/>
+          <w:szCs w:val="14"/>
+        </w:rPr>
+        <w:t xml:space="preserve"> favor del </w:t>
+      </w:r>
+      <w:r>
+        <w:rPr>
+          <w:rFonts w:ascii="Arial" w:eastAsia="Batang" w:hAnsi="Arial" w:cs="Arial"/>
+          <w:b/>
+          <w:sz w:val="14"/>
+          <w:szCs w:val="14"/>
+        </w:rPr>
+        <w:t>INSTITUTO DEL FONDO NACIONAL DE LA VIVIENDA PARA LOS TRABAJADORES</w:t>
+      </w:r>
+      <w:r>
+        <w:rPr>
+          <w:rFonts w:ascii="Arial" w:eastAsia="Batang" w:hAnsi="Arial" w:cs="Arial"/>
+          <w:bCs/>
           <w:sz w:val="14"/>
           <w:szCs w:val="14"/>
         </w:rPr>
         <w:t>,</w:t>
       </w:r>
-      <w:bookmarkStart w:id="4" w:name="_Hlk150194100"/>
       <w:r>
         <w:rPr>
           <w:rFonts w:ascii="Arial" w:eastAsia="Batang" w:hAnsi="Arial" w:cs="Arial"/>
@@ -1454,34 +2287,95 @@
           <w:rFonts w:ascii="Arial" w:eastAsia="Batang" w:hAnsi="Arial" w:cs="Arial"/>
           <w:sz w:val="14"/>
           <w:szCs w:val="14"/>
-          <w:lang w:val="es-ES"/>
-        </w:rPr>
-        <w:t>otorgado ante</w:t>
-      </w:r>
-      <w:bookmarkEnd w:id="4"/>
-      <w:r>
-        <w:rPr>
-          <w:rFonts w:ascii="Arial" w:eastAsia="Batang" w:hAnsi="Arial" w:cs="Arial"/>
-          <w:sz w:val="14"/>
-          <w:szCs w:val="14"/>
-          <w:lang w:val="es-ES"/>
-        </w:rPr>
-        <w:t xml:space="preserve"> la fe del Licenciado</w:t>
-      </w:r>
-      <w:r>
-        <w:rPr>
-          <w:rFonts w:ascii="Arial" w:eastAsia="Batang" w:hAnsi="Arial" w:cs="Arial"/>
-          <w:sz w:val="14"/>
-          <w:szCs w:val="14"/>
-          <w:lang w:val="es-ES"/>
-        </w:rPr>
-        <w:t xml:space="preserve">                                                                          </w:t>
-      </w:r>
-      <w:r>
-        <w:rPr>
-          <w:rFonts w:ascii="Arial" w:eastAsia="Batang" w:hAnsi="Arial" w:cs="Arial"/>
-          <w:sz w:val="14"/>
-          <w:szCs w:val="14"/>
+        </w:rPr>
+        <w:t>sobre</w:t>
+      </w:r>
+      <w:r>
+        <w:rPr>
+          <w:rFonts w:ascii="Arial" w:eastAsia="Batang" w:hAnsi="Arial" w:cs="Arial"/>
+          <w:sz w:val="14"/>
+          <w:szCs w:val="14"/>
+        </w:rPr>
+        <w:t xml:space="preserve"> </w:t>
+      </w:r>
+      <w:proofErr w:type="gramStart"/>
+      <w:r>
+        <w:rPr>
+          <w:rFonts w:ascii="Arial" w:eastAsia="Batang" w:hAnsi="Arial" w:cs="Arial"/>
+          <w:b/>
+          <w:bCs/>
+          <w:sz w:val="14"/>
+          <w:szCs w:val="14"/>
+          <w:lang w:val="es-MX"/>
+        </w:rPr>
+        <w:t xml:space="preserve">{{ </w:t>
+      </w:r>
+      <w:proofErr w:type="spellStart"/>
+      <w:r>
+        <w:rPr>
+          <w:rFonts w:ascii="Arial" w:eastAsia="Batang" w:hAnsi="Arial" w:cs="Arial"/>
+          <w:b/>
+          <w:bCs/>
+          <w:sz w:val="14"/>
+          <w:szCs w:val="14"/>
+          <w:lang w:val="es-MX"/>
+        </w:rPr>
+        <w:t>datos</w:t>
+      </w:r>
+      <w:proofErr w:type="gramEnd"/>
+      <w:r>
+        <w:rPr>
+          <w:rFonts w:ascii="Arial" w:eastAsia="Batang" w:hAnsi="Arial" w:cs="Arial"/>
+          <w:b/>
+          <w:bCs/>
+          <w:sz w:val="14"/>
+          <w:szCs w:val="14"/>
+          <w:lang w:val="es-MX"/>
+        </w:rPr>
+        <w:t>_</w:t>
+      </w:r>
+      <w:proofErr w:type="gramStart"/>
+      <w:r>
+        <w:rPr>
+          <w:rFonts w:ascii="Arial" w:eastAsia="Batang" w:hAnsi="Arial" w:cs="Arial"/>
+          <w:b/>
+          <w:bCs/>
+          <w:sz w:val="14"/>
+          <w:szCs w:val="14"/>
+          <w:lang w:val="es-MX"/>
+        </w:rPr>
+        <w:t>inmueble</w:t>
+      </w:r>
+      <w:proofErr w:type="spellEnd"/>
+      <w:r>
+        <w:rPr>
+          <w:rFonts w:ascii="Arial" w:eastAsia="Batang" w:hAnsi="Arial" w:cs="Arial"/>
+          <w:b/>
+          <w:bCs/>
+          <w:sz w:val="14"/>
+          <w:szCs w:val="14"/>
+          <w:lang w:val="es-MX"/>
+        </w:rPr>
+        <w:t xml:space="preserve"> }</w:t>
+      </w:r>
+      <w:proofErr w:type="gramEnd"/>
+      <w:r>
+        <w:rPr>
+          <w:rFonts w:ascii="Arial" w:eastAsia="Batang" w:hAnsi="Arial" w:cs="Arial"/>
+          <w:b/>
+          <w:bCs/>
+          <w:sz w:val="14"/>
+          <w:szCs w:val="14"/>
+          <w:lang w:val="es-MX"/>
+        </w:rPr>
+        <w:t>}</w:t>
+      </w:r>
+      <w:r>
+        <w:rPr>
+          <w:rFonts w:ascii="Arial" w:eastAsia="Batang" w:hAnsi="Arial" w:cs="Arial"/>
+          <w:sz w:val="14"/>
+          <w:szCs w:val="14"/>
+          <w:lang w:val="es-MX"/>
         </w:rPr>
         <w:t>,</w:t>
       </w:r>
@@ -1490,6 +2384,7 @@
           <w:rFonts w:ascii="Arial" w:eastAsia="Batang" w:hAnsi="Arial" w:cs="Arial"/>
           <w:sz w:val="14"/>
           <w:szCs w:val="14"/>
+          <w:lang w:val="es-MX"/>
         </w:rPr>
         <w:t xml:space="preserve"> </w:t>
       </w:r>
@@ -1499,15 +2394,15 @@
           <w:sz w:val="14"/>
           <w:szCs w:val="14"/>
         </w:rPr>
-        <w:t xml:space="preserve">se hizo constar </w:t>
-      </w:r>
-      <w:r>
-        <w:rPr>
-          <w:rFonts w:ascii="Arial" w:eastAsia="Batang" w:hAnsi="Arial" w:cs="Arial"/>
-          <w:sz w:val="14"/>
-          <w:szCs w:val="14"/>
-        </w:rPr>
-        <w:t>entre otros actos</w:t>
+        <w:t>con la superficie, medidas</w:t>
+      </w:r>
+      <w:r>
+        <w:rPr>
+          <w:rFonts w:ascii="Arial" w:eastAsia="Batang" w:hAnsi="Arial" w:cs="Arial"/>
+          <w:sz w:val="14"/>
+          <w:szCs w:val="14"/>
+        </w:rPr>
+        <w:t>, linderos</w:t>
       </w:r>
       <w:r>
         <w:rPr>
@@ -1528,34 +2423,14 @@
       <w:r>
         <w:rPr>
           <w:rFonts w:ascii="Arial" w:eastAsia="Batang" w:hAnsi="Arial" w:cs="Arial"/>
-          <w:bCs/>
-          <w:sz w:val="14"/>
-          <w:szCs w:val="14"/>
-        </w:rPr>
-        <w:t xml:space="preserve">el </w:t>
-      </w:r>
-      <w:r>
-        <w:rPr>
-          <w:rFonts w:ascii="Arial" w:eastAsia="Batang" w:hAnsi="Arial" w:cs="Arial"/>
-          <w:bCs/>
-          <w:sz w:val="14"/>
-          <w:szCs w:val="14"/>
-        </w:rPr>
-        <w:t>otorgamiento de crédito y constitución de garantía hipotecaria</w:t>
-      </w:r>
-      <w:r>
-        <w:rPr>
-          <w:rFonts w:ascii="Arial" w:eastAsia="Batang" w:hAnsi="Arial" w:cs="Arial"/>
-          <w:bCs/>
-          <w:sz w:val="14"/>
-          <w:szCs w:val="14"/>
-        </w:rPr>
-        <w:t>,</w:t>
-      </w:r>
-      <w:r>
-        <w:rPr>
-          <w:rFonts w:ascii="Arial" w:eastAsia="Batang" w:hAnsi="Arial" w:cs="Arial"/>
-          <w:b/>
+          <w:sz w:val="14"/>
+          <w:szCs w:val="14"/>
+        </w:rPr>
+        <w:t>colindancias</w:t>
+      </w:r>
+      <w:r>
+        <w:rPr>
+          <w:rFonts w:ascii="Arial" w:eastAsia="Batang" w:hAnsi="Arial" w:cs="Arial"/>
           <w:sz w:val="14"/>
           <w:szCs w:val="14"/>
         </w:rPr>
@@ -1567,15 +2442,7 @@
           <w:sz w:val="14"/>
           <w:szCs w:val="14"/>
         </w:rPr>
-        <w:t>por medio del cual</w:t>
-      </w:r>
-      <w:r>
-        <w:rPr>
-          <w:rFonts w:ascii="Arial" w:eastAsia="Batang" w:hAnsi="Arial" w:cs="Arial"/>
-          <w:sz w:val="14"/>
-          <w:szCs w:val="14"/>
-        </w:rPr>
-        <w:t xml:space="preserve"> el</w:t>
+        <w:t>e</w:t>
       </w:r>
       <w:r>
         <w:rPr>
@@ -1588,158 +2455,42 @@
       <w:r>
         <w:rPr>
           <w:rFonts w:ascii="Arial" w:eastAsia="Batang" w:hAnsi="Arial" w:cs="Arial"/>
-          <w:b/>
-          <w:sz w:val="14"/>
-          <w:szCs w:val="14"/>
-        </w:rPr>
-        <w:t xml:space="preserve">INSTITUTO DEL FONDO NACIONAL </w:t>
-      </w:r>
-      <w:r>
-        <w:rPr>
-          <w:rFonts w:ascii="Arial" w:eastAsia="Batang" w:hAnsi="Arial" w:cs="Arial"/>
-          <w:b/>
-          <w:sz w:val="14"/>
-          <w:szCs w:val="14"/>
-        </w:rPr>
-        <w:t xml:space="preserve">DE LA VIVIENDA </w:t>
-      </w:r>
-      <w:r>
-        <w:rPr>
-          <w:rFonts w:ascii="Arial" w:eastAsia="Batang" w:hAnsi="Arial" w:cs="Arial"/>
-          <w:b/>
-          <w:sz w:val="14"/>
-          <w:szCs w:val="14"/>
-        </w:rPr>
-        <w:t>PARA LOS TRABAJADORES</w:t>
-      </w:r>
-      <w:r>
-        <w:rPr>
-          <w:rFonts w:ascii="Arial" w:eastAsia="Batang" w:hAnsi="Arial" w:cs="Arial"/>
-          <w:sz w:val="14"/>
-          <w:szCs w:val="14"/>
-        </w:rPr>
-        <w:t>,</w:t>
-      </w:r>
-      <w:r>
-        <w:rPr>
-          <w:rFonts w:ascii="Arial" w:eastAsia="Batang" w:hAnsi="Arial" w:cs="Arial"/>
-          <w:b/>
-          <w:sz w:val="14"/>
-          <w:szCs w:val="14"/>
-        </w:rPr>
-        <w:t xml:space="preserve"> </w:t>
-      </w:r>
-      <w:r>
-        <w:rPr>
-          <w:rFonts w:ascii="Arial" w:eastAsia="Batang" w:hAnsi="Arial" w:cs="Arial"/>
-          <w:sz w:val="14"/>
-          <w:szCs w:val="14"/>
-        </w:rPr>
-        <w:t>otorg</w:t>
-      </w:r>
-      <w:r>
-        <w:rPr>
-          <w:rFonts w:ascii="Arial" w:eastAsia="Batang" w:hAnsi="Arial" w:cs="Arial"/>
-          <w:sz w:val="14"/>
-          <w:szCs w:val="14"/>
-        </w:rPr>
-        <w:t>ó</w:t>
-      </w:r>
-      <w:r>
-        <w:rPr>
-          <w:rFonts w:ascii="Arial" w:eastAsia="Batang" w:hAnsi="Arial" w:cs="Arial"/>
-          <w:sz w:val="14"/>
-          <w:szCs w:val="14"/>
-        </w:rPr>
-        <w:t xml:space="preserve"> </w:t>
-      </w:r>
-      <w:r>
-        <w:rPr>
-          <w:rFonts w:ascii="Arial" w:eastAsia="Batang" w:hAnsi="Arial" w:cs="Arial"/>
-          <w:sz w:val="14"/>
-          <w:szCs w:val="14"/>
-        </w:rPr>
-        <w:t xml:space="preserve">a la </w:t>
-      </w:r>
-      <w:r>
-        <w:rPr>
-          <w:rFonts w:ascii="Arial" w:eastAsia="Batang" w:hAnsi="Arial" w:cs="Arial"/>
-          <w:sz w:val="14"/>
-          <w:szCs w:val="14"/>
-        </w:rPr>
-        <w:t>señor</w:t>
-      </w:r>
-      <w:r>
-        <w:rPr>
-          <w:rFonts w:ascii="Arial" w:eastAsia="Batang" w:hAnsi="Arial" w:cs="Arial"/>
-          <w:sz w:val="14"/>
-          <w:szCs w:val="14"/>
-        </w:rPr>
-        <w:t>a</w:t>
-      </w:r>
-      <w:r>
-        <w:rPr>
-          <w:rFonts w:ascii="Arial" w:hAnsi="Arial" w:cs="Arial"/>
-          <w:b/>
-          <w:bCs/>
-          <w:sz w:val="14"/>
-          <w:szCs w:val="14"/>
-          <w:lang w:val="es-ES"/>
-        </w:rPr>
-        <w:t xml:space="preserve"> </w:t>
-      </w:r>
-      <w:r>
-        <w:rPr>
-          <w:rFonts w:ascii="Arial" w:hAnsi="Arial" w:cs="Arial"/>
-          <w:b/>
-          <w:bCs/>
-          <w:sz w:val="14"/>
-          <w:szCs w:val="14"/>
-          <w:lang w:val="es-ES"/>
-        </w:rPr>
-        <w:t>***</w:t>
-      </w:r>
-      <w:r>
-        <w:rPr>
-          <w:rFonts w:ascii="Arial" w:hAnsi="Arial" w:cs="Arial"/>
-          <w:bCs/>
-          <w:sz w:val="14"/>
-          <w:szCs w:val="14"/>
-        </w:rPr>
-        <w:t xml:space="preserve">, </w:t>
-      </w:r>
-      <w:r>
-        <w:rPr>
-          <w:rFonts w:ascii="Arial" w:eastAsia="Batang" w:hAnsi="Arial" w:cs="Arial"/>
-          <w:bCs/>
-          <w:sz w:val="14"/>
-          <w:szCs w:val="14"/>
-        </w:rPr>
-        <w:t xml:space="preserve">un crédito </w:t>
-      </w:r>
-      <w:r>
-        <w:rPr>
-          <w:rFonts w:ascii="Arial" w:eastAsia="Batang" w:hAnsi="Arial" w:cs="Arial"/>
-          <w:sz w:val="14"/>
-          <w:szCs w:val="14"/>
-        </w:rPr>
-        <w:t>hasta</w:t>
-      </w:r>
-      <w:r>
-        <w:rPr>
-          <w:rFonts w:ascii="Arial" w:eastAsia="Batang" w:hAnsi="Arial" w:cs="Arial"/>
-          <w:sz w:val="14"/>
-          <w:szCs w:val="14"/>
-        </w:rPr>
-        <w:t xml:space="preserve"> </w:t>
-      </w:r>
-      <w:r>
-        <w:rPr>
-          <w:rFonts w:ascii="Arial" w:eastAsia="Batang" w:hAnsi="Arial" w:cs="Arial"/>
-          <w:sz w:val="14"/>
-          <w:szCs w:val="14"/>
-        </w:rPr>
-        <w:t>por</w:t>
+          <w:sz w:val="14"/>
+          <w:szCs w:val="14"/>
+        </w:rPr>
+        <w:t xml:space="preserve">indiviso, </w:t>
+      </w:r>
+      <w:r>
+        <w:rPr>
+          <w:rFonts w:ascii="Arial" w:eastAsia="Batang" w:hAnsi="Arial" w:cs="Arial"/>
+          <w:sz w:val="14"/>
+          <w:szCs w:val="14"/>
+        </w:rPr>
+        <w:t>que q</w:t>
+      </w:r>
+      <w:r>
+        <w:rPr>
+          <w:rFonts w:ascii="Arial" w:eastAsia="Batang" w:hAnsi="Arial" w:cs="Arial"/>
+          <w:sz w:val="14"/>
+          <w:szCs w:val="14"/>
+        </w:rPr>
+        <w:t>uedaron descritos en el instrumento que se relaciona, mismos datos que se tienen aquí por reproducidos como si a la letra se insertasen</w:t>
+      </w:r>
+      <w:r>
+        <w:rPr>
+          <w:rFonts w:ascii="Arial" w:eastAsia="Batang" w:hAnsi="Arial" w:cs="Arial"/>
+          <w:sz w:val="14"/>
+          <w:szCs w:val="14"/>
+        </w:rPr>
+        <w:t>.</w:t>
+      </w:r>
+      <w:r>
+        <w:rPr>
+          <w:rFonts w:ascii="Arial" w:eastAsia="Batang" w:hAnsi="Arial" w:cs="Arial"/>
+          <w:sz w:val="14"/>
+          <w:szCs w:val="14"/>
+        </w:rPr>
+        <w:tab/>
       </w:r>
     </w:p>
     <w:p>
@@ -1753,64 +2504,211 @@
         <w:spacing w:line="360" w:lineRule="auto"/>
         <w:jc w:val="both"/>
         <w:rPr>
-          <w:rFonts w:ascii="Arial" w:eastAsia="Batang" w:hAnsi="Arial" w:cs="Arial"/>
-          <w:b/>
-          <w:bCs/>
-          <w:iCs/>
+          <w:rFonts w:ascii="Arial" w:hAnsi="Arial" w:cs="Arial"/>
+          <w:sz w:val="14"/>
+          <w:szCs w:val="14"/>
+          <w:lang w:val="es-ES"/>
+        </w:rPr>
+      </w:pPr>
+      <w:r>
+        <w:rPr>
+          <w:rFonts w:ascii="Arial" w:hAnsi="Arial" w:cs="Arial"/>
           <w:sz w:val="14"/>
           <w:szCs w:val="14"/>
           <w:lang w:val="es-MX"/>
         </w:rPr>
-      </w:pPr>
-      <w:r>
-        <w:rPr>
-          <w:rFonts w:ascii="Arial" w:eastAsia="Batang" w:hAnsi="Arial" w:cs="Arial"/>
-          <w:sz w:val="14"/>
-          <w:szCs w:val="14"/>
-        </w:rPr>
-        <w:t>veces el salario mínimo mensual vigente en ese entonces</w:t>
-      </w:r>
-      <w:r>
-        <w:rPr>
-          <w:rFonts w:ascii="Arial" w:eastAsia="Batang" w:hAnsi="Arial" w:cs="Arial"/>
-          <w:sz w:val="14"/>
-          <w:szCs w:val="14"/>
-        </w:rPr>
-        <w:t xml:space="preserve"> en el Distrito Federal</w:t>
-      </w:r>
-      <w:r>
-        <w:rPr>
-          <w:rFonts w:ascii="Arial" w:eastAsia="Batang" w:hAnsi="Arial" w:cs="Arial"/>
-          <w:b/>
-          <w:bCs/>
-          <w:iCs/>
-          <w:sz w:val="14"/>
-          <w:szCs w:val="14"/>
-          <w:lang w:val="es-MX"/>
-        </w:rPr>
-        <w:t xml:space="preserve">, </w:t>
-      </w:r>
-      <w:r>
-        <w:rPr>
-          <w:rFonts w:ascii="Arial" w:eastAsia="Batang" w:hAnsi="Arial" w:cs="Arial"/>
-          <w:iCs/>
-          <w:sz w:val="14"/>
-          <w:szCs w:val="14"/>
-          <w:lang w:val="es-MX"/>
-        </w:rPr>
-        <w:t xml:space="preserve">equivalente a esa fecha a la cantidad de </w:t>
-      </w:r>
-      <w:r>
-        <w:rPr>
-          <w:rFonts w:ascii="Arial" w:eastAsia="Batang" w:hAnsi="Arial" w:cs="Arial"/>
-          <w:b/>
-          <w:bCs/>
-          <w:iCs/>
-          <w:sz w:val="14"/>
-          <w:szCs w:val="14"/>
-          <w:lang w:val="es-MX"/>
-        </w:rPr>
-        <w:t>$</w:t>
+        <w:t xml:space="preserve">-------- </w:t>
+      </w:r>
+      <w:r>
+        <w:rPr>
+          <w:rFonts w:ascii="Arial" w:hAnsi="Arial" w:cs="Arial"/>
+          <w:b/>
+          <w:sz w:val="14"/>
+          <w:szCs w:val="14"/>
+          <w:lang w:val="es-ES"/>
+        </w:rPr>
+        <w:t xml:space="preserve">DATOS DE </w:t>
+      </w:r>
+      <w:r>
+        <w:rPr>
+          <w:rFonts w:ascii="Arial" w:hAnsi="Arial" w:cs="Arial"/>
+          <w:b/>
+          <w:sz w:val="14"/>
+          <w:szCs w:val="14"/>
+          <w:lang w:val="es-ES"/>
+        </w:rPr>
+        <w:t>REGISTR</w:t>
+      </w:r>
+      <w:r>
+        <w:rPr>
+          <w:rFonts w:ascii="Arial" w:hAnsi="Arial" w:cs="Arial"/>
+          <w:b/>
+          <w:sz w:val="14"/>
+          <w:szCs w:val="14"/>
+          <w:lang w:val="es-ES"/>
+        </w:rPr>
+        <w:t>O</w:t>
+      </w:r>
+      <w:r>
+        <w:rPr>
+          <w:rFonts w:ascii="Arial" w:hAnsi="Arial" w:cs="Arial"/>
+          <w:sz w:val="14"/>
+          <w:szCs w:val="14"/>
+          <w:lang w:val="es-ES"/>
+        </w:rPr>
+        <w:t>. -</w:t>
+      </w:r>
+      <w:r>
+        <w:rPr>
+          <w:rFonts w:ascii="Arial" w:hAnsi="Arial" w:cs="Arial"/>
+          <w:sz w:val="14"/>
+          <w:szCs w:val="14"/>
+          <w:lang w:val="es-ES"/>
+        </w:rPr>
+        <w:t xml:space="preserve"> </w:t>
+      </w:r>
+      <w:r>
+        <w:rPr>
+          <w:rFonts w:ascii="Arial" w:hAnsi="Arial" w:cs="Arial"/>
+          <w:sz w:val="14"/>
+          <w:szCs w:val="14"/>
+          <w:lang w:val="es-ES"/>
+        </w:rPr>
+        <w:t>El</w:t>
+      </w:r>
+      <w:r>
+        <w:rPr>
+          <w:rFonts w:ascii="Arial" w:hAnsi="Arial" w:cs="Arial"/>
+          <w:sz w:val="14"/>
+          <w:szCs w:val="14"/>
+          <w:lang w:val="es-ES"/>
+        </w:rPr>
+        <w:t xml:space="preserve"> </w:t>
+      </w:r>
+      <w:r>
+        <w:rPr>
+          <w:rFonts w:ascii="Arial" w:hAnsi="Arial" w:cs="Arial"/>
+          <w:sz w:val="14"/>
+          <w:szCs w:val="14"/>
+          <w:lang w:val="es-ES"/>
+        </w:rPr>
+        <w:t xml:space="preserve">instrumento antes relacionado </w:t>
+      </w:r>
+      <w:r>
+        <w:rPr>
+          <w:rFonts w:ascii="Arial" w:hAnsi="Arial" w:cs="Arial"/>
+          <w:sz w:val="14"/>
+          <w:szCs w:val="14"/>
+          <w:lang w:val="es-ES"/>
+        </w:rPr>
+        <w:t>se encuentra</w:t>
+      </w:r>
+      <w:r>
+        <w:rPr>
+          <w:rFonts w:ascii="Arial" w:hAnsi="Arial" w:cs="Arial"/>
+          <w:sz w:val="14"/>
+          <w:szCs w:val="14"/>
+          <w:lang w:val="es-ES"/>
+        </w:rPr>
+        <w:t xml:space="preserve"> inscrito en el Instituto de la Función Registral del Estado de México, en la Oficina Registral d</w:t>
+      </w:r>
+      <w:r>
+        <w:rPr>
+          <w:rFonts w:ascii="Arial" w:hAnsi="Arial" w:cs="Arial"/>
+          <w:sz w:val="14"/>
+          <w:szCs w:val="14"/>
+          <w:lang w:val="es-ES"/>
+        </w:rPr>
+        <w:t xml:space="preserve">e </w:t>
+      </w:r>
+      <w:proofErr w:type="gramStart"/>
+      <w:r>
+        <w:rPr>
+          <w:rFonts w:ascii="Arial" w:hAnsi="Arial" w:cs="Arial"/>
+          <w:sz w:val="14"/>
+          <w:szCs w:val="14"/>
+          <w:lang w:val="es-ES"/>
+        </w:rPr>
+        <w:t xml:space="preserve">{{ </w:t>
+      </w:r>
+      <w:proofErr w:type="spellStart"/>
+      <w:r>
+        <w:rPr>
+          <w:rFonts w:ascii="Arial" w:hAnsi="Arial" w:cs="Arial"/>
+          <w:sz w:val="14"/>
+          <w:szCs w:val="14"/>
+          <w:lang w:val="es-ES"/>
+        </w:rPr>
+        <w:t>oficina</w:t>
+      </w:r>
+      <w:proofErr w:type="gramEnd"/>
+      <w:r>
+        <w:rPr>
+          <w:rFonts w:ascii="Arial" w:hAnsi="Arial" w:cs="Arial"/>
+          <w:sz w:val="14"/>
+          <w:szCs w:val="14"/>
+          <w:lang w:val="es-ES"/>
+        </w:rPr>
+        <w:t>_</w:t>
+      </w:r>
+      <w:proofErr w:type="gramStart"/>
+      <w:r>
+        <w:rPr>
+          <w:rFonts w:ascii="Arial" w:hAnsi="Arial" w:cs="Arial"/>
+          <w:sz w:val="14"/>
+          <w:szCs w:val="14"/>
+          <w:lang w:val="es-ES"/>
+        </w:rPr>
+        <w:t>registral</w:t>
+      </w:r>
+      <w:proofErr w:type="spellEnd"/>
+      <w:r>
+        <w:rPr>
+          <w:rFonts w:ascii="Arial" w:hAnsi="Arial" w:cs="Arial"/>
+          <w:sz w:val="14"/>
+          <w:szCs w:val="14"/>
+          <w:lang w:val="es-ES"/>
+        </w:rPr>
+        <w:t xml:space="preserve"> }</w:t>
+      </w:r>
+      <w:proofErr w:type="gramEnd"/>
+      <w:r>
+        <w:rPr>
+          <w:rFonts w:ascii="Arial" w:hAnsi="Arial" w:cs="Arial"/>
+          <w:sz w:val="14"/>
+          <w:szCs w:val="14"/>
+          <w:lang w:val="es-ES"/>
+        </w:rPr>
+        <w:t>}</w:t>
+      </w:r>
+      <w:r>
+        <w:rPr>
+          <w:rFonts w:ascii="Arial" w:hAnsi="Arial" w:cs="Arial"/>
+          <w:sz w:val="14"/>
+          <w:szCs w:val="14"/>
+          <w:lang w:val="es-ES"/>
+        </w:rPr>
+        <w:t xml:space="preserve">, en el libro primero, sección primera, volumen número   y bajo la partida número    </w:t>
+      </w:r>
+      <w:proofErr w:type="gramStart"/>
+      <w:r>
+        <w:rPr>
+          <w:rFonts w:ascii="Arial" w:hAnsi="Arial" w:cs="Arial"/>
+          <w:sz w:val="14"/>
+          <w:szCs w:val="14"/>
+          <w:lang w:val="es-ES"/>
+        </w:rPr>
+        <w:t xml:space="preserve">  ,</w:t>
+      </w:r>
+      <w:proofErr w:type="gramEnd"/>
+      <w:r>
+        <w:rPr>
+          <w:rFonts w:ascii="Arial" w:hAnsi="Arial" w:cs="Arial"/>
+          <w:sz w:val="14"/>
+          <w:szCs w:val="14"/>
+          <w:lang w:val="es-ES"/>
+        </w:rPr>
+        <w:t xml:space="preserve"> en el libro segundo, sección primera, volumen número  </w:t>
       </w:r>
     </w:p>
     <w:p>
@@ -1824,114 +2722,20 @@
         <w:spacing w:line="360" w:lineRule="auto"/>
         <w:jc w:val="both"/>
         <w:rPr>
-          <w:rFonts w:ascii="Arial" w:eastAsia="Batang" w:hAnsi="Arial" w:cs="Arial"/>
-          <w:b/>
-          <w:bCs/>
-          <w:iCs/>
-          <w:sz w:val="14"/>
-          <w:szCs w:val="14"/>
-          <w:lang w:val="es-MX"/>
-        </w:rPr>
-      </w:pPr>
-      <w:r>
-        <w:rPr>
-          <w:rFonts w:ascii="Arial" w:eastAsia="Batang" w:hAnsi="Arial" w:cs="Arial"/>
-          <w:b/>
-          <w:bCs/>
-          <w:iCs/>
-          <w:sz w:val="14"/>
-          <w:szCs w:val="14"/>
-          <w:lang w:val="es-MX"/>
-        </w:rPr>
-        <w:t>M.N. (</w:t>
-      </w:r>
-      <w:r>
-        <w:rPr>
-          <w:rFonts w:ascii="Arial" w:eastAsia="Batang" w:hAnsi="Arial" w:cs="Arial"/>
-          <w:b/>
-          <w:bCs/>
-          <w:iCs/>
-          <w:sz w:val="14"/>
-          <w:szCs w:val="14"/>
-          <w:lang w:val="es-MX"/>
-        </w:rPr>
-        <w:t xml:space="preserve">                                                                                   </w:t>
-      </w:r>
-      <w:r>
-        <w:rPr>
-          <w:rFonts w:ascii="Arial" w:eastAsia="Batang" w:hAnsi="Arial" w:cs="Arial"/>
-          <w:b/>
-          <w:bCs/>
-          <w:iCs/>
-          <w:sz w:val="14"/>
-          <w:szCs w:val="14"/>
-          <w:lang w:val="es-MX"/>
-        </w:rPr>
-        <w:t>, MONEDA NACIONAL)</w:t>
-      </w:r>
-      <w:r>
-        <w:rPr>
-          <w:rFonts w:ascii="Arial" w:eastAsia="Batang" w:hAnsi="Arial" w:cs="Arial"/>
-          <w:b/>
-          <w:bCs/>
-          <w:iCs/>
-          <w:sz w:val="14"/>
-          <w:szCs w:val="14"/>
-          <w:lang w:val="es-MX"/>
-        </w:rPr>
-        <w:t>,</w:t>
-      </w:r>
-      <w:r>
-        <w:rPr>
-          <w:rFonts w:ascii="Arial" w:eastAsia="Batang" w:hAnsi="Arial" w:cs="Arial"/>
-          <w:b/>
-          <w:bCs/>
-          <w:iCs/>
-          <w:sz w:val="14"/>
-          <w:szCs w:val="14"/>
-          <w:lang w:val="es-MX"/>
-        </w:rPr>
-        <w:t xml:space="preserve"> </w:t>
-      </w:r>
-      <w:r>
-        <w:rPr>
-          <w:rFonts w:ascii="Arial" w:eastAsia="Batang" w:hAnsi="Arial" w:cs="Arial"/>
-          <w:sz w:val="14"/>
-          <w:szCs w:val="14"/>
-        </w:rPr>
-        <w:t xml:space="preserve">con los intereses y demás </w:t>
-      </w:r>
-      <w:r>
-        <w:rPr>
-          <w:rFonts w:ascii="Arial" w:eastAsia="Batang" w:hAnsi="Arial" w:cs="Arial"/>
-          <w:sz w:val="14"/>
-          <w:szCs w:val="14"/>
-        </w:rPr>
-        <w:t xml:space="preserve">accesorios legales </w:t>
-      </w:r>
-      <w:r>
-        <w:rPr>
-          <w:rFonts w:ascii="Arial" w:eastAsia="Batang" w:hAnsi="Arial" w:cs="Arial"/>
-          <w:sz w:val="14"/>
-          <w:szCs w:val="14"/>
-        </w:rPr>
-        <w:t>ahí precisado</w:t>
-      </w:r>
-      <w:r>
-        <w:rPr>
-          <w:rFonts w:ascii="Arial" w:eastAsia="Batang" w:hAnsi="Arial" w:cs="Arial"/>
-          <w:sz w:val="14"/>
-          <w:szCs w:val="14"/>
-        </w:rPr>
-        <w:t>s.</w:t>
-      </w:r>
-      <w:r>
-        <w:rPr>
-          <w:rFonts w:ascii="Arial" w:eastAsia="Batang" w:hAnsi="Arial" w:cs="Arial"/>
-          <w:sz w:val="14"/>
-          <w:szCs w:val="14"/>
-        </w:rPr>
-        <w:tab/>
+          <w:rFonts w:ascii="Arial" w:hAnsi="Arial" w:cs="Arial"/>
+          <w:sz w:val="14"/>
+          <w:szCs w:val="14"/>
+          <w:lang w:val="es-ES"/>
+        </w:rPr>
+      </w:pPr>
+      <w:r>
+        <w:rPr>
+          <w:rFonts w:ascii="Arial" w:hAnsi="Arial" w:cs="Arial"/>
+          <w:sz w:val="14"/>
+          <w:szCs w:val="14"/>
+          <w:lang w:val="es-ES"/>
+        </w:rPr>
+        <w:t>y bajo la partida número</w:t>
       </w:r>
     </w:p>
     <w:p>
@@ -1945,208 +2749,38 @@
         <w:spacing w:line="360" w:lineRule="auto"/>
         <w:jc w:val="both"/>
         <w:rPr>
-          <w:rFonts w:ascii="Arial" w:eastAsia="Batang" w:hAnsi="Arial" w:cs="Arial"/>
-          <w:b/>
-          <w:bCs/>
-          <w:sz w:val="14"/>
-          <w:szCs w:val="14"/>
-        </w:rPr>
-      </w:pPr>
-      <w:r>
-        <w:rPr>
-          <w:rFonts w:ascii="Arial" w:hAnsi="Arial" w:cs="Arial"/>
-          <w:sz w:val="14"/>
-          <w:szCs w:val="14"/>
-          <w:lang w:val="es-MX"/>
-        </w:rPr>
-        <w:t xml:space="preserve">-------- </w:t>
-      </w:r>
-      <w:r>
-        <w:rPr>
-          <w:rFonts w:ascii="Arial" w:eastAsia="Batang" w:hAnsi="Arial" w:cs="Arial"/>
-          <w:sz w:val="14"/>
-          <w:szCs w:val="14"/>
-        </w:rPr>
-        <w:t>P</w:t>
-      </w:r>
-      <w:r>
-        <w:rPr>
-          <w:rFonts w:ascii="Arial" w:eastAsia="Batang" w:hAnsi="Arial" w:cs="Arial"/>
-          <w:sz w:val="14"/>
-          <w:szCs w:val="14"/>
-        </w:rPr>
-        <w:t xml:space="preserve">ara garantizar el puntual y preferente pago del adeudo, </w:t>
-      </w:r>
-      <w:r>
-        <w:rPr>
-          <w:rFonts w:ascii="Arial" w:hAnsi="Arial" w:cs="Arial"/>
-          <w:bCs/>
-          <w:sz w:val="14"/>
-          <w:szCs w:val="14"/>
-        </w:rPr>
-        <w:t>“</w:t>
-      </w:r>
-      <w:r>
-        <w:rPr>
-          <w:rFonts w:ascii="Arial" w:hAnsi="Arial" w:cs="Arial"/>
-          <w:b/>
-          <w:sz w:val="14"/>
-          <w:szCs w:val="14"/>
-        </w:rPr>
-        <w:t>LA</w:t>
-      </w:r>
-      <w:r>
-        <w:rPr>
-          <w:rFonts w:ascii="Arial" w:hAnsi="Arial" w:cs="Arial"/>
-          <w:b/>
-          <w:sz w:val="14"/>
-          <w:szCs w:val="14"/>
-        </w:rPr>
-        <w:t xml:space="preserve"> ACREDITAD</w:t>
-      </w:r>
-      <w:r>
-        <w:rPr>
-          <w:rFonts w:ascii="Arial" w:hAnsi="Arial" w:cs="Arial"/>
-          <w:b/>
-          <w:sz w:val="14"/>
-          <w:szCs w:val="14"/>
-        </w:rPr>
-        <w:t>A</w:t>
-      </w:r>
-      <w:r>
-        <w:rPr>
-          <w:rFonts w:ascii="Arial" w:hAnsi="Arial" w:cs="Arial"/>
-          <w:bCs/>
-          <w:sz w:val="14"/>
-          <w:szCs w:val="14"/>
-        </w:rPr>
-        <w:t>”</w:t>
-      </w:r>
-      <w:r>
-        <w:rPr>
-          <w:rFonts w:ascii="Arial" w:hAnsi="Arial" w:cs="Arial"/>
-          <w:b/>
-          <w:bCs/>
+          <w:rFonts w:ascii="Arial" w:hAnsi="Arial" w:cs="Arial"/>
           <w:sz w:val="14"/>
           <w:szCs w:val="14"/>
           <w:lang w:val="es-ES"/>
         </w:rPr>
+      </w:pPr>
+      <w:r>
+        <w:rPr>
+          <w:rFonts w:ascii="Arial" w:hAnsi="Arial" w:cs="Arial"/>
+          <w:sz w:val="14"/>
+          <w:szCs w:val="14"/>
+          <w:lang w:val="es-ES"/>
+        </w:rPr>
         <w:t>,</w:t>
       </w:r>
       <w:r>
         <w:rPr>
-          <w:rFonts w:ascii="Arial" w:eastAsia="Batang" w:hAnsi="Arial" w:cs="Arial"/>
-          <w:b/>
-          <w:sz w:val="14"/>
-          <w:szCs w:val="14"/>
+          <w:rFonts w:ascii="Arial" w:hAnsi="Arial" w:cs="Arial"/>
+          <w:sz w:val="14"/>
+          <w:szCs w:val="14"/>
+          <w:lang w:val="es-ES"/>
         </w:rPr>
         <w:t xml:space="preserve"> </w:t>
       </w:r>
       <w:r>
         <w:rPr>
-          <w:rFonts w:ascii="Arial" w:eastAsia="Batang" w:hAnsi="Arial" w:cs="Arial"/>
-          <w:sz w:val="14"/>
-          <w:szCs w:val="14"/>
-        </w:rPr>
-        <w:t>constituy</w:t>
-      </w:r>
-      <w:r>
-        <w:rPr>
-          <w:rFonts w:ascii="Arial" w:eastAsia="Batang" w:hAnsi="Arial" w:cs="Arial"/>
-          <w:sz w:val="14"/>
-          <w:szCs w:val="14"/>
-        </w:rPr>
-        <w:t>ó</w:t>
-      </w:r>
-      <w:r>
-        <w:rPr>
-          <w:rFonts w:ascii="Arial" w:eastAsia="Batang" w:hAnsi="Arial" w:cs="Arial"/>
-          <w:sz w:val="14"/>
-          <w:szCs w:val="14"/>
-        </w:rPr>
-        <w:t xml:space="preserve"> </w:t>
-      </w:r>
-      <w:r>
-        <w:rPr>
-          <w:rFonts w:ascii="Arial" w:eastAsia="Batang" w:hAnsi="Arial" w:cs="Arial"/>
-          <w:sz w:val="14"/>
-          <w:szCs w:val="14"/>
-        </w:rPr>
-        <w:t>hipoteca en primer</w:t>
-      </w:r>
-      <w:r>
-        <w:rPr>
-          <w:rFonts w:ascii="Arial" w:eastAsia="Batang" w:hAnsi="Arial" w:cs="Arial"/>
-          <w:sz w:val="14"/>
-          <w:szCs w:val="14"/>
-        </w:rPr>
-        <w:t xml:space="preserve"> lugar y </w:t>
-      </w:r>
-      <w:r>
-        <w:rPr>
-          <w:rFonts w:ascii="Arial" w:eastAsia="Batang" w:hAnsi="Arial" w:cs="Arial"/>
-          <w:sz w:val="14"/>
-          <w:szCs w:val="14"/>
-        </w:rPr>
-        <w:t xml:space="preserve">grado, </w:t>
-      </w:r>
-      <w:r>
-        <w:rPr>
-          <w:rFonts w:ascii="Arial" w:eastAsia="Batang" w:hAnsi="Arial" w:cs="Arial"/>
-          <w:sz w:val="14"/>
-          <w:szCs w:val="14"/>
-        </w:rPr>
-        <w:t>a</w:t>
-      </w:r>
-      <w:r>
-        <w:rPr>
-          <w:rFonts w:ascii="Arial" w:eastAsia="Batang" w:hAnsi="Arial" w:cs="Arial"/>
-          <w:sz w:val="14"/>
-          <w:szCs w:val="14"/>
-        </w:rPr>
-        <w:t xml:space="preserve"> favor del </w:t>
-      </w:r>
-      <w:r>
-        <w:rPr>
-          <w:rFonts w:ascii="Arial" w:eastAsia="Batang" w:hAnsi="Arial" w:cs="Arial"/>
-          <w:b/>
-          <w:sz w:val="14"/>
-          <w:szCs w:val="14"/>
-        </w:rPr>
-        <w:t>INSTITUTO DEL FONDO NACIONAL DE LA VIVIENDA PARA LOS TRABAJADORES</w:t>
-      </w:r>
-      <w:r>
-        <w:rPr>
-          <w:rFonts w:ascii="Arial" w:eastAsia="Batang" w:hAnsi="Arial" w:cs="Arial"/>
-          <w:bCs/>
-          <w:sz w:val="14"/>
-          <w:szCs w:val="14"/>
-        </w:rPr>
-        <w:t>,</w:t>
-      </w:r>
-      <w:r>
-        <w:rPr>
-          <w:rFonts w:ascii="Arial" w:eastAsia="Batang" w:hAnsi="Arial" w:cs="Arial"/>
-          <w:sz w:val="14"/>
-          <w:szCs w:val="14"/>
-        </w:rPr>
-        <w:t xml:space="preserve"> </w:t>
-      </w:r>
-      <w:r>
-        <w:rPr>
-          <w:rFonts w:ascii="Arial" w:eastAsia="Batang" w:hAnsi="Arial" w:cs="Arial"/>
-          <w:sz w:val="14"/>
-          <w:szCs w:val="14"/>
-        </w:rPr>
-        <w:t>sobre</w:t>
-      </w:r>
-      <w:r>
-        <w:rPr>
-          <w:rFonts w:ascii="Arial" w:eastAsia="Batang" w:hAnsi="Arial" w:cs="Arial"/>
-          <w:sz w:val="14"/>
-          <w:szCs w:val="14"/>
-        </w:rPr>
-        <w:t xml:space="preserve"> </w:t>
+          <w:rFonts w:ascii="Arial" w:hAnsi="Arial" w:cs="Arial"/>
+          <w:sz w:val="14"/>
+          <w:szCs w:val="14"/>
+          <w:lang w:val="es-ES"/>
+        </w:rPr>
+        <w:t>el día</w:t>
       </w:r>
     </w:p>
     <w:p>
@@ -2160,143 +2794,136 @@
         <w:spacing w:line="360" w:lineRule="auto"/>
         <w:jc w:val="both"/>
         <w:rPr>
-          <w:rFonts w:ascii="Arial" w:eastAsia="Batang" w:hAnsi="Arial" w:cs="Arial"/>
-          <w:b/>
-          <w:bCs/>
-          <w:sz w:val="14"/>
-          <w:szCs w:val="14"/>
-        </w:rPr>
-      </w:pPr>
-      <w:r>
-        <w:rPr>
-          <w:rFonts w:ascii="Arial" w:eastAsia="Batang" w:hAnsi="Arial" w:cs="Arial"/>
+          <w:rFonts w:ascii="Arial" w:hAnsi="Arial" w:cs="Arial"/>
+          <w:b/>
+          <w:bCs/>
+          <w:sz w:val="14"/>
+          <w:szCs w:val="14"/>
+          <w:lang w:val="es-ES"/>
+        </w:rPr>
+      </w:pPr>
+      <w:r>
+        <w:rPr>
+          <w:rFonts w:ascii="Arial" w:hAnsi="Arial" w:cs="Arial"/>
+          <w:sz w:val="14"/>
+          <w:szCs w:val="14"/>
+          <w:lang w:val="es-ES"/>
+        </w:rPr>
+        <w:t>,</w:t>
+      </w:r>
+      <w:r>
+        <w:rPr>
+          <w:rFonts w:ascii="Arial" w:hAnsi="Arial" w:cs="Arial"/>
+          <w:sz w:val="14"/>
+          <w:szCs w:val="14"/>
+          <w:lang w:val="es-ES"/>
+        </w:rPr>
+        <w:t xml:space="preserve"> </w:t>
+      </w:r>
+      <w:r>
+        <w:rPr>
+          <w:rFonts w:ascii="Arial" w:hAnsi="Arial" w:cs="Arial"/>
+          <w:sz w:val="14"/>
+          <w:szCs w:val="14"/>
+          <w:lang w:val="es-ES"/>
+        </w:rPr>
+        <w:t xml:space="preserve">actualmente en el Folio Real Electrónico número </w:t>
+      </w:r>
+      <w:r>
+        <w:rPr>
+          <w:rFonts w:ascii="Arial" w:hAnsi="Arial" w:cs="Arial"/>
           <w:b/>
           <w:bCs/>
           <w:sz w:val="14"/>
           <w:szCs w:val="14"/>
           <w:lang w:val="es-MX"/>
         </w:rPr>
-        <w:t>,</w:t>
-      </w:r>
-      <w:r>
-        <w:rPr>
-          <w:rFonts w:ascii="Arial" w:eastAsia="Batang" w:hAnsi="Arial" w:cs="Arial"/>
+        <w:t>“</w:t>
+      </w:r>
+      <w:proofErr w:type="gramStart"/>
+      <w:r>
+        <w:rPr>
+          <w:rFonts w:ascii="Arial" w:hAnsi="Arial" w:cs="Arial"/>
           <w:b/>
           <w:bCs/>
           <w:sz w:val="14"/>
           <w:szCs w:val="14"/>
           <w:lang w:val="es-MX"/>
         </w:rPr>
-        <w:t xml:space="preserve"> </w:t>
-      </w:r>
-      <w:r>
-        <w:rPr>
-          <w:rFonts w:ascii="Arial" w:eastAsia="Batang" w:hAnsi="Arial" w:cs="Arial"/>
-          <w:sz w:val="14"/>
-          <w:szCs w:val="14"/>
-        </w:rPr>
-        <w:t>con la superficie, medidas</w:t>
-      </w:r>
-      <w:r>
-        <w:rPr>
-          <w:rFonts w:ascii="Arial" w:eastAsia="Batang" w:hAnsi="Arial" w:cs="Arial"/>
-          <w:sz w:val="14"/>
-          <w:szCs w:val="14"/>
-        </w:rPr>
-        <w:t>, linderos</w:t>
-      </w:r>
-      <w:r>
-        <w:rPr>
-          <w:rFonts w:ascii="Arial" w:eastAsia="Batang" w:hAnsi="Arial" w:cs="Arial"/>
-          <w:sz w:val="14"/>
-          <w:szCs w:val="14"/>
-        </w:rPr>
-        <w:t>,</w:t>
-      </w:r>
-      <w:r>
-        <w:rPr>
-          <w:rFonts w:ascii="Arial" w:eastAsia="Batang" w:hAnsi="Arial" w:cs="Arial"/>
-          <w:sz w:val="14"/>
-          <w:szCs w:val="14"/>
-        </w:rPr>
-        <w:t xml:space="preserve"> </w:t>
-      </w:r>
-      <w:r>
-        <w:rPr>
-          <w:rFonts w:ascii="Arial" w:eastAsia="Batang" w:hAnsi="Arial" w:cs="Arial"/>
-          <w:sz w:val="14"/>
-          <w:szCs w:val="14"/>
-        </w:rPr>
-        <w:t>colindancias</w:t>
-      </w:r>
-      <w:r>
-        <w:rPr>
-          <w:rFonts w:ascii="Arial" w:eastAsia="Batang" w:hAnsi="Arial" w:cs="Arial"/>
-          <w:sz w:val="14"/>
-          <w:szCs w:val="14"/>
-        </w:rPr>
-        <w:t xml:space="preserve"> </w:t>
-      </w:r>
-      <w:r>
-        <w:rPr>
-          <w:rFonts w:ascii="Arial" w:eastAsia="Batang" w:hAnsi="Arial" w:cs="Arial"/>
-          <w:sz w:val="14"/>
-          <w:szCs w:val="14"/>
-        </w:rPr>
-        <w:t>e</w:t>
-      </w:r>
-      <w:r>
-        <w:rPr>
-          <w:rFonts w:ascii="Arial" w:eastAsia="Batang" w:hAnsi="Arial" w:cs="Arial"/>
-          <w:sz w:val="14"/>
-          <w:szCs w:val="14"/>
-        </w:rPr>
-        <w:t xml:space="preserve"> </w:t>
-      </w:r>
-      <w:r>
-        <w:rPr>
-          <w:rFonts w:ascii="Arial" w:eastAsia="Batang" w:hAnsi="Arial" w:cs="Arial"/>
-          <w:sz w:val="14"/>
-          <w:szCs w:val="14"/>
-        </w:rPr>
-        <w:t xml:space="preserve">indiviso, </w:t>
-      </w:r>
-      <w:r>
-        <w:rPr>
-          <w:rFonts w:ascii="Arial" w:eastAsia="Batang" w:hAnsi="Arial" w:cs="Arial"/>
-          <w:sz w:val="14"/>
-          <w:szCs w:val="14"/>
-        </w:rPr>
-        <w:t>que q</w:t>
-      </w:r>
-      <w:r>
-        <w:rPr>
-          <w:rFonts w:ascii="Arial" w:eastAsia="Batang" w:hAnsi="Arial" w:cs="Arial"/>
-          <w:sz w:val="14"/>
-          <w:szCs w:val="14"/>
-        </w:rPr>
-        <w:t>uedaron descritos en el instrumento que se relaciona, mismos datos que se tienen aquí por reproducidos como si a la letra se insertasen</w:t>
-      </w:r>
-      <w:r>
-        <w:rPr>
-          <w:rFonts w:ascii="Arial" w:eastAsia="Batang" w:hAnsi="Arial" w:cs="Arial"/>
-          <w:sz w:val="14"/>
-          <w:szCs w:val="14"/>
-        </w:rPr>
-        <w:t>.</w:t>
-      </w:r>
-      <w:r>
-        <w:rPr>
-          <w:rFonts w:ascii="Arial" w:eastAsia="Batang" w:hAnsi="Arial" w:cs="Arial"/>
-          <w:sz w:val="14"/>
-          <w:szCs w:val="14"/>
+        <w:t xml:space="preserve">{{ </w:t>
+      </w:r>
+      <w:proofErr w:type="spellStart"/>
+      <w:r>
+        <w:rPr>
+          <w:rFonts w:ascii="Arial" w:hAnsi="Arial" w:cs="Arial"/>
+          <w:b/>
+          <w:bCs/>
+          <w:sz w:val="14"/>
+          <w:szCs w:val="14"/>
+          <w:lang w:val="es-MX"/>
+        </w:rPr>
+        <w:t>folio</w:t>
+      </w:r>
+      <w:proofErr w:type="gramEnd"/>
+      <w:r>
+        <w:rPr>
+          <w:rFonts w:ascii="Arial" w:hAnsi="Arial" w:cs="Arial"/>
+          <w:b/>
+          <w:bCs/>
+          <w:sz w:val="14"/>
+          <w:szCs w:val="14"/>
+          <w:lang w:val="es-MX"/>
+        </w:rPr>
+        <w:t>_</w:t>
+      </w:r>
+      <w:proofErr w:type="gramStart"/>
+      <w:r>
+        <w:rPr>
+          <w:rFonts w:ascii="Arial" w:hAnsi="Arial" w:cs="Arial"/>
+          <w:b/>
+          <w:bCs/>
+          <w:sz w:val="14"/>
+          <w:szCs w:val="14"/>
+          <w:lang w:val="es-MX"/>
+        </w:rPr>
+        <w:t>real</w:t>
+      </w:r>
+      <w:proofErr w:type="spellEnd"/>
+      <w:r>
+        <w:rPr>
+          <w:rFonts w:ascii="Arial" w:hAnsi="Arial" w:cs="Arial"/>
+          <w:b/>
+          <w:bCs/>
+          <w:sz w:val="14"/>
+          <w:szCs w:val="14"/>
+          <w:lang w:val="es-MX"/>
+        </w:rPr>
+        <w:t xml:space="preserve"> }</w:t>
+      </w:r>
+      <w:proofErr w:type="gramEnd"/>
+      <w:r>
+        <w:rPr>
+          <w:rFonts w:ascii="Arial" w:hAnsi="Arial" w:cs="Arial"/>
+          <w:b/>
+          <w:bCs/>
+          <w:sz w:val="14"/>
+          <w:szCs w:val="14"/>
+          <w:lang w:val="es-MX"/>
+        </w:rPr>
+        <w:t>}”</w:t>
+      </w:r>
+      <w:r>
+        <w:rPr>
+          <w:rFonts w:ascii="Arial" w:hAnsi="Arial" w:cs="Arial"/>
+          <w:sz w:val="14"/>
+          <w:szCs w:val="14"/>
+          <w:lang w:val="es-ES"/>
         </w:rPr>
         <w:tab/>
       </w:r>
     </w:p>
     <w:p>
       <w:pPr>
-        <w:pStyle w:val="Sinespaciado"/>
         <w:tabs>
           <w:tab w:val="left" w:leader="hyphen" w:pos="709"/>
           <w:tab w:val="right" w:leader="hyphen" w:pos="9072"/>
@@ -2308,7 +2935,6 @@
           <w:rFonts w:ascii="Arial" w:hAnsi="Arial" w:cs="Arial"/>
           <w:sz w:val="14"/>
           <w:szCs w:val="14"/>
-          <w:lang w:val="es-ES"/>
         </w:rPr>
       </w:pPr>
       <w:r>
@@ -2326,152 +2952,219 @@
           <w:b/>
           <w:sz w:val="14"/>
           <w:szCs w:val="14"/>
-          <w:lang w:val="es-ES"/>
-        </w:rPr>
-        <w:t>DATOS DE REGISTR</w:t>
-      </w:r>
-      <w:r>
-        <w:rPr>
-          <w:rFonts w:ascii="Arial" w:hAnsi="Arial" w:cs="Arial"/>
-          <w:b/>
-          <w:sz w:val="14"/>
-          <w:szCs w:val="14"/>
-          <w:lang w:val="es-ES"/>
-        </w:rPr>
-        <w:t>O</w:t>
-      </w:r>
-      <w:r>
-        <w:rPr>
-          <w:rFonts w:ascii="Arial" w:hAnsi="Arial" w:cs="Arial"/>
-          <w:sz w:val="14"/>
-          <w:szCs w:val="14"/>
-          <w:lang w:val="es-ES"/>
-        </w:rPr>
-        <w:t xml:space="preserve">.- </w:t>
-      </w:r>
-      <w:r>
-        <w:rPr>
-          <w:rFonts w:ascii="Arial" w:hAnsi="Arial" w:cs="Arial"/>
-          <w:sz w:val="14"/>
-          <w:szCs w:val="14"/>
-          <w:lang w:val="es-ES"/>
-        </w:rPr>
-        <w:t>El</w:t>
-      </w:r>
-      <w:r>
-        <w:rPr>
-          <w:rFonts w:ascii="Arial" w:hAnsi="Arial" w:cs="Arial"/>
-          <w:sz w:val="14"/>
-          <w:szCs w:val="14"/>
-          <w:lang w:val="es-ES"/>
+        </w:rPr>
+        <w:t>II.- CARTA DE INSTRUCCIÓN DE CANCELACIÓN DE HIPOTECA.</w:t>
+      </w:r>
+      <w:r>
+        <w:rPr>
+          <w:rFonts w:ascii="Arial" w:hAnsi="Arial" w:cs="Arial"/>
+          <w:b/>
+          <w:sz w:val="14"/>
+          <w:szCs w:val="14"/>
         </w:rPr>
         <w:t xml:space="preserve"> </w:t>
       </w:r>
       <w:r>
         <w:rPr>
           <w:rFonts w:ascii="Arial" w:hAnsi="Arial" w:cs="Arial"/>
-          <w:sz w:val="14"/>
-          <w:szCs w:val="14"/>
-          <w:lang w:val="es-ES"/>
-        </w:rPr>
-        <w:t xml:space="preserve">instrumento antes relacionado </w:t>
-      </w:r>
-      <w:r>
-        <w:rPr>
-          <w:rFonts w:ascii="Arial" w:hAnsi="Arial" w:cs="Arial"/>
-          <w:sz w:val="14"/>
-          <w:szCs w:val="14"/>
-          <w:lang w:val="es-ES"/>
-        </w:rPr>
-        <w:t>se encuentra</w:t>
-      </w:r>
-      <w:r>
-        <w:rPr>
-          <w:rFonts w:ascii="Arial" w:hAnsi="Arial" w:cs="Arial"/>
-          <w:sz w:val="14"/>
-          <w:szCs w:val="14"/>
-          <w:lang w:val="es-ES"/>
-        </w:rPr>
-        <w:t xml:space="preserve"> inscrito en el Instituto de la Función Registral del Estado de México, en la Oficina Registral de</w:t>
-      </w:r>
-      <w:r>
-        <w:rPr>
-          <w:rFonts w:ascii="Arial" w:hAnsi="Arial" w:cs="Arial"/>
-          <w:sz w:val="14"/>
-          <w:szCs w:val="14"/>
-          <w:lang w:val="es-ES"/>
-        </w:rPr>
-        <w:t xml:space="preserve">                         </w:t>
-      </w:r>
-      <w:r>
-        <w:rPr>
-          <w:rFonts w:ascii="Arial" w:hAnsi="Arial" w:cs="Arial"/>
-          <w:sz w:val="14"/>
-          <w:szCs w:val="14"/>
-          <w:lang w:val="es-ES"/>
+          <w:b/>
+          <w:sz w:val="14"/>
+          <w:szCs w:val="14"/>
+        </w:rPr>
+        <w:t xml:space="preserve">- </w:t>
+      </w:r>
+      <w:r>
+        <w:rPr>
+          <w:rFonts w:ascii="Arial" w:hAnsi="Arial" w:cs="Arial"/>
+          <w:sz w:val="14"/>
+          <w:szCs w:val="14"/>
+        </w:rPr>
+        <w:t>Con fech</w:t>
+      </w:r>
+      <w:r>
+        <w:rPr>
+          <w:rFonts w:ascii="Arial" w:hAnsi="Arial" w:cs="Arial"/>
+          <w:sz w:val="14"/>
+          <w:szCs w:val="14"/>
+        </w:rPr>
+        <w:t xml:space="preserve">a </w:t>
+      </w:r>
+      <w:proofErr w:type="gramStart"/>
+      <w:r>
+        <w:rPr>
+          <w:rFonts w:ascii="Arial" w:hAnsi="Arial" w:cs="Arial"/>
+          <w:sz w:val="14"/>
+          <w:szCs w:val="14"/>
+        </w:rPr>
+        <w:t xml:space="preserve">{{ </w:t>
+      </w:r>
+      <w:proofErr w:type="spellStart"/>
+      <w:r>
+        <w:rPr>
+          <w:rFonts w:ascii="Arial" w:hAnsi="Arial" w:cs="Arial"/>
+          <w:sz w:val="14"/>
+          <w:szCs w:val="14"/>
+        </w:rPr>
+        <w:t>fecha</w:t>
+      </w:r>
+      <w:proofErr w:type="gramEnd"/>
+      <w:r>
+        <w:rPr>
+          <w:rFonts w:ascii="Arial" w:hAnsi="Arial" w:cs="Arial"/>
+          <w:sz w:val="14"/>
+          <w:szCs w:val="14"/>
+        </w:rPr>
+        <w:t>_</w:t>
+      </w:r>
+      <w:proofErr w:type="gramStart"/>
+      <w:r>
+        <w:rPr>
+          <w:rFonts w:ascii="Arial" w:hAnsi="Arial" w:cs="Arial"/>
+          <w:sz w:val="14"/>
+          <w:szCs w:val="14"/>
+        </w:rPr>
+        <w:t>expedicion</w:t>
+      </w:r>
+      <w:proofErr w:type="spellEnd"/>
+      <w:r>
+        <w:rPr>
+          <w:rFonts w:ascii="Arial" w:hAnsi="Arial" w:cs="Arial"/>
+          <w:sz w:val="14"/>
+          <w:szCs w:val="14"/>
+        </w:rPr>
+        <w:t xml:space="preserve"> }</w:t>
+      </w:r>
+      <w:proofErr w:type="gramEnd"/>
+      <w:r>
+        <w:rPr>
+          <w:rFonts w:ascii="Arial" w:hAnsi="Arial" w:cs="Arial"/>
+          <w:sz w:val="14"/>
+          <w:szCs w:val="14"/>
+        </w:rPr>
+        <w:t>}</w:t>
+      </w:r>
+      <w:r>
+        <w:rPr>
+          <w:rFonts w:ascii="Arial" w:hAnsi="Arial" w:cs="Arial"/>
+          <w:sz w:val="14"/>
+          <w:szCs w:val="14"/>
+        </w:rPr>
+        <w:t xml:space="preserve">, el </w:t>
+      </w:r>
+      <w:r>
+        <w:rPr>
+          <w:rFonts w:ascii="Arial" w:hAnsi="Arial" w:cs="Arial"/>
+          <w:b/>
+          <w:sz w:val="14"/>
+          <w:szCs w:val="14"/>
+        </w:rPr>
+        <w:t xml:space="preserve">INSTITUTO DEL FONDO NACIONAL DE LA VIVIENDA PARA LOS TRABAJADORES, </w:t>
+      </w:r>
+      <w:r>
+        <w:rPr>
+          <w:rFonts w:ascii="Arial" w:hAnsi="Arial" w:cs="Arial"/>
+          <w:sz w:val="14"/>
+          <w:szCs w:val="14"/>
+        </w:rPr>
+        <w:t>giró carta</w:t>
+      </w:r>
+      <w:r>
+        <w:rPr>
+          <w:rFonts w:ascii="Arial" w:hAnsi="Arial" w:cs="Arial"/>
+          <w:sz w:val="14"/>
+          <w:szCs w:val="14"/>
+        </w:rPr>
+        <w:t xml:space="preserve"> de instrucción de cancelación de hipoteca con</w:t>
+      </w:r>
+      <w:r>
+        <w:rPr>
+          <w:rFonts w:ascii="Arial" w:hAnsi="Arial" w:cs="Arial"/>
+          <w:sz w:val="14"/>
+          <w:szCs w:val="14"/>
+        </w:rPr>
+        <w:t xml:space="preserve"> número</w:t>
+      </w:r>
+      <w:bookmarkStart w:id="5" w:name="_Hlk32404108"/>
+      <w:r>
+        <w:rPr>
+          <w:rFonts w:ascii="Arial" w:hAnsi="Arial" w:cs="Arial"/>
+          <w:sz w:val="14"/>
+          <w:szCs w:val="14"/>
         </w:rPr>
         <w:t xml:space="preserve"> </w:t>
       </w:r>
-      <w:r>
-        <w:rPr>
-          <w:rFonts w:ascii="Arial" w:hAnsi="Arial" w:cs="Arial"/>
-          <w:sz w:val="14"/>
-          <w:szCs w:val="14"/>
-          <w:lang w:val="es-ES"/>
-        </w:rPr>
-        <w:t xml:space="preserve">, en el libro primero, sección primera, volumen número   y bajo la partida número      , en el libro segundo, sección primera, volumen número  </w:t>
-      </w:r>
-    </w:p>
-    <w:p>
-      <w:pPr>
-        <w:pStyle w:val="Sinespaciado"/>
-        <w:tabs>
-          <w:tab w:val="left" w:leader="hyphen" w:pos="709"/>
-          <w:tab w:val="right" w:leader="hyphen" w:pos="9072"/>
-          <w:tab w:val="right" w:leader="hyphen" w:pos="9129"/>
-        </w:tabs>
-        <w:spacing w:line="360" w:lineRule="auto"/>
-        <w:jc w:val="both"/>
-        <w:rPr>
-          <w:rFonts w:ascii="Arial" w:hAnsi="Arial" w:cs="Arial"/>
-          <w:sz w:val="14"/>
-          <w:szCs w:val="14"/>
-          <w:lang w:val="es-ES"/>
-        </w:rPr>
-      </w:pPr>
-      <w:r>
-        <w:rPr>
-          <w:rFonts w:ascii="Arial" w:hAnsi="Arial" w:cs="Arial"/>
-          <w:sz w:val="14"/>
-          <w:szCs w:val="14"/>
-          <w:lang w:val="es-ES"/>
-        </w:rPr>
-        <w:t>y bajo la partida número</w:t>
-      </w:r>
-    </w:p>
-    <w:p>
-      <w:pPr>
-        <w:pStyle w:val="Sinespaciado"/>
-        <w:tabs>
-          <w:tab w:val="left" w:leader="hyphen" w:pos="709"/>
-          <w:tab w:val="right" w:leader="hyphen" w:pos="9072"/>
-          <w:tab w:val="right" w:leader="hyphen" w:pos="9129"/>
-        </w:tabs>
-        <w:spacing w:line="360" w:lineRule="auto"/>
-        <w:jc w:val="both"/>
-        <w:rPr>
-          <w:rFonts w:ascii="Arial" w:hAnsi="Arial" w:cs="Arial"/>
-          <w:sz w:val="14"/>
-          <w:szCs w:val="14"/>
-          <w:lang w:val="es-ES"/>
-        </w:rPr>
-      </w:pPr>
-      <w:r>
-        <w:rPr>
-          <w:rFonts w:ascii="Arial" w:hAnsi="Arial" w:cs="Arial"/>
-          <w:sz w:val="14"/>
-          <w:szCs w:val="14"/>
-          <w:lang w:val="es-ES"/>
+      <w:bookmarkEnd w:id="5"/>
+      <w:proofErr w:type="gramStart"/>
+      <w:r>
+        <w:rPr>
+          <w:rFonts w:ascii="Arial" w:hAnsi="Arial" w:cs="Arial"/>
+          <w:b/>
+          <w:bCs/>
+          <w:sz w:val="14"/>
+          <w:szCs w:val="14"/>
+        </w:rPr>
+        <w:t xml:space="preserve">{{ </w:t>
+      </w:r>
+      <w:proofErr w:type="spellStart"/>
+      <w:r>
+        <w:rPr>
+          <w:rFonts w:ascii="Arial" w:hAnsi="Arial" w:cs="Arial"/>
+          <w:b/>
+          <w:bCs/>
+          <w:sz w:val="14"/>
+          <w:szCs w:val="14"/>
+        </w:rPr>
+        <w:t>numero</w:t>
+      </w:r>
+      <w:proofErr w:type="gramEnd"/>
+      <w:r>
+        <w:rPr>
+          <w:rFonts w:ascii="Arial" w:hAnsi="Arial" w:cs="Arial"/>
+          <w:b/>
+          <w:bCs/>
+          <w:sz w:val="14"/>
+          <w:szCs w:val="14"/>
+        </w:rPr>
+        <w:t>_</w:t>
+      </w:r>
+      <w:proofErr w:type="gramStart"/>
+      <w:r>
+        <w:rPr>
+          <w:rFonts w:ascii="Arial" w:hAnsi="Arial" w:cs="Arial"/>
+          <w:b/>
+          <w:bCs/>
+          <w:sz w:val="14"/>
+          <w:szCs w:val="14"/>
+        </w:rPr>
+        <w:t>carta</w:t>
+      </w:r>
+      <w:proofErr w:type="spellEnd"/>
+      <w:r>
+        <w:rPr>
+          <w:rFonts w:ascii="Arial" w:hAnsi="Arial" w:cs="Arial"/>
+          <w:b/>
+          <w:bCs/>
+          <w:sz w:val="14"/>
+          <w:szCs w:val="14"/>
+        </w:rPr>
+        <w:t xml:space="preserve"> }</w:t>
+      </w:r>
+      <w:proofErr w:type="gramEnd"/>
+      <w:r>
+        <w:rPr>
+          <w:rFonts w:ascii="Arial" w:hAnsi="Arial" w:cs="Arial"/>
+          <w:b/>
+          <w:bCs/>
+          <w:sz w:val="14"/>
+          <w:szCs w:val="14"/>
+        </w:rPr>
+        <w:t>}</w:t>
+      </w:r>
+      <w:r>
+        <w:rPr>
+          <w:rFonts w:ascii="Arial" w:hAnsi="Arial" w:cs="Arial"/>
+          <w:sz w:val="14"/>
+          <w:szCs w:val="14"/>
         </w:rPr>
         <w:t>,</w:t>
       </w:r>
@@ -2480,7 +3173,6 @@
           <w:rFonts w:ascii="Arial" w:hAnsi="Arial" w:cs="Arial"/>
           <w:sz w:val="14"/>
           <w:szCs w:val="14"/>
-          <w:lang w:val="es-ES"/>
         </w:rPr>
         <w:t xml:space="preserve"> </w:t>
       </w:r>
@@ -2489,89 +3181,151 @@
           <w:rFonts w:ascii="Arial" w:hAnsi="Arial" w:cs="Arial"/>
           <w:sz w:val="14"/>
           <w:szCs w:val="14"/>
-          <w:lang w:val="es-ES"/>
-        </w:rPr>
-        <w:t>el día</w:t>
-      </w:r>
-    </w:p>
-    <w:p>
-      <w:pPr>
-        <w:pStyle w:val="Sinespaciado"/>
-        <w:tabs>
-          <w:tab w:val="left" w:leader="hyphen" w:pos="709"/>
-          <w:tab w:val="right" w:leader="hyphen" w:pos="9072"/>
-          <w:tab w:val="right" w:leader="hyphen" w:pos="9129"/>
-        </w:tabs>
-        <w:spacing w:line="360" w:lineRule="auto"/>
-        <w:jc w:val="both"/>
-        <w:rPr>
-          <w:rFonts w:ascii="Arial" w:hAnsi="Arial" w:cs="Arial"/>
-          <w:b/>
-          <w:bCs/>
-          <w:sz w:val="14"/>
-          <w:szCs w:val="14"/>
-          <w:lang w:val="es-ES"/>
-        </w:rPr>
-      </w:pPr>
-      <w:r>
-        <w:rPr>
-          <w:rFonts w:ascii="Arial" w:hAnsi="Arial" w:cs="Arial"/>
-          <w:sz w:val="14"/>
-          <w:szCs w:val="14"/>
-          <w:lang w:val="es-ES"/>
-        </w:rPr>
-        <w:t>,</w:t>
-      </w:r>
-      <w:r>
-        <w:rPr>
-          <w:rFonts w:ascii="Arial" w:hAnsi="Arial" w:cs="Arial"/>
-          <w:sz w:val="14"/>
-          <w:szCs w:val="14"/>
-          <w:lang w:val="es-ES"/>
+        </w:rPr>
+        <w:t xml:space="preserve">al suscrito Notario para la realización del </w:t>
+      </w:r>
+      <w:r>
+        <w:rPr>
+          <w:rFonts w:ascii="Arial" w:hAnsi="Arial" w:cs="Arial"/>
+          <w:sz w:val="14"/>
+          <w:szCs w:val="14"/>
+        </w:rPr>
+        <w:t xml:space="preserve">presente </w:t>
+      </w:r>
+      <w:r>
+        <w:rPr>
+          <w:rFonts w:ascii="Arial" w:hAnsi="Arial" w:cs="Arial"/>
+          <w:sz w:val="14"/>
+          <w:szCs w:val="14"/>
+        </w:rPr>
+        <w:t xml:space="preserve">instrumento </w:t>
+      </w:r>
+      <w:r>
+        <w:rPr>
+          <w:rFonts w:ascii="Arial" w:hAnsi="Arial" w:cs="Arial"/>
+          <w:sz w:val="14"/>
+          <w:szCs w:val="14"/>
+        </w:rPr>
+        <w:t>en donde se men</w:t>
+      </w:r>
+      <w:r>
+        <w:rPr>
+          <w:rFonts w:ascii="Arial" w:hAnsi="Arial" w:cs="Arial"/>
+          <w:sz w:val="14"/>
+          <w:szCs w:val="14"/>
+        </w:rPr>
+        <w:t>ciona que el crédito relacionado</w:t>
+      </w:r>
+      <w:r>
+        <w:rPr>
+          <w:rFonts w:ascii="Arial" w:hAnsi="Arial" w:cs="Arial"/>
+          <w:sz w:val="14"/>
+          <w:szCs w:val="14"/>
         </w:rPr>
         <w:t xml:space="preserve"> </w:t>
       </w:r>
       <w:r>
         <w:rPr>
           <w:rFonts w:ascii="Arial" w:hAnsi="Arial" w:cs="Arial"/>
-          <w:sz w:val="14"/>
-          <w:szCs w:val="14"/>
-          <w:lang w:val="es-ES"/>
-        </w:rPr>
-        <w:t xml:space="preserve">actualmente en el Folio Real Electrónico número </w:t>
-      </w:r>
-      <w:r>
-        <w:rPr>
-          <w:rFonts w:ascii="Arial" w:hAnsi="Arial" w:cs="Arial"/>
-          <w:b/>
-          <w:bCs/>
-          <w:sz w:val="14"/>
-          <w:szCs w:val="14"/>
-          <w:lang w:val="es-ES"/>
-        </w:rPr>
-        <w:t>“000</w:t>
-      </w:r>
-      <w:r>
-        <w:rPr>
-          <w:rFonts w:ascii="Arial" w:hAnsi="Arial" w:cs="Arial"/>
-          <w:b/>
-          <w:bCs/>
-          <w:sz w:val="14"/>
-          <w:szCs w:val="14"/>
-          <w:lang w:val="es-ES"/>
-        </w:rPr>
-        <w:t xml:space="preserve">                     </w:t>
-      </w:r>
-      <w:r>
-        <w:rPr>
-          <w:rFonts w:ascii="Arial" w:hAnsi="Arial" w:cs="Arial"/>
-          <w:b/>
-          <w:bCs/>
-          <w:sz w:val="14"/>
-          <w:szCs w:val="14"/>
-          <w:lang w:val="es-ES"/>
-        </w:rPr>
-        <w:t xml:space="preserve">” (cero </w:t>
+          <w:bCs/>
+          <w:sz w:val="14"/>
+          <w:szCs w:val="14"/>
+        </w:rPr>
+        <w:t>en el antecedente uno romano</w:t>
+      </w:r>
+      <w:r>
+        <w:rPr>
+          <w:rFonts w:ascii="Arial" w:hAnsi="Arial" w:cs="Arial"/>
+          <w:b/>
+          <w:bCs/>
+          <w:sz w:val="14"/>
+          <w:szCs w:val="14"/>
+        </w:rPr>
+        <w:t xml:space="preserve"> </w:t>
+      </w:r>
+      <w:r>
+        <w:rPr>
+          <w:rFonts w:ascii="Arial" w:hAnsi="Arial" w:cs="Arial"/>
+          <w:bCs/>
+          <w:sz w:val="14"/>
+          <w:szCs w:val="14"/>
+        </w:rPr>
+        <w:t>de este instrumento</w:t>
+      </w:r>
+      <w:r>
+        <w:rPr>
+          <w:rFonts w:ascii="Arial" w:hAnsi="Arial" w:cs="Arial"/>
+          <w:sz w:val="14"/>
+          <w:szCs w:val="14"/>
+        </w:rPr>
+        <w:t xml:space="preserve">, </w:t>
+      </w:r>
+      <w:r>
+        <w:rPr>
+          <w:rFonts w:ascii="Arial" w:hAnsi="Arial" w:cs="Arial"/>
+          <w:sz w:val="14"/>
+          <w:szCs w:val="14"/>
+        </w:rPr>
+        <w:t xml:space="preserve">no presenta saldo </w:t>
+      </w:r>
+      <w:r>
+        <w:rPr>
+          <w:rFonts w:ascii="Arial" w:hAnsi="Arial" w:cs="Arial"/>
+          <w:sz w:val="14"/>
+          <w:szCs w:val="14"/>
+        </w:rPr>
+        <w:t>deudor</w:t>
+      </w:r>
+      <w:r>
+        <w:rPr>
+          <w:rFonts w:ascii="Arial" w:hAnsi="Arial" w:cs="Arial"/>
+          <w:sz w:val="14"/>
+          <w:szCs w:val="14"/>
+        </w:rPr>
+        <w:t xml:space="preserve"> ante </w:t>
+      </w:r>
+      <w:r>
+        <w:rPr>
+          <w:rFonts w:ascii="Arial" w:hAnsi="Arial" w:cs="Arial"/>
+          <w:sz w:val="14"/>
+          <w:szCs w:val="14"/>
+        </w:rPr>
+        <w:t>dicho</w:t>
+      </w:r>
+      <w:r>
+        <w:rPr>
+          <w:rFonts w:ascii="Arial" w:hAnsi="Arial" w:cs="Arial"/>
+          <w:sz w:val="14"/>
+          <w:szCs w:val="14"/>
+        </w:rPr>
+        <w:t xml:space="preserve"> instituto </w:t>
+      </w:r>
+      <w:r>
+        <w:rPr>
+          <w:rFonts w:ascii="Arial" w:hAnsi="Arial" w:cs="Arial"/>
+          <w:sz w:val="14"/>
+          <w:szCs w:val="14"/>
+        </w:rPr>
+        <w:t>a partir del día</w:t>
+      </w:r>
+      <w:r>
+        <w:rPr>
+          <w:rFonts w:ascii="Arial" w:hAnsi="Arial" w:cs="Arial"/>
+          <w:sz w:val="14"/>
+          <w:szCs w:val="14"/>
+        </w:rPr>
+        <w:t xml:space="preserve"> </w:t>
+      </w:r>
+      <w:proofErr w:type="gramStart"/>
+      <w:r>
+        <w:rPr>
+          <w:rFonts w:ascii="Arial" w:hAnsi="Arial" w:cs="Arial"/>
+          <w:b/>
+          <w:bCs/>
+          <w:sz w:val="14"/>
+          <w:szCs w:val="14"/>
+        </w:rPr>
+        <w:t xml:space="preserve">{{ </w:t>
       </w:r>
       <w:proofErr w:type="spellStart"/>
       <w:r>
@@ -2581,9 +3335,30 @@
           <w:bCs/>
           <w:sz w:val="14"/>
           <w:szCs w:val="14"/>
-          <w:lang w:val="es-ES"/>
-        </w:rPr>
-        <w:t>cero</w:t>
+        </w:rPr>
+        <w:t>fecha</w:t>
+      </w:r>
+      <w:proofErr w:type="gramEnd"/>
+      <w:r>
+        <w:rPr>
+          <w:rFonts w:ascii="Arial" w:hAnsi="Arial" w:cs="Arial"/>
+          <w:b/>
+          <w:bCs/>
+          <w:sz w:val="14"/>
+          <w:szCs w:val="14"/>
+        </w:rPr>
+        <w:t>_</w:t>
+      </w:r>
+      <w:proofErr w:type="gramStart"/>
+      <w:r>
+        <w:rPr>
+          <w:rFonts w:ascii="Arial" w:hAnsi="Arial" w:cs="Arial"/>
+          <w:b/>
+          <w:bCs/>
+          <w:sz w:val="14"/>
+          <w:szCs w:val="14"/>
+        </w:rPr>
+        <w:t>liquidacion</w:t>
       </w:r>
       <w:proofErr w:type="spellEnd"/>
       <w:r>
@@ -2593,415 +3368,19 @@
           <w:bCs/>
           <w:sz w:val="14"/>
           <w:szCs w:val="14"/>
-          <w:lang w:val="es-ES"/>
-        </w:rPr>
-        <w:t xml:space="preserve"> </w:t>
-      </w:r>
-      <w:proofErr w:type="spellStart"/>
-      <w:r>
-        <w:rPr>
-          <w:rFonts w:ascii="Arial" w:hAnsi="Arial" w:cs="Arial"/>
-          <w:b/>
-          <w:bCs/>
-          <w:sz w:val="14"/>
-          <w:szCs w:val="14"/>
-          <w:lang w:val="es-ES"/>
-        </w:rPr>
-        <w:t>cero</w:t>
-      </w:r>
-      <w:proofErr w:type="spellEnd"/>
-      <w:r>
-        <w:rPr>
-          <w:rFonts w:ascii="Arial" w:hAnsi="Arial" w:cs="Arial"/>
-          <w:b/>
-          <w:bCs/>
-          <w:sz w:val="14"/>
-          <w:szCs w:val="14"/>
-          <w:lang w:val="es-ES"/>
-        </w:rPr>
-        <w:t xml:space="preserve">                     </w:t>
-      </w:r>
-      <w:r>
-        <w:rPr>
-          <w:rFonts w:ascii="Arial" w:hAnsi="Arial" w:cs="Arial"/>
-          <w:b/>
-          <w:bCs/>
-          <w:sz w:val="14"/>
-          <w:szCs w:val="14"/>
-          <w:lang w:val="es-ES"/>
-        </w:rPr>
-        <w:t>)</w:t>
-      </w:r>
-      <w:r>
-        <w:rPr>
-          <w:rFonts w:ascii="Arial" w:hAnsi="Arial" w:cs="Arial"/>
-          <w:sz w:val="14"/>
-          <w:szCs w:val="14"/>
-          <w:lang w:val="es-ES"/>
-        </w:rPr>
-        <w:t>.</w:t>
-      </w:r>
-      <w:r>
-        <w:rPr>
-          <w:rFonts w:ascii="Arial" w:hAnsi="Arial" w:cs="Arial"/>
-          <w:sz w:val="14"/>
-          <w:szCs w:val="14"/>
-          <w:lang w:val="es-ES"/>
-        </w:rPr>
-        <w:tab/>
-      </w:r>
-    </w:p>
-    <w:p>
-      <w:pPr>
-        <w:tabs>
-          <w:tab w:val="left" w:leader="hyphen" w:pos="709"/>
-          <w:tab w:val="right" w:leader="hyphen" w:pos="9072"/>
-          <w:tab w:val="right" w:leader="hyphen" w:pos="9129"/>
-        </w:tabs>
-        <w:spacing w:line="360" w:lineRule="auto"/>
-        <w:jc w:val="both"/>
-        <w:rPr>
-          <w:rFonts w:ascii="Arial" w:hAnsi="Arial" w:cs="Arial"/>
-          <w:sz w:val="14"/>
-          <w:szCs w:val="14"/>
-        </w:rPr>
-      </w:pPr>
-      <w:r>
-        <w:rPr>
-          <w:rFonts w:ascii="Arial" w:hAnsi="Arial" w:cs="Arial"/>
-          <w:sz w:val="14"/>
-          <w:szCs w:val="14"/>
-          <w:lang w:val="es-MX"/>
-        </w:rPr>
-        <w:t xml:space="preserve">-------- </w:t>
-      </w:r>
-      <w:r>
-        <w:rPr>
-          <w:rFonts w:ascii="Arial" w:hAnsi="Arial" w:cs="Arial"/>
-          <w:b/>
-          <w:sz w:val="14"/>
-          <w:szCs w:val="14"/>
-        </w:rPr>
-        <w:t xml:space="preserve">II.- CARTA DE INSTRUCCIÓN DE CANCELACIÓN DE HIPOTECA.- </w:t>
-      </w:r>
-      <w:r>
-        <w:rPr>
-          <w:rFonts w:ascii="Arial" w:hAnsi="Arial" w:cs="Arial"/>
-          <w:sz w:val="14"/>
-          <w:szCs w:val="14"/>
-        </w:rPr>
-        <w:t>Con fecha</w:t>
-      </w:r>
-      <w:r>
-        <w:rPr>
-          <w:rFonts w:ascii="Arial" w:hAnsi="Arial" w:cs="Arial"/>
-          <w:sz w:val="14"/>
-          <w:szCs w:val="14"/>
-        </w:rPr>
-        <w:t xml:space="preserve"> </w:t>
-      </w:r>
-      <w:r>
-        <w:rPr>
-          <w:rFonts w:ascii="Arial" w:hAnsi="Arial" w:cs="Arial"/>
-          <w:sz w:val="14"/>
-          <w:szCs w:val="14"/>
-        </w:rPr>
-        <w:t xml:space="preserve">            </w:t>
-      </w:r>
-      <w:r>
-        <w:rPr>
-          <w:rFonts w:ascii="Arial" w:hAnsi="Arial" w:cs="Arial"/>
-          <w:sz w:val="14"/>
-          <w:szCs w:val="14"/>
-        </w:rPr>
-        <w:t xml:space="preserve"> </w:t>
-      </w:r>
-      <w:r>
-        <w:rPr>
-          <w:rFonts w:ascii="Arial" w:hAnsi="Arial" w:cs="Arial"/>
-          <w:sz w:val="14"/>
-          <w:szCs w:val="14"/>
-        </w:rPr>
-        <w:t xml:space="preserve">  </w:t>
-      </w:r>
-      <w:r>
-        <w:rPr>
-          <w:rFonts w:ascii="Arial" w:hAnsi="Arial" w:cs="Arial"/>
-          <w:sz w:val="14"/>
-          <w:szCs w:val="14"/>
-        </w:rPr>
-        <w:t xml:space="preserve">                </w:t>
-      </w:r>
-      <w:r>
-        <w:rPr>
-          <w:rFonts w:ascii="Arial" w:hAnsi="Arial" w:cs="Arial"/>
-          <w:sz w:val="14"/>
-          <w:szCs w:val="14"/>
-        </w:rPr>
-        <w:t xml:space="preserve">           </w:t>
-      </w:r>
-      <w:r>
-        <w:rPr>
-          <w:rFonts w:ascii="Arial" w:hAnsi="Arial" w:cs="Arial"/>
-          <w:sz w:val="14"/>
-          <w:szCs w:val="14"/>
-        </w:rPr>
-        <w:t xml:space="preserve">, el </w:t>
-      </w:r>
-      <w:r>
-        <w:rPr>
-          <w:rFonts w:ascii="Arial" w:hAnsi="Arial" w:cs="Arial"/>
-          <w:b/>
-          <w:sz w:val="14"/>
-          <w:szCs w:val="14"/>
-        </w:rPr>
-        <w:t xml:space="preserve">INSTITUTO DEL FONDO NACIONAL DE LA VIVIENDA PARA LOS TRABAJADORES, </w:t>
-      </w:r>
-      <w:r>
-        <w:rPr>
-          <w:rFonts w:ascii="Arial" w:hAnsi="Arial" w:cs="Arial"/>
-          <w:sz w:val="14"/>
-          <w:szCs w:val="14"/>
-        </w:rPr>
-        <w:t>giró carta</w:t>
-      </w:r>
-      <w:r>
-        <w:rPr>
-          <w:rFonts w:ascii="Arial" w:hAnsi="Arial" w:cs="Arial"/>
-          <w:sz w:val="14"/>
-          <w:szCs w:val="14"/>
-        </w:rPr>
-        <w:t xml:space="preserve"> de instrucción de cancelación de hipoteca con</w:t>
-      </w:r>
-      <w:r>
-        <w:rPr>
-          <w:rFonts w:ascii="Arial" w:hAnsi="Arial" w:cs="Arial"/>
-          <w:sz w:val="14"/>
-          <w:szCs w:val="14"/>
-        </w:rPr>
-        <w:t xml:space="preserve"> número</w:t>
-      </w:r>
-      <w:bookmarkStart w:id="5" w:name="_Hlk32404108"/>
-      <w:r>
-        <w:rPr>
-          <w:rFonts w:ascii="Arial" w:hAnsi="Arial" w:cs="Arial"/>
-          <w:sz w:val="14"/>
-          <w:szCs w:val="14"/>
-        </w:rPr>
-        <w:t xml:space="preserve"> </w:t>
-      </w:r>
-      <w:r>
-        <w:rPr>
-          <w:rFonts w:ascii="Arial" w:hAnsi="Arial" w:cs="Arial"/>
-          <w:sz w:val="14"/>
-          <w:szCs w:val="14"/>
-        </w:rPr>
-        <w:t>“</w:t>
-      </w:r>
-      <w:r>
-        <w:rPr>
-          <w:rFonts w:ascii="Arial" w:hAnsi="Arial" w:cs="Arial"/>
-          <w:sz w:val="14"/>
-          <w:szCs w:val="14"/>
-        </w:rPr>
-        <w:t xml:space="preserve">  </w:t>
-      </w:r>
-      <w:r>
-        <w:rPr>
-          <w:rFonts w:ascii="Arial" w:hAnsi="Arial" w:cs="Arial"/>
-          <w:sz w:val="14"/>
-          <w:szCs w:val="14"/>
-        </w:rPr>
-        <w:t xml:space="preserve"> ”</w:t>
-      </w:r>
-      <w:r>
-        <w:rPr>
-          <w:rFonts w:ascii="Arial" w:hAnsi="Arial" w:cs="Arial"/>
-          <w:sz w:val="14"/>
-          <w:szCs w:val="14"/>
-        </w:rPr>
-        <w:t xml:space="preserve"> </w:t>
-      </w:r>
-      <w:r>
-        <w:rPr>
-          <w:rFonts w:ascii="Arial" w:hAnsi="Arial" w:cs="Arial"/>
-          <w:sz w:val="14"/>
-          <w:szCs w:val="14"/>
-        </w:rPr>
-        <w:t>(</w:t>
-      </w:r>
-      <w:bookmarkEnd w:id="5"/>
-      <w:r>
-        <w:rPr>
-          <w:rFonts w:ascii="Arial" w:hAnsi="Arial" w:cs="Arial"/>
-          <w:sz w:val="14"/>
-          <w:szCs w:val="14"/>
-        </w:rPr>
-        <w:t xml:space="preserve">       </w:t>
-      </w:r>
-      <w:r>
-        <w:rPr>
-          <w:rFonts w:ascii="Arial" w:hAnsi="Arial" w:cs="Arial"/>
-          <w:sz w:val="14"/>
-          <w:szCs w:val="14"/>
-        </w:rPr>
-        <w:t>)</w:t>
-      </w:r>
-      <w:r>
-        <w:rPr>
-          <w:rFonts w:ascii="Arial" w:hAnsi="Arial" w:cs="Arial"/>
-          <w:sz w:val="14"/>
-          <w:szCs w:val="14"/>
-        </w:rPr>
-        <w:t>,</w:t>
-      </w:r>
-      <w:r>
-        <w:rPr>
-          <w:rFonts w:ascii="Arial" w:hAnsi="Arial" w:cs="Arial"/>
-          <w:sz w:val="14"/>
-          <w:szCs w:val="14"/>
-        </w:rPr>
-        <w:t xml:space="preserve"> </w:t>
-      </w:r>
-      <w:r>
-        <w:rPr>
-          <w:rFonts w:ascii="Arial" w:hAnsi="Arial" w:cs="Arial"/>
-          <w:sz w:val="14"/>
-          <w:szCs w:val="14"/>
-        </w:rPr>
-        <w:t xml:space="preserve">al suscrito Notario para la realización del </w:t>
-      </w:r>
-      <w:r>
-        <w:rPr>
-          <w:rFonts w:ascii="Arial" w:hAnsi="Arial" w:cs="Arial"/>
-          <w:sz w:val="14"/>
-          <w:szCs w:val="14"/>
-        </w:rPr>
-        <w:t xml:space="preserve">presente </w:t>
-      </w:r>
-      <w:r>
-        <w:rPr>
-          <w:rFonts w:ascii="Arial" w:hAnsi="Arial" w:cs="Arial"/>
-          <w:sz w:val="14"/>
-          <w:szCs w:val="14"/>
-        </w:rPr>
-        <w:t xml:space="preserve">instrumento </w:t>
-      </w:r>
-      <w:r>
-        <w:rPr>
-          <w:rFonts w:ascii="Arial" w:hAnsi="Arial" w:cs="Arial"/>
-          <w:sz w:val="14"/>
-          <w:szCs w:val="14"/>
-        </w:rPr>
-        <w:t>en donde se men</w:t>
-      </w:r>
-      <w:r>
-        <w:rPr>
-          <w:rFonts w:ascii="Arial" w:hAnsi="Arial" w:cs="Arial"/>
-          <w:sz w:val="14"/>
-          <w:szCs w:val="14"/>
-        </w:rPr>
-        <w:t>ciona que el crédito relacionado</w:t>
-      </w:r>
-      <w:r>
-        <w:rPr>
-          <w:rFonts w:ascii="Arial" w:hAnsi="Arial" w:cs="Arial"/>
-          <w:sz w:val="14"/>
-          <w:szCs w:val="14"/>
-        </w:rPr>
-        <w:t xml:space="preserve"> </w:t>
-      </w:r>
-      <w:r>
-        <w:rPr>
-          <w:rFonts w:ascii="Arial" w:hAnsi="Arial" w:cs="Arial"/>
-          <w:bCs/>
-          <w:sz w:val="14"/>
-          <w:szCs w:val="14"/>
-        </w:rPr>
-        <w:t>en el antecedente uno romano</w:t>
-      </w:r>
-      <w:r>
-        <w:rPr>
-          <w:rFonts w:ascii="Arial" w:hAnsi="Arial" w:cs="Arial"/>
-          <w:b/>
-          <w:bCs/>
-          <w:sz w:val="14"/>
-          <w:szCs w:val="14"/>
-        </w:rPr>
-        <w:t xml:space="preserve"> </w:t>
-      </w:r>
-      <w:r>
-        <w:rPr>
-          <w:rFonts w:ascii="Arial" w:hAnsi="Arial" w:cs="Arial"/>
-          <w:bCs/>
-          <w:sz w:val="14"/>
-          <w:szCs w:val="14"/>
-        </w:rPr>
-        <w:t>de este instrumento</w:t>
-      </w:r>
-      <w:r>
-        <w:rPr>
-          <w:rFonts w:ascii="Arial" w:hAnsi="Arial" w:cs="Arial"/>
-          <w:sz w:val="14"/>
-          <w:szCs w:val="14"/>
-        </w:rPr>
-        <w:t xml:space="preserve">, </w:t>
-      </w:r>
-      <w:r>
-        <w:rPr>
-          <w:rFonts w:ascii="Arial" w:hAnsi="Arial" w:cs="Arial"/>
-          <w:sz w:val="14"/>
-          <w:szCs w:val="14"/>
-        </w:rPr>
-        <w:t xml:space="preserve">no presenta saldo </w:t>
-      </w:r>
-      <w:r>
-        <w:rPr>
-          <w:rFonts w:ascii="Arial" w:hAnsi="Arial" w:cs="Arial"/>
-          <w:sz w:val="14"/>
-          <w:szCs w:val="14"/>
-        </w:rPr>
-        <w:t>deudor</w:t>
-      </w:r>
-      <w:r>
-        <w:rPr>
-          <w:rFonts w:ascii="Arial" w:hAnsi="Arial" w:cs="Arial"/>
-          <w:sz w:val="14"/>
-          <w:szCs w:val="14"/>
-        </w:rPr>
-        <w:t xml:space="preserve"> ante </w:t>
-      </w:r>
-      <w:r>
-        <w:rPr>
-          <w:rFonts w:ascii="Arial" w:hAnsi="Arial" w:cs="Arial"/>
-          <w:sz w:val="14"/>
-          <w:szCs w:val="14"/>
-        </w:rPr>
-        <w:t>dicho</w:t>
-      </w:r>
-      <w:r>
-        <w:rPr>
-          <w:rFonts w:ascii="Arial" w:hAnsi="Arial" w:cs="Arial"/>
-          <w:sz w:val="14"/>
-          <w:szCs w:val="14"/>
-        </w:rPr>
-        <w:t xml:space="preserve"> instituto </w:t>
-      </w:r>
-      <w:r>
-        <w:rPr>
-          <w:rFonts w:ascii="Arial" w:hAnsi="Arial" w:cs="Arial"/>
-          <w:sz w:val="14"/>
-          <w:szCs w:val="14"/>
-        </w:rPr>
-        <w:t>a partir del día</w:t>
-      </w:r>
-      <w:r>
-        <w:rPr>
-          <w:rFonts w:ascii="Arial" w:hAnsi="Arial" w:cs="Arial"/>
-          <w:sz w:val="14"/>
-          <w:szCs w:val="14"/>
-        </w:rPr>
-        <w:t xml:space="preserve"> </w:t>
+        </w:rPr>
+        <w:t xml:space="preserve"> }</w:t>
+      </w:r>
+      <w:proofErr w:type="gramEnd"/>
+      <w:r>
+        <w:rPr>
+          <w:rFonts w:ascii="Arial" w:hAnsi="Arial" w:cs="Arial"/>
+          <w:b/>
+          <w:bCs/>
+          <w:sz w:val="14"/>
+          <w:szCs w:val="14"/>
+        </w:rPr>
+        <w:t>}</w:t>
       </w:r>
     </w:p>
     <w:p>
@@ -3604,98 +3983,70 @@
       <w:r>
         <w:rPr>
           <w:rFonts w:ascii="Arial" w:hAnsi="Arial" w:cs="Arial"/>
-          <w:bCs/>
-          <w:sz w:val="14"/>
-          <w:szCs w:val="14"/>
-        </w:rPr>
-        <w:t>“</w:t>
-      </w:r>
-      <w:r>
-        <w:rPr>
-          <w:rFonts w:ascii="Arial" w:hAnsi="Arial" w:cs="Arial"/>
-          <w:bCs/>
-          <w:sz w:val="14"/>
-          <w:szCs w:val="14"/>
+          <w:b/>
+          <w:sz w:val="14"/>
+          <w:szCs w:val="14"/>
+          <w:lang w:val="es-MX"/>
+        </w:rPr>
+        <w:t>{{</w:t>
+      </w:r>
+      <w:r>
+        <w:rPr>
+          <w:rFonts w:ascii="Arial" w:hAnsi="Arial" w:cs="Arial"/>
+          <w:b/>
+          <w:sz w:val="14"/>
+          <w:szCs w:val="14"/>
+          <w:lang w:val="es-MX"/>
         </w:rPr>
         <w:t xml:space="preserve"> </w:t>
       </w:r>
-      <w:r>
-        <w:rPr>
-          <w:rFonts w:ascii="Arial" w:hAnsi="Arial" w:cs="Arial"/>
-          <w:bCs/>
+      <w:proofErr w:type="spellStart"/>
+      <w:r>
+        <w:rPr>
+          <w:rFonts w:ascii="Arial" w:hAnsi="Arial" w:cs="Arial"/>
+          <w:b/>
+          <w:sz w:val="14"/>
+          <w:szCs w:val="14"/>
+          <w:lang w:val="es-MX"/>
+        </w:rPr>
+        <w:t>numero_credito</w:t>
+      </w:r>
+      <w:proofErr w:type="spellEnd"/>
+      <w:r>
+        <w:rPr>
+          <w:rFonts w:ascii="Arial" w:hAnsi="Arial" w:cs="Arial"/>
+          <w:b/>
+          <w:sz w:val="14"/>
+          <w:szCs w:val="14"/>
+          <w:lang w:val="es-MX"/>
+        </w:rPr>
+        <w:t xml:space="preserve"> }}</w:t>
+      </w:r>
+      <w:r>
+        <w:rPr>
+          <w:rFonts w:ascii="Arial" w:hAnsi="Arial" w:cs="Arial"/>
+          <w:sz w:val="14"/>
+          <w:szCs w:val="14"/>
+        </w:rPr>
+        <w:t xml:space="preserve">, </w:t>
+      </w:r>
+      <w:r>
+        <w:rPr>
+          <w:rFonts w:ascii="Arial" w:hAnsi="Arial" w:cs="Arial"/>
+          <w:b/>
+          <w:bCs/>
+          <w:sz w:val="14"/>
+          <w:szCs w:val="14"/>
+        </w:rPr>
+        <w:t>CANCELA Y DEJA SIN EFECTOS LA HIPOTECA</w:t>
+      </w:r>
+      <w:r>
+        <w:rPr>
+          <w:rFonts w:ascii="Arial" w:hAnsi="Arial" w:cs="Arial"/>
           <w:sz w:val="14"/>
           <w:szCs w:val="14"/>
         </w:rPr>
         <w:t xml:space="preserve"> </w:t>
-      </w:r>
-      <w:r>
-        <w:rPr>
-          <w:rFonts w:ascii="Arial" w:hAnsi="Arial" w:cs="Arial"/>
-          <w:bCs/>
-          <w:sz w:val="14"/>
-          <w:szCs w:val="14"/>
-        </w:rPr>
-        <w:t xml:space="preserve"> </w:t>
-      </w:r>
-      <w:r>
-        <w:rPr>
-          <w:rFonts w:ascii="Arial" w:hAnsi="Arial" w:cs="Arial"/>
-          <w:bCs/>
-          <w:sz w:val="14"/>
-          <w:szCs w:val="14"/>
-        </w:rPr>
-        <w:t>”</w:t>
-      </w:r>
-      <w:r>
-        <w:rPr>
-          <w:rFonts w:ascii="Arial" w:hAnsi="Arial" w:cs="Arial"/>
-          <w:bCs/>
-          <w:sz w:val="14"/>
-          <w:szCs w:val="14"/>
-        </w:rPr>
-        <w:t xml:space="preserve"> </w:t>
-      </w:r>
-      <w:r>
-        <w:rPr>
-          <w:rFonts w:ascii="Arial" w:hAnsi="Arial" w:cs="Arial"/>
-          <w:sz w:val="14"/>
-          <w:szCs w:val="14"/>
-        </w:rPr>
-        <w:t>(</w:t>
-      </w:r>
-      <w:r>
-        <w:rPr>
-          <w:rFonts w:ascii="Arial" w:hAnsi="Arial" w:cs="Arial"/>
-          <w:sz w:val="14"/>
-          <w:szCs w:val="14"/>
-        </w:rPr>
-        <w:t xml:space="preserve">         </w:t>
-      </w:r>
-      <w:r>
-        <w:rPr>
-          <w:rFonts w:ascii="Arial" w:hAnsi="Arial" w:cs="Arial"/>
-          <w:sz w:val="14"/>
-          <w:szCs w:val="14"/>
-        </w:rPr>
-        <w:t>)</w:t>
-      </w:r>
-      <w:r>
-        <w:rPr>
-          <w:rFonts w:ascii="Arial" w:hAnsi="Arial" w:cs="Arial"/>
-          <w:sz w:val="14"/>
-          <w:szCs w:val="14"/>
-        </w:rPr>
-        <w:t xml:space="preserve">, </w:t>
-      </w:r>
-      <w:r>
-        <w:rPr>
-          <w:rFonts w:ascii="Arial" w:hAnsi="Arial" w:cs="Arial"/>
-          <w:b/>
-          <w:bCs/>
-          <w:sz w:val="14"/>
-          <w:szCs w:val="14"/>
-        </w:rPr>
-        <w:t xml:space="preserve">CANCELA Y DEJA SIN EFECTOS LA HIPOTECA </w:t>
       </w:r>
       <w:r>
         <w:rPr>
@@ -3910,16 +4261,25 @@
           <w:sz w:val="14"/>
           <w:szCs w:val="14"/>
         </w:rPr>
-        <w:t xml:space="preserve">.- En </w:t>
-      </w:r>
-      <w:r>
-        <w:rPr>
-          <w:rFonts w:ascii="Arial" w:hAnsi="Arial" w:cs="Arial"/>
-          <w:bCs/>
-          <w:sz w:val="14"/>
-          <w:szCs w:val="14"/>
-        </w:rPr>
-        <w:t>consecuencia</w:t>
+        <w:t>. -</w:t>
+      </w:r>
+      <w:r>
+        <w:rPr>
+          <w:rFonts w:ascii="Arial" w:hAnsi="Arial" w:cs="Arial"/>
+          <w:bCs/>
+          <w:sz w:val="14"/>
+          <w:szCs w:val="14"/>
+        </w:rPr>
+        <w:t xml:space="preserve"> En </w:t>
+      </w:r>
+      <w:r>
+        <w:rPr>
+          <w:rFonts w:ascii="Arial" w:hAnsi="Arial" w:cs="Arial"/>
+          <w:bCs/>
+          <w:sz w:val="14"/>
+          <w:szCs w:val="14"/>
+        </w:rPr>
+        <w:t>consecuencia,</w:t>
       </w:r>
       <w:r>
         <w:rPr>
@@ -4010,7 +4370,7 @@
           <w:sz w:val="14"/>
           <w:szCs w:val="14"/>
         </w:rPr>
-        <w:t>que</w:t>
+        <w:t>que,</w:t>
       </w:r>
       <w:r>
         <w:rPr>
@@ -4128,7 +4488,17 @@
           <w:sz w:val="14"/>
           <w:szCs w:val="14"/>
         </w:rPr>
-        <w:t xml:space="preserve">TERCERA.- </w:t>
+        <w:t>TERCERA. -</w:t>
+      </w:r>
+      <w:r>
+        <w:rPr>
+          <w:rFonts w:ascii="Arial" w:hAnsi="Arial" w:cs="Arial"/>
+          <w:b/>
+          <w:bCs/>
+          <w:sz w:val="14"/>
+          <w:szCs w:val="14"/>
+        </w:rPr>
+        <w:t xml:space="preserve"> </w:t>
       </w:r>
       <w:r>
         <w:rPr>
@@ -4376,7 +4746,17 @@
           <w:sz w:val="14"/>
           <w:szCs w:val="14"/>
         </w:rPr>
-        <w:t xml:space="preserve">CUARTA.- </w:t>
+        <w:t>CUARTA. -</w:t>
+      </w:r>
+      <w:r>
+        <w:rPr>
+          <w:rFonts w:ascii="Arial" w:hAnsi="Arial" w:cs="Arial"/>
+          <w:b/>
+          <w:bCs/>
+          <w:sz w:val="14"/>
+          <w:szCs w:val="14"/>
+        </w:rPr>
+        <w:t xml:space="preserve"> </w:t>
       </w:r>
       <w:r>
         <w:rPr>
@@ -4867,7 +5247,6 @@
           <w:szCs w:val="14"/>
           <w:lang w:val="es-MX"/>
         </w:rPr>
-        <w:lastRenderedPageBreak/>
         <w:t xml:space="preserve">-------- </w:t>
       </w:r>
       <w:r>
@@ -4910,6 +5289,7 @@
           <w:szCs w:val="14"/>
           <w:lang w:val="es-MX"/>
         </w:rPr>
+        <w:lastRenderedPageBreak/>
         <w:t xml:space="preserve">-------- </w:t>
       </w:r>
       <w:r>
@@ -5238,6 +5618,7 @@
         </w:rPr>
         <w:t xml:space="preserve">-------- </w:t>
       </w:r>
+      <w:proofErr w:type="gramStart"/>
       <w:r>
         <w:rPr>
           <w:rFonts w:ascii="Arial" w:eastAsia="MS Mincho" w:hAnsi="Arial" w:cs="Arial"/>
@@ -5245,7 +5626,17 @@
           <w:szCs w:val="14"/>
           <w:lang w:val="es-MX"/>
         </w:rPr>
-        <w:t xml:space="preserve">VI.- Que leí este instrumento a la compareciente, a quien le expliqué su valor, fuerza y las consecuencias legales de su contenido, manifestando su conformidad con el mismo, por lo que lo otorga, ratifica y </w:t>
+        <w:t>VI.-</w:t>
+      </w:r>
+      <w:proofErr w:type="gramEnd"/>
+      <w:r>
+        <w:rPr>
+          <w:rFonts w:ascii="Arial" w:eastAsia="MS Mincho" w:hAnsi="Arial" w:cs="Arial"/>
+          <w:sz w:val="14"/>
+          <w:szCs w:val="14"/>
+          <w:lang w:val="es-MX"/>
+        </w:rPr>
+        <w:t xml:space="preserve"> Que leí este instrumento a la compareciente, a quien le expliqué su valor, fuerza y las consecuencias legales de su contenido, manifestando su conformidad con el mismo, por lo que lo otorga, ratifica y </w:t>
       </w:r>
       <w:r>
         <w:rPr>
@@ -6005,15 +6396,47 @@
           <w:sz w:val="14"/>
           <w:szCs w:val="14"/>
         </w:rPr>
-        <w:t>BENITA HERNÁNDEZ CERÓN</w:t>
-      </w:r>
-      <w:r>
-        <w:rPr>
-          <w:rFonts w:ascii="Arial" w:hAnsi="Arial" w:cs="Arial"/>
-          <w:sz w:val="14"/>
-          <w:szCs w:val="14"/>
-        </w:rPr>
-        <w:t xml:space="preserve">.- FIRMA.- </w:t>
+        <w:t xml:space="preserve">BENITA HERNÁNDEZ </w:t>
+      </w:r>
+      <w:r>
+        <w:rPr>
+          <w:rFonts w:ascii="Arial" w:hAnsi="Arial" w:cs="Arial"/>
+          <w:sz w:val="14"/>
+          <w:szCs w:val="14"/>
+        </w:rPr>
+        <w:t>CERÓN</w:t>
+      </w:r>
+      <w:r>
+        <w:rPr>
+          <w:rFonts w:ascii="Arial" w:hAnsi="Arial" w:cs="Arial"/>
+          <w:sz w:val="14"/>
+          <w:szCs w:val="14"/>
+        </w:rPr>
+        <w:t>. -</w:t>
+      </w:r>
+      <w:r>
+        <w:rPr>
+          <w:rFonts w:ascii="Arial" w:hAnsi="Arial" w:cs="Arial"/>
+          <w:sz w:val="14"/>
+          <w:szCs w:val="14"/>
+        </w:rPr>
+        <w:t xml:space="preserve"> </w:t>
+      </w:r>
+      <w:r>
+        <w:rPr>
+          <w:rFonts w:ascii="Arial" w:hAnsi="Arial" w:cs="Arial"/>
+          <w:sz w:val="14"/>
+          <w:szCs w:val="14"/>
+        </w:rPr>
+        <w:t>FIRMA. -</w:t>
+      </w:r>
+      <w:r>
+        <w:rPr>
+          <w:rFonts w:ascii="Arial" w:hAnsi="Arial" w:cs="Arial"/>
+          <w:sz w:val="14"/>
+          <w:szCs w:val="14"/>
+        </w:rPr>
+        <w:t xml:space="preserve"> </w:t>
       </w:r>
       <w:r>
         <w:rPr>
@@ -6030,7 +6453,43 @@
           <w:szCs w:val="14"/>
           <w:lang w:val="es-ES" w:eastAsia="es-MX"/>
         </w:rPr>
-        <w:t>JUAN CARLOS ORTEGA REYES.- FIRMA.- EL SELLO DE AUTORIZAR.</w:t>
+        <w:t xml:space="preserve">JUAN CARLOS ORTEGA </w:t>
+      </w:r>
+      <w:r>
+        <w:rPr>
+          <w:rFonts w:ascii="Arial" w:hAnsi="Arial" w:cs="Arial"/>
+          <w:sz w:val="14"/>
+          <w:szCs w:val="14"/>
+          <w:lang w:val="es-ES" w:eastAsia="es-MX"/>
+        </w:rPr>
+        <w:t>REYES. -</w:t>
+      </w:r>
+      <w:r>
+        <w:rPr>
+          <w:rFonts w:ascii="Arial" w:hAnsi="Arial" w:cs="Arial"/>
+          <w:sz w:val="14"/>
+          <w:szCs w:val="14"/>
+          <w:lang w:val="es-ES" w:eastAsia="es-MX"/>
+        </w:rPr>
+        <w:t xml:space="preserve"> </w:t>
+      </w:r>
+      <w:r>
+        <w:rPr>
+          <w:rFonts w:ascii="Arial" w:hAnsi="Arial" w:cs="Arial"/>
+          <w:sz w:val="14"/>
+          <w:szCs w:val="14"/>
+          <w:lang w:val="es-ES" w:eastAsia="es-MX"/>
+        </w:rPr>
+        <w:t>FIRMA. -</w:t>
+      </w:r>
+      <w:r>
+        <w:rPr>
+          <w:rFonts w:ascii="Arial" w:hAnsi="Arial" w:cs="Arial"/>
+          <w:sz w:val="14"/>
+          <w:szCs w:val="14"/>
+          <w:lang w:val="es-ES" w:eastAsia="es-MX"/>
+        </w:rPr>
+        <w:t xml:space="preserve"> EL SELLO DE AUTORIZAR.</w:t>
       </w:r>
       <w:r>
         <w:rPr>
@@ -6147,31 +6606,81 @@
       <w:r>
         <w:rPr>
           <w:rFonts w:ascii="Arial" w:hAnsi="Arial" w:cs="Arial"/>
-          <w:b/>
-          <w:bCs/>
           <w:sz w:val="14"/>
           <w:szCs w:val="14"/>
           <w:lang w:val="es-ES"/>
         </w:rPr>
         <w:t xml:space="preserve"> </w:t>
       </w:r>
-      <w:r>
-        <w:rPr>
-          <w:rFonts w:ascii="Arial" w:hAnsi="Arial" w:cs="Arial"/>
-          <w:b/>
-          <w:bCs/>
+      <w:proofErr w:type="gramStart"/>
+      <w:r>
+        <w:rPr>
+          <w:rFonts w:ascii="Arial" w:hAnsi="Arial" w:cs="Arial"/>
+          <w:b/>
           <w:sz w:val="14"/>
           <w:szCs w:val="14"/>
           <w:u w:val="single"/>
-          <w:lang w:val="es-ES"/>
-        </w:rPr>
-        <w:t>***</w:t>
-      </w:r>
-      <w:r>
-        <w:rPr>
-          <w:rFonts w:ascii="Arial" w:hAnsi="Arial" w:cs="Arial"/>
-          <w:b/>
-          <w:bCs/>
+        </w:rPr>
+        <w:t xml:space="preserve">{{ </w:t>
+      </w:r>
+      <w:proofErr w:type="spellStart"/>
+      <w:r>
+        <w:rPr>
+          <w:rFonts w:ascii="Arial" w:hAnsi="Arial" w:cs="Arial"/>
+          <w:b/>
+          <w:sz w:val="14"/>
+          <w:szCs w:val="14"/>
+          <w:u w:val="single"/>
+        </w:rPr>
+        <w:t>nombre</w:t>
+      </w:r>
+      <w:proofErr w:type="gramEnd"/>
+      <w:r>
+        <w:rPr>
+          <w:rFonts w:ascii="Arial" w:hAnsi="Arial" w:cs="Arial"/>
+          <w:b/>
+          <w:sz w:val="14"/>
+          <w:szCs w:val="14"/>
+          <w:u w:val="single"/>
+        </w:rPr>
+        <w:t>_</w:t>
+      </w:r>
+      <w:proofErr w:type="gramStart"/>
+      <w:r>
+        <w:rPr>
+          <w:rFonts w:ascii="Arial" w:hAnsi="Arial" w:cs="Arial"/>
+          <w:b/>
+          <w:sz w:val="14"/>
+          <w:szCs w:val="14"/>
+          <w:u w:val="single"/>
+        </w:rPr>
+        <w:t>acreditado</w:t>
+      </w:r>
+      <w:proofErr w:type="spellEnd"/>
+      <w:r>
+        <w:rPr>
+          <w:rFonts w:ascii="Arial" w:hAnsi="Arial" w:cs="Arial"/>
+          <w:b/>
+          <w:sz w:val="14"/>
+          <w:szCs w:val="14"/>
+          <w:u w:val="single"/>
+        </w:rPr>
+        <w:t xml:space="preserve"> }</w:t>
+      </w:r>
+      <w:proofErr w:type="gramEnd"/>
+      <w:r>
+        <w:rPr>
+          <w:rFonts w:ascii="Arial" w:hAnsi="Arial" w:cs="Arial"/>
+          <w:b/>
+          <w:sz w:val="14"/>
+          <w:szCs w:val="14"/>
+          <w:u w:val="single"/>
+        </w:rPr>
+        <w:t>}</w:t>
+      </w:r>
+      <w:r>
+        <w:rPr>
+          <w:rFonts w:ascii="Arial" w:hAnsi="Arial" w:cs="Arial"/>
           <w:sz w:val="14"/>
           <w:szCs w:val="14"/>
           <w:lang w:val="es-ES"/>
@@ -6220,7 +6729,7 @@
           <w:szCs w:val="14"/>
           <w:lang w:val="es-ES"/>
         </w:rPr>
-        <w:t>DEL AÑO DOS MIL VEINTI</w:t>
+        <w:t xml:space="preserve">DEL AÑO DOS MIL </w:t>
       </w:r>
       <w:r>
         <w:rPr>
@@ -6229,6 +6738,15 @@
           <w:szCs w:val="14"/>
           <w:lang w:val="es-ES"/>
         </w:rPr>
+        <w:t>VEINTI</w:t>
+      </w:r>
+      <w:r>
+        <w:rPr>
+          <w:rFonts w:ascii="Arial" w:hAnsi="Arial" w:cs="Arial"/>
+          <w:sz w:val="14"/>
+          <w:szCs w:val="14"/>
+          <w:lang w:val="es-ES"/>
+        </w:rPr>
         <w:t>SÉIS</w:t>
       </w:r>
       <w:r>
@@ -6238,7 +6756,16 @@
           <w:szCs w:val="14"/>
           <w:lang w:val="es-ES"/>
         </w:rPr>
-        <w:t>.- DOY FE.</w:t>
+        <w:t>. -</w:t>
+      </w:r>
+      <w:r>
+        <w:rPr>
+          <w:rFonts w:ascii="Arial" w:hAnsi="Arial" w:cs="Arial"/>
+          <w:sz w:val="14"/>
+          <w:szCs w:val="14"/>
+          <w:lang w:val="es-ES"/>
+        </w:rPr>
+        <w:t xml:space="preserve"> DOY FE.</w:t>
       </w:r>
       <w:r>
         <w:rPr>
@@ -8101,55 +8628,55 @@
       </w:pPr>
     </w:lvl>
   </w:abstractNum>
-  <w:num w:numId="1" w16cid:durableId="1103450860">
+  <w:num w:numId="1" w16cid:durableId="498736633">
     <w:abstractNumId w:val="2"/>
   </w:num>
-  <w:num w:numId="2" w16cid:durableId="1655261855">
+  <w:num w:numId="2" w16cid:durableId="592474948">
     <w:abstractNumId w:val="3"/>
   </w:num>
-  <w:num w:numId="3" w16cid:durableId="1847281256">
+  <w:num w:numId="3" w16cid:durableId="1431392417">
     <w:abstractNumId w:val="16"/>
   </w:num>
-  <w:num w:numId="4" w16cid:durableId="1485582992">
+  <w:num w:numId="4" w16cid:durableId="1792554306">
     <w:abstractNumId w:val="1"/>
   </w:num>
-  <w:num w:numId="5" w16cid:durableId="2067484547">
+  <w:num w:numId="5" w16cid:durableId="1726487164">
     <w:abstractNumId w:val="11"/>
   </w:num>
-  <w:num w:numId="6" w16cid:durableId="634602375">
+  <w:num w:numId="6" w16cid:durableId="893783316">
     <w:abstractNumId w:val="7"/>
   </w:num>
-  <w:num w:numId="7" w16cid:durableId="1538353056">
+  <w:num w:numId="7" w16cid:durableId="1964342527">
     <w:abstractNumId w:val="9"/>
   </w:num>
-  <w:num w:numId="8" w16cid:durableId="954017918">
+  <w:num w:numId="8" w16cid:durableId="512300424">
     <w:abstractNumId w:val="12"/>
   </w:num>
-  <w:num w:numId="9" w16cid:durableId="355734138">
+  <w:num w:numId="9" w16cid:durableId="1004480784">
     <w:abstractNumId w:val="0"/>
   </w:num>
-  <w:num w:numId="10" w16cid:durableId="1992902170">
+  <w:num w:numId="10" w16cid:durableId="75523389">
     <w:abstractNumId w:val="6"/>
   </w:num>
-  <w:num w:numId="11" w16cid:durableId="281111798">
+  <w:num w:numId="11" w16cid:durableId="842621978">
     <w:abstractNumId w:val="5"/>
   </w:num>
-  <w:num w:numId="12" w16cid:durableId="1621498965">
+  <w:num w:numId="12" w16cid:durableId="381945730">
     <w:abstractNumId w:val="15"/>
   </w:num>
-  <w:num w:numId="13" w16cid:durableId="384372559">
+  <w:num w:numId="13" w16cid:durableId="1067337647">
     <w:abstractNumId w:val="8"/>
   </w:num>
-  <w:num w:numId="14" w16cid:durableId="92477290">
+  <w:num w:numId="14" w16cid:durableId="956527151">
     <w:abstractNumId w:val="13"/>
   </w:num>
-  <w:num w:numId="15" w16cid:durableId="1727299013">
+  <w:num w:numId="15" w16cid:durableId="996297990">
     <w:abstractNumId w:val="10"/>
   </w:num>
-  <w:num w:numId="16" w16cid:durableId="889923812">
+  <w:num w:numId="16" w16cid:durableId="350302658">
     <w:abstractNumId w:val="14"/>
   </w:num>
-  <w:num w:numId="17" w16cid:durableId="1693192450">
+  <w:num w:numId="17" w16cid:durableId="413010318">
     <w:abstractNumId w:val="4"/>
   </w:num>
 </w:numbering>
@@ -8184,8 +8711,52 @@
     <w:lsdException w:name="Subtitle" w:qFormat="1"/>
     <w:lsdException w:name="Strong" w:qFormat="1"/>
     <w:lsdException w:name="Emphasis" w:qFormat="1"/>
+    <w:lsdException w:name="Normal Table" w:semiHidden="1" w:unhideWhenUsed="1"/>
     <w:lsdException w:name="No List" w:uiPriority="99"/>
+    <w:lsdException w:name="Table Simple 1" w:semiHidden="1" w:unhideWhenUsed="1"/>
+    <w:lsdException w:name="Table Simple 2" w:semiHidden="1" w:unhideWhenUsed="1"/>
+    <w:lsdException w:name="Table Simple 3" w:semiHidden="1" w:unhideWhenUsed="1"/>
+    <w:lsdException w:name="Table Classic 1" w:semiHidden="1" w:unhideWhenUsed="1"/>
+    <w:lsdException w:name="Table Classic 2" w:semiHidden="1" w:unhideWhenUsed="1"/>
+    <w:lsdException w:name="Table Classic 3" w:semiHidden="1" w:unhideWhenUsed="1"/>
+    <w:lsdException w:name="Table Classic 4" w:semiHidden="1" w:unhideWhenUsed="1"/>
+    <w:lsdException w:name="Table Colorful 1" w:semiHidden="1" w:unhideWhenUsed="1"/>
+    <w:lsdException w:name="Table Colorful 2" w:semiHidden="1" w:unhideWhenUsed="1"/>
+    <w:lsdException w:name="Table Colorful 3" w:semiHidden="1" w:unhideWhenUsed="1"/>
+    <w:lsdException w:name="Table Columns 1" w:semiHidden="1" w:unhideWhenUsed="1"/>
+    <w:lsdException w:name="Table Columns 2" w:semiHidden="1" w:unhideWhenUsed="1"/>
+    <w:lsdException w:name="Table Columns 3" w:semiHidden="1" w:unhideWhenUsed="1"/>
+    <w:lsdException w:name="Table Columns 4" w:semiHidden="1" w:unhideWhenUsed="1"/>
+    <w:lsdException w:name="Table Columns 5" w:semiHidden="1" w:unhideWhenUsed="1"/>
+    <w:lsdException w:name="Table Grid 1" w:semiHidden="1" w:unhideWhenUsed="1"/>
+    <w:lsdException w:name="Table Grid 2" w:semiHidden="1" w:unhideWhenUsed="1"/>
+    <w:lsdException w:name="Table Grid 3" w:semiHidden="1" w:unhideWhenUsed="1"/>
+    <w:lsdException w:name="Table Grid 4" w:semiHidden="1" w:unhideWhenUsed="1"/>
+    <w:lsdException w:name="Table Grid 5" w:semiHidden="1" w:unhideWhenUsed="1"/>
+    <w:lsdException w:name="Table Grid 6" w:semiHidden="1" w:unhideWhenUsed="1"/>
+    <w:lsdException w:name="Table Grid 7" w:semiHidden="1" w:unhideWhenUsed="1"/>
+    <w:lsdException w:name="Table Grid 8" w:semiHidden="1" w:unhideWhenUsed="1"/>
+    <w:lsdException w:name="Table List 1" w:semiHidden="1" w:unhideWhenUsed="1"/>
+    <w:lsdException w:name="Table List 2" w:semiHidden="1" w:unhideWhenUsed="1"/>
+    <w:lsdException w:name="Table List 3" w:semiHidden="1" w:unhideWhenUsed="1"/>
+    <w:lsdException w:name="Table List 4" w:semiHidden="1" w:unhideWhenUsed="1"/>
+    <w:lsdException w:name="Table List 5" w:semiHidden="1" w:unhideWhenUsed="1"/>
+    <w:lsdException w:name="Table List 6" w:semiHidden="1" w:unhideWhenUsed="1"/>
+    <w:lsdException w:name="Table List 7" w:semiHidden="1" w:unhideWhenUsed="1"/>
+    <w:lsdException w:name="Table List 8" w:semiHidden="1" w:unhideWhenUsed="1"/>
+    <w:lsdException w:name="Table 3D effects 1" w:semiHidden="1" w:unhideWhenUsed="1"/>
+    <w:lsdException w:name="Table 3D effects 2" w:semiHidden="1" w:unhideWhenUsed="1"/>
+    <w:lsdException w:name="Table 3D effects 3" w:semiHidden="1" w:unhideWhenUsed="1"/>
+    <w:lsdException w:name="Table Contemporary" w:semiHidden="1" w:unhideWhenUsed="1"/>
+    <w:lsdException w:name="Table Elegant" w:semiHidden="1" w:unhideWhenUsed="1"/>
+    <w:lsdException w:name="Table Professional" w:semiHidden="1" w:unhideWhenUsed="1"/>
+    <w:lsdException w:name="Table Subtle 1" w:semiHidden="1" w:unhideWhenUsed="1"/>
+    <w:lsdException w:name="Table Subtle 2" w:semiHidden="1" w:unhideWhenUsed="1"/>
+    <w:lsdException w:name="Table Web 1" w:semiHidden="1" w:unhideWhenUsed="1"/>
+    <w:lsdException w:name="Table Web 2" w:semiHidden="1" w:unhideWhenUsed="1"/>
+    <w:lsdException w:name="Table Web 3" w:semiHidden="1" w:unhideWhenUsed="1"/>
     <w:lsdException w:name="Balloon Text" w:uiPriority="99"/>
+    <w:lsdException w:name="Table Theme" w:semiHidden="1" w:unhideWhenUsed="1"/>
     <w:lsdException w:name="Placeholder Text" w:semiHidden="1" w:uiPriority="99"/>
     <w:lsdException w:name="No Spacing" w:uiPriority="1" w:qFormat="1"/>
     <w:lsdException w:name="Light Shading" w:uiPriority="60"/>
@@ -8475,11 +9046,14 @@
   </w:style>
   <w:style w:type="character" w:default="1" w:styleId="Fuentedeprrafopredeter">
     <w:name w:val="Default Paragraph Font"/>
-    <w:semiHidden/>
+    <w:uiPriority w:val="1"/>
+    <w:unhideWhenUsed/>
   </w:style>
   <w:style w:type="table" w:default="1" w:styleId="Tablanormal">
     <w:name w:val="Normal Table"/>
+    <w:uiPriority w:val="99"/>
     <w:semiHidden/>
+    <w:unhideWhenUsed/>
     <w:tblPr>
       <w:tblInd w:w="0" w:type="dxa"/>
       <w:tblCellMar>
@@ -8494,6 +9068,7 @@
     <w:name w:val="No List"/>
     <w:uiPriority w:val="99"/>
     <w:semiHidden/>
+    <w:unhideWhenUsed/>
   </w:style>
   <w:style w:type="paragraph" w:styleId="Textoindependiente3">
     <w:name w:val="Body Text 3"/>
@@ -8511,8 +9086,8 @@
       <w:sz w:val="40"/>
     </w:rPr>
   </w:style>
-  <w:style w:type="paragraph" w:customStyle="1" w:styleId="Heading3">
-    <w:name w:val="Heading 3"/>
+  <w:style w:type="paragraph" w:customStyle="1" w:styleId="Ttulo31">
+    <w:name w:val="Título 31"/>
     <w:basedOn w:val="Normal"/>
     <w:rsid w:val="00BE25B6"/>
     <w:pPr>
@@ -8526,8 +9101,8 @@
       <w:sz w:val="24"/>
     </w:rPr>
   </w:style>
-  <w:style w:type="paragraph" w:customStyle="1" w:styleId="Heading4">
-    <w:name w:val="Heading 4"/>
+  <w:style w:type="paragraph" w:customStyle="1" w:styleId="Ttulo41">
+    <w:name w:val="Título 41"/>
     <w:basedOn w:val="Normal"/>
     <w:rsid w:val="00BE25B6"/>
     <w:pPr>
@@ -8557,8 +9132,8 @@
       <w:u w:val="single"/>
     </w:rPr>
   </w:style>
-  <w:style w:type="paragraph" w:customStyle="1" w:styleId="Heading2">
-    <w:name w:val="Heading 2"/>
+  <w:style w:type="paragraph" w:customStyle="1" w:styleId="Ttulo21">
+    <w:name w:val="Título 21"/>
     <w:basedOn w:val="Normal"/>
     <w:rsid w:val="00BE25B6"/>
     <w:pPr>
@@ -8583,8 +9158,8 @@
       <w:spacing w:after="120" w:line="480" w:lineRule="auto"/>
     </w:pPr>
   </w:style>
-  <w:style w:type="paragraph" w:customStyle="1" w:styleId="Heading1">
-    <w:name w:val="Heading 1"/>
+  <w:style w:type="paragraph" w:customStyle="1" w:styleId="Ttulo11">
+    <w:name w:val="Título 11"/>
     <w:basedOn w:val="Normal"/>
     <w:rsid w:val="00BE25B6"/>
     <w:pPr>
@@ -8598,8 +9173,8 @@
       <w:lang w:val="es-MX"/>
     </w:rPr>
   </w:style>
-  <w:style w:type="paragraph" w:customStyle="1" w:styleId="BodyText2">
-    <w:name w:val="Body Text 2"/>
+  <w:style w:type="paragraph" w:customStyle="1" w:styleId="Textoindependiente21">
+    <w:name w:val="Texto independiente 21"/>
     <w:basedOn w:val="Normal"/>
     <w:rsid w:val="00BE25B6"/>
     <w:pPr>
@@ -8615,8 +9190,8 @@
       <w:sz w:val="24"/>
     </w:rPr>
   </w:style>
-  <w:style w:type="paragraph" w:customStyle="1" w:styleId="BodyText3">
-    <w:name w:val="Body Text 3"/>
+  <w:style w:type="paragraph" w:customStyle="1" w:styleId="Textoindependiente31">
+    <w:name w:val="Texto independiente 31"/>
     <w:basedOn w:val="Normal"/>
     <w:rsid w:val="00BE25B6"/>
     <w:pPr>

</xml_diff>

<commit_message>
Implemevtacion de nuevos datos a extraer y cammbios en plantilla.
</commit_message>
<xml_diff>
--- a/backend/templates/EDOMEX_AP_M_SOLTERA.docx
+++ b/backend/templates/EDOMEX_AP_M_SOLTERA.docx
@@ -549,7 +549,6 @@
         </w:rPr>
         <w:t xml:space="preserve">A FAVOR DE LA SEÑORA </w:t>
       </w:r>
-      <w:proofErr w:type="gramStart"/>
       <w:r>
         <w:rPr>
           <w:rFonts w:ascii="Arial" w:hAnsi="Arial" w:cs="Arial"/>
@@ -569,9 +568,9 @@
           <w:szCs w:val="14"/>
           <w:lang w:val="es-MX"/>
         </w:rPr>
-        <w:t>nombre</w:t>
-      </w:r>
-      <w:proofErr w:type="gramEnd"/>
+        <w:t>nombre_acreditado</w:t>
+      </w:r>
+      <w:proofErr w:type="spellEnd"/>
       <w:r>
         <w:rPr>
           <w:rFonts w:ascii="Arial" w:hAnsi="Arial" w:cs="Arial"/>
@@ -580,40 +579,7 @@
           <w:szCs w:val="14"/>
           <w:lang w:val="es-MX"/>
         </w:rPr>
-        <w:t>_</w:t>
-      </w:r>
-      <w:proofErr w:type="gramStart"/>
-      <w:r>
-        <w:rPr>
-          <w:rFonts w:ascii="Arial" w:hAnsi="Arial" w:cs="Arial"/>
-          <w:b/>
-          <w:sz w:val="14"/>
-          <w:szCs w:val="14"/>
-          <w:lang w:val="es-MX"/>
-        </w:rPr>
-        <w:t>acreditado</w:t>
-      </w:r>
-      <w:proofErr w:type="spellEnd"/>
-      <w:r>
-        <w:rPr>
-          <w:rFonts w:ascii="Arial" w:hAnsi="Arial" w:cs="Arial"/>
-          <w:b/>
-          <w:sz w:val="14"/>
-          <w:szCs w:val="14"/>
-          <w:lang w:val="es-MX"/>
-        </w:rPr>
-        <w:t xml:space="preserve"> }</w:t>
-      </w:r>
-      <w:proofErr w:type="gramEnd"/>
-      <w:r>
-        <w:rPr>
-          <w:rFonts w:ascii="Arial" w:hAnsi="Arial" w:cs="Arial"/>
-          <w:b/>
-          <w:sz w:val="14"/>
-          <w:szCs w:val="14"/>
-          <w:lang w:val="es-MX"/>
-        </w:rPr>
-        <w:t>}</w:t>
+        <w:t xml:space="preserve"> }}</w:t>
       </w:r>
       <w:r>
         <w:rPr>
@@ -1467,7 +1433,18 @@
           <w:szCs w:val="14"/>
           <w:lang w:val="es-MX"/>
         </w:rPr>
-        <w:t>numero_carta</w:t>
+        <w:t>numero_</w:t>
+      </w:r>
+      <w:r>
+        <w:rPr>
+          <w:rFonts w:ascii="Arial" w:eastAsia="Batang" w:hAnsi="Arial" w:cs="Arial"/>
+          <w:b/>
+          <w:bCs/>
+          <w:sz w:val="14"/>
+          <w:szCs w:val="14"/>
+          <w:lang w:val="es-MX"/>
+        </w:rPr>
+        <w:t>escritura</w:t>
       </w:r>
       <w:proofErr w:type="spellEnd"/>
       <w:r>
@@ -1539,7 +1516,16 @@
           <w:szCs w:val="14"/>
           <w:lang w:val="es-MX"/>
         </w:rPr>
-        <w:t>_expedicion</w:t>
+        <w:t>_e</w:t>
+      </w:r>
+      <w:r>
+        <w:rPr>
+          <w:rFonts w:ascii="Arial" w:eastAsia="Batang" w:hAnsi="Arial" w:cs="Arial"/>
+          <w:sz w:val="14"/>
+          <w:szCs w:val="14"/>
+          <w:lang w:val="es-MX"/>
+        </w:rPr>
+        <w:t>sctirura</w:t>
       </w:r>
       <w:proofErr w:type="spellEnd"/>
       <w:r>
@@ -1615,7 +1601,7 @@
           <w:szCs w:val="14"/>
           <w:lang w:val="es-MX"/>
         </w:rPr>
-        <w:t>nombre_notario</w:t>
+        <w:t>notario_origen_completo</w:t>
       </w:r>
       <w:proofErr w:type="spellEnd"/>
       <w:r>
@@ -2298,7 +2284,6 @@
         </w:rPr>
         <w:t xml:space="preserve"> </w:t>
       </w:r>
-      <w:proofErr w:type="gramStart"/>
       <w:r>
         <w:rPr>
           <w:rFonts w:ascii="Arial" w:eastAsia="Batang" w:hAnsi="Arial" w:cs="Arial"/>
@@ -2320,9 +2305,9 @@
           <w:szCs w:val="14"/>
           <w:lang w:val="es-MX"/>
         </w:rPr>
-        <w:t>datos</w:t>
-      </w:r>
-      <w:proofErr w:type="gramEnd"/>
+        <w:t>datos_inmueble</w:t>
+      </w:r>
+      <w:proofErr w:type="spellEnd"/>
       <w:r>
         <w:rPr>
           <w:rFonts w:ascii="Arial" w:eastAsia="Batang" w:hAnsi="Arial" w:cs="Arial"/>
@@ -2332,43 +2317,7 @@
           <w:szCs w:val="14"/>
           <w:lang w:val="es-MX"/>
         </w:rPr>
-        <w:t>_</w:t>
-      </w:r>
-      <w:proofErr w:type="gramStart"/>
-      <w:r>
-        <w:rPr>
-          <w:rFonts w:ascii="Arial" w:eastAsia="Batang" w:hAnsi="Arial" w:cs="Arial"/>
-          <w:b/>
-          <w:bCs/>
-          <w:sz w:val="14"/>
-          <w:szCs w:val="14"/>
-          <w:lang w:val="es-MX"/>
-        </w:rPr>
-        <w:t>inmueble</w:t>
-      </w:r>
-      <w:proofErr w:type="spellEnd"/>
-      <w:r>
-        <w:rPr>
-          <w:rFonts w:ascii="Arial" w:eastAsia="Batang" w:hAnsi="Arial" w:cs="Arial"/>
-          <w:b/>
-          <w:bCs/>
-          <w:sz w:val="14"/>
-          <w:szCs w:val="14"/>
-          <w:lang w:val="es-MX"/>
-        </w:rPr>
-        <w:t xml:space="preserve"> }</w:t>
-      </w:r>
-      <w:proofErr w:type="gramEnd"/>
-      <w:r>
-        <w:rPr>
-          <w:rFonts w:ascii="Arial" w:eastAsia="Batang" w:hAnsi="Arial" w:cs="Arial"/>
-          <w:b/>
-          <w:bCs/>
-          <w:sz w:val="14"/>
-          <w:szCs w:val="14"/>
-          <w:lang w:val="es-MX"/>
-        </w:rPr>
-        <w:t>}</w:t>
+        <w:t xml:space="preserve"> }}</w:t>
       </w:r>
       <w:r>
         <w:rPr>
@@ -2619,9 +2568,9 @@
           <w:szCs w:val="14"/>
           <w:lang w:val="es-ES"/>
         </w:rPr>
-        <w:t xml:space="preserve">e </w:t>
-      </w:r>
-      <w:proofErr w:type="gramStart"/>
+        <w:t xml:space="preserve">e {{ </w:t>
+      </w:r>
+      <w:proofErr w:type="spellStart"/>
       <w:r>
         <w:rPr>
           <w:rFonts w:ascii="Arial" w:hAnsi="Arial" w:cs="Arial"/>
@@ -2629,9 +2578,9 @@
           <w:szCs w:val="14"/>
           <w:lang w:val="es-ES"/>
         </w:rPr>
-        <w:t xml:space="preserve">{{ </w:t>
-      </w:r>
-      <w:proofErr w:type="spellStart"/>
+        <w:t>oficina_registral</w:t>
+      </w:r>
+      <w:proofErr w:type="spellEnd"/>
       <w:r>
         <w:rPr>
           <w:rFonts w:ascii="Arial" w:hAnsi="Arial" w:cs="Arial"/>
@@ -2639,9 +2588,8 @@
           <w:szCs w:val="14"/>
           <w:lang w:val="es-ES"/>
         </w:rPr>
-        <w:t>oficina</w:t>
-      </w:r>
-      <w:proofErr w:type="gramEnd"/>
+        <w:t xml:space="preserve"> }}</w:t>
+      </w:r>
       <w:r>
         <w:rPr>
           <w:rFonts w:ascii="Arial" w:hAnsi="Arial" w:cs="Arial"/>
@@ -2649,66 +2597,7 @@
           <w:szCs w:val="14"/>
           <w:lang w:val="es-ES"/>
         </w:rPr>
-        <w:t>_</w:t>
-      </w:r>
-      <w:proofErr w:type="gramStart"/>
-      <w:r>
-        <w:rPr>
-          <w:rFonts w:ascii="Arial" w:hAnsi="Arial" w:cs="Arial"/>
-          <w:sz w:val="14"/>
-          <w:szCs w:val="14"/>
-          <w:lang w:val="es-ES"/>
-        </w:rPr>
-        <w:t>registral</w:t>
-      </w:r>
-      <w:proofErr w:type="spellEnd"/>
-      <w:r>
-        <w:rPr>
-          <w:rFonts w:ascii="Arial" w:hAnsi="Arial" w:cs="Arial"/>
-          <w:sz w:val="14"/>
-          <w:szCs w:val="14"/>
-          <w:lang w:val="es-ES"/>
-        </w:rPr>
-        <w:t xml:space="preserve"> }</w:t>
-      </w:r>
-      <w:proofErr w:type="gramEnd"/>
-      <w:r>
-        <w:rPr>
-          <w:rFonts w:ascii="Arial" w:hAnsi="Arial" w:cs="Arial"/>
-          <w:sz w:val="14"/>
-          <w:szCs w:val="14"/>
-          <w:lang w:val="es-ES"/>
-        </w:rPr>
-        <w:t>}</w:t>
-      </w:r>
-      <w:r>
-        <w:rPr>
-          <w:rFonts w:ascii="Arial" w:hAnsi="Arial" w:cs="Arial"/>
-          <w:sz w:val="14"/>
-          <w:szCs w:val="14"/>
-          <w:lang w:val="es-ES"/>
-        </w:rPr>
-        <w:t xml:space="preserve">, en el libro primero, sección primera, volumen número   y bajo la partida número    </w:t>
-      </w:r>
-      <w:proofErr w:type="gramStart"/>
-      <w:r>
-        <w:rPr>
-          <w:rFonts w:ascii="Arial" w:hAnsi="Arial" w:cs="Arial"/>
-          <w:sz w:val="14"/>
-          <w:szCs w:val="14"/>
-          <w:lang w:val="es-ES"/>
-        </w:rPr>
-        <w:t xml:space="preserve">  ,</w:t>
-      </w:r>
-      <w:proofErr w:type="gramEnd"/>
-      <w:r>
-        <w:rPr>
-          <w:rFonts w:ascii="Arial" w:hAnsi="Arial" w:cs="Arial"/>
-          <w:sz w:val="14"/>
-          <w:szCs w:val="14"/>
-          <w:lang w:val="es-ES"/>
-        </w:rPr>
-        <w:t xml:space="preserve"> en el libro segundo, sección primera, volumen número  </w:t>
+        <w:t xml:space="preserve">, en el libro primero, sección primera, volumen número   y bajo la partida número      , en el libro segundo, sección primera, volumen número  </w:t>
       </w:r>
     </w:p>
     <w:p>
@@ -2838,9 +2727,9 @@
           <w:szCs w:val="14"/>
           <w:lang w:val="es-MX"/>
         </w:rPr>
-        <w:t>“</w:t>
-      </w:r>
-      <w:proofErr w:type="gramStart"/>
+        <w:t xml:space="preserve">“{{ </w:t>
+      </w:r>
+      <w:proofErr w:type="spellStart"/>
       <w:r>
         <w:rPr>
           <w:rFonts w:ascii="Arial" w:hAnsi="Arial" w:cs="Arial"/>
@@ -2850,9 +2739,9 @@
           <w:szCs w:val="14"/>
           <w:lang w:val="es-MX"/>
         </w:rPr>
-        <w:t xml:space="preserve">{{ </w:t>
-      </w:r>
-      <w:proofErr w:type="spellStart"/>
+        <w:t>folio_real</w:t>
+      </w:r>
+      <w:proofErr w:type="spellEnd"/>
       <w:r>
         <w:rPr>
           <w:rFonts w:ascii="Arial" w:hAnsi="Arial" w:cs="Arial"/>
@@ -2862,55 +2751,7 @@
           <w:szCs w:val="14"/>
           <w:lang w:val="es-MX"/>
         </w:rPr>
-        <w:t>folio</w:t>
-      </w:r>
-      <w:proofErr w:type="gramEnd"/>
-      <w:r>
-        <w:rPr>
-          <w:rFonts w:ascii="Arial" w:hAnsi="Arial" w:cs="Arial"/>
-          <w:b/>
-          <w:bCs/>
-          <w:sz w:val="14"/>
-          <w:szCs w:val="14"/>
-          <w:lang w:val="es-MX"/>
-        </w:rPr>
-        <w:t>_</w:t>
-      </w:r>
-      <w:proofErr w:type="gramStart"/>
-      <w:r>
-        <w:rPr>
-          <w:rFonts w:ascii="Arial" w:hAnsi="Arial" w:cs="Arial"/>
-          <w:b/>
-          <w:bCs/>
-          <w:sz w:val="14"/>
-          <w:szCs w:val="14"/>
-          <w:lang w:val="es-MX"/>
-        </w:rPr>
-        <w:t>real</w:t>
-      </w:r>
-      <w:proofErr w:type="spellEnd"/>
-      <w:r>
-        <w:rPr>
-          <w:rFonts w:ascii="Arial" w:hAnsi="Arial" w:cs="Arial"/>
-          <w:b/>
-          <w:bCs/>
-          <w:sz w:val="14"/>
-          <w:szCs w:val="14"/>
-          <w:lang w:val="es-MX"/>
-        </w:rPr>
-        <w:t xml:space="preserve"> }</w:t>
-      </w:r>
-      <w:proofErr w:type="gramEnd"/>
-      <w:r>
-        <w:rPr>
-          <w:rFonts w:ascii="Arial" w:hAnsi="Arial" w:cs="Arial"/>
-          <w:b/>
-          <w:bCs/>
-          <w:sz w:val="14"/>
-          <w:szCs w:val="14"/>
-          <w:lang w:val="es-MX"/>
-        </w:rPr>
-        <w:t>}”</w:t>
+        <w:t xml:space="preserve"> }}”</w:t>
       </w:r>
       <w:r>
         <w:rPr>
@@ -2989,7 +2830,6 @@
         </w:rPr>
         <w:t xml:space="preserve">a </w:t>
       </w:r>
-      <w:proofErr w:type="gramStart"/>
       <w:r>
         <w:rPr>
           <w:rFonts w:ascii="Arial" w:hAnsi="Arial" w:cs="Arial"/>
@@ -3005,25 +2845,7 @@
           <w:sz w:val="14"/>
           <w:szCs w:val="14"/>
         </w:rPr>
-        <w:t>fecha</w:t>
-      </w:r>
-      <w:proofErr w:type="gramEnd"/>
-      <w:r>
-        <w:rPr>
-          <w:rFonts w:ascii="Arial" w:hAnsi="Arial" w:cs="Arial"/>
-          <w:sz w:val="14"/>
-          <w:szCs w:val="14"/>
-        </w:rPr>
-        <w:t>_</w:t>
-      </w:r>
-      <w:proofErr w:type="gramStart"/>
-      <w:r>
-        <w:rPr>
-          <w:rFonts w:ascii="Arial" w:hAnsi="Arial" w:cs="Arial"/>
-          <w:sz w:val="14"/>
-          <w:szCs w:val="14"/>
-        </w:rPr>
-        <w:t>expedicion</w:t>
+        <w:t>fecha_expedicion</w:t>
       </w:r>
       <w:proofErr w:type="spellEnd"/>
       <w:r>
@@ -3032,16 +2854,7 @@
           <w:sz w:val="14"/>
           <w:szCs w:val="14"/>
         </w:rPr>
-        <w:t xml:space="preserve"> }</w:t>
-      </w:r>
-      <w:proofErr w:type="gramEnd"/>
-      <w:r>
-        <w:rPr>
-          <w:rFonts w:ascii="Arial" w:hAnsi="Arial" w:cs="Arial"/>
-          <w:sz w:val="14"/>
-          <w:szCs w:val="14"/>
-        </w:rPr>
-        <w:t>}</w:t>
+        <w:t xml:space="preserve"> }}</w:t>
       </w:r>
       <w:r>
         <w:rPr>
@@ -3094,7 +2907,6 @@
         <w:t xml:space="preserve"> </w:t>
       </w:r>
       <w:bookmarkEnd w:id="5"/>
-      <w:proofErr w:type="gramStart"/>
       <w:r>
         <w:rPr>
           <w:rFonts w:ascii="Arial" w:hAnsi="Arial" w:cs="Arial"/>
@@ -3114,29 +2926,7 @@
           <w:sz w:val="14"/>
           <w:szCs w:val="14"/>
         </w:rPr>
-        <w:t>numero</w:t>
-      </w:r>
-      <w:proofErr w:type="gramEnd"/>
-      <w:r>
-        <w:rPr>
-          <w:rFonts w:ascii="Arial" w:hAnsi="Arial" w:cs="Arial"/>
-          <w:b/>
-          <w:bCs/>
-          <w:sz w:val="14"/>
-          <w:szCs w:val="14"/>
-        </w:rPr>
-        <w:t>_</w:t>
-      </w:r>
-      <w:proofErr w:type="gramStart"/>
-      <w:r>
-        <w:rPr>
-          <w:rFonts w:ascii="Arial" w:hAnsi="Arial" w:cs="Arial"/>
-          <w:b/>
-          <w:bCs/>
-          <w:sz w:val="14"/>
-          <w:szCs w:val="14"/>
-        </w:rPr>
-        <w:t>carta</w:t>
+        <w:t>numero_carta</w:t>
       </w:r>
       <w:proofErr w:type="spellEnd"/>
       <w:r>
@@ -3147,18 +2937,7 @@
           <w:sz w:val="14"/>
           <w:szCs w:val="14"/>
         </w:rPr>
-        <w:t xml:space="preserve"> }</w:t>
-      </w:r>
-      <w:proofErr w:type="gramEnd"/>
-      <w:r>
-        <w:rPr>
-          <w:rFonts w:ascii="Arial" w:hAnsi="Arial" w:cs="Arial"/>
-          <w:b/>
-          <w:bCs/>
-          <w:sz w:val="14"/>
-          <w:szCs w:val="14"/>
-        </w:rPr>
-        <w:t>}</w:t>
+        <w:t xml:space="preserve"> }}</w:t>
       </w:r>
       <w:r>
         <w:rPr>
@@ -3316,7 +3095,6 @@
         </w:rPr>
         <w:t xml:space="preserve"> </w:t>
       </w:r>
-      <w:proofErr w:type="gramStart"/>
       <w:r>
         <w:rPr>
           <w:rFonts w:ascii="Arial" w:hAnsi="Arial" w:cs="Arial"/>
@@ -3336,29 +3114,7 @@
           <w:sz w:val="14"/>
           <w:szCs w:val="14"/>
         </w:rPr>
-        <w:t>fecha</w:t>
-      </w:r>
-      <w:proofErr w:type="gramEnd"/>
-      <w:r>
-        <w:rPr>
-          <w:rFonts w:ascii="Arial" w:hAnsi="Arial" w:cs="Arial"/>
-          <w:b/>
-          <w:bCs/>
-          <w:sz w:val="14"/>
-          <w:szCs w:val="14"/>
-        </w:rPr>
-        <w:t>_</w:t>
-      </w:r>
-      <w:proofErr w:type="gramStart"/>
-      <w:r>
-        <w:rPr>
-          <w:rFonts w:ascii="Arial" w:hAnsi="Arial" w:cs="Arial"/>
-          <w:b/>
-          <w:bCs/>
-          <w:sz w:val="14"/>
-          <w:szCs w:val="14"/>
-        </w:rPr>
-        <w:t>liquidacion</w:t>
+        <w:t>fecha_liquidacion</w:t>
       </w:r>
       <w:proofErr w:type="spellEnd"/>
       <w:r>
@@ -3369,18 +3125,7 @@
           <w:sz w:val="14"/>
           <w:szCs w:val="14"/>
         </w:rPr>
-        <w:t xml:space="preserve"> }</w:t>
-      </w:r>
-      <w:proofErr w:type="gramEnd"/>
-      <w:r>
-        <w:rPr>
-          <w:rFonts w:ascii="Arial" w:hAnsi="Arial" w:cs="Arial"/>
-          <w:b/>
-          <w:bCs/>
-          <w:sz w:val="14"/>
-          <w:szCs w:val="14"/>
-        </w:rPr>
-        <w:t>}</w:t>
+        <w:t xml:space="preserve"> }}</w:t>
       </w:r>
     </w:p>
     <w:p>
@@ -5247,6 +4992,7 @@
           <w:szCs w:val="14"/>
           <w:lang w:val="es-MX"/>
         </w:rPr>
+        <w:lastRenderedPageBreak/>
         <w:t xml:space="preserve">-------- </w:t>
       </w:r>
       <w:r>
@@ -5289,7 +5035,6 @@
           <w:szCs w:val="14"/>
           <w:lang w:val="es-MX"/>
         </w:rPr>
-        <w:lastRenderedPageBreak/>
         <w:t xml:space="preserve">-------- </w:t>
       </w:r>
       <w:r>
@@ -5618,7 +5363,6 @@
         </w:rPr>
         <w:t xml:space="preserve">-------- </w:t>
       </w:r>
-      <w:proofErr w:type="gramStart"/>
       <w:r>
         <w:rPr>
           <w:rFonts w:ascii="Arial" w:eastAsia="MS Mincho" w:hAnsi="Arial" w:cs="Arial"/>
@@ -5626,17 +5370,7 @@
           <w:szCs w:val="14"/>
           <w:lang w:val="es-MX"/>
         </w:rPr>
-        <w:t>VI.-</w:t>
-      </w:r>
-      <w:proofErr w:type="gramEnd"/>
-      <w:r>
-        <w:rPr>
-          <w:rFonts w:ascii="Arial" w:eastAsia="MS Mincho" w:hAnsi="Arial" w:cs="Arial"/>
-          <w:sz w:val="14"/>
-          <w:szCs w:val="14"/>
-          <w:lang w:val="es-MX"/>
-        </w:rPr>
-        <w:t xml:space="preserve"> Que leí este instrumento a la compareciente, a quien le expliqué su valor, fuerza y las consecuencias legales de su contenido, manifestando su conformidad con el mismo, por lo que lo otorga, ratifica y </w:t>
+        <w:t xml:space="preserve">VI.- Que leí este instrumento a la compareciente, a quien le expliqué su valor, fuerza y las consecuencias legales de su contenido, manifestando su conformidad con el mismo, por lo que lo otorga, ratifica y </w:t>
       </w:r>
       <w:r>
         <w:rPr>
@@ -6612,7 +6346,6 @@
         </w:rPr>
         <w:t xml:space="preserve"> </w:t>
       </w:r>
-      <w:proofErr w:type="gramStart"/>
       <w:r>
         <w:rPr>
           <w:rFonts w:ascii="Arial" w:hAnsi="Arial" w:cs="Arial"/>
@@ -6632,9 +6365,9 @@
           <w:szCs w:val="14"/>
           <w:u w:val="single"/>
         </w:rPr>
-        <w:t>nombre</w:t>
-      </w:r>
-      <w:proofErr w:type="gramEnd"/>
+        <w:t>nombre_acreditado</w:t>
+      </w:r>
+      <w:proofErr w:type="spellEnd"/>
       <w:r>
         <w:rPr>
           <w:rFonts w:ascii="Arial" w:hAnsi="Arial" w:cs="Arial"/>
@@ -6643,40 +6376,7 @@
           <w:szCs w:val="14"/>
           <w:u w:val="single"/>
         </w:rPr>
-        <w:t>_</w:t>
-      </w:r>
-      <w:proofErr w:type="gramStart"/>
-      <w:r>
-        <w:rPr>
-          <w:rFonts w:ascii="Arial" w:hAnsi="Arial" w:cs="Arial"/>
-          <w:b/>
-          <w:sz w:val="14"/>
-          <w:szCs w:val="14"/>
-          <w:u w:val="single"/>
-        </w:rPr>
-        <w:t>acreditado</w:t>
-      </w:r>
-      <w:proofErr w:type="spellEnd"/>
-      <w:r>
-        <w:rPr>
-          <w:rFonts w:ascii="Arial" w:hAnsi="Arial" w:cs="Arial"/>
-          <w:b/>
-          <w:sz w:val="14"/>
-          <w:szCs w:val="14"/>
-          <w:u w:val="single"/>
-        </w:rPr>
-        <w:t xml:space="preserve"> }</w:t>
-      </w:r>
-      <w:proofErr w:type="gramEnd"/>
-      <w:r>
-        <w:rPr>
-          <w:rFonts w:ascii="Arial" w:hAnsi="Arial" w:cs="Arial"/>
-          <w:b/>
-          <w:sz w:val="14"/>
-          <w:szCs w:val="14"/>
-          <w:u w:val="single"/>
-        </w:rPr>
-        <w:t>}</w:t>
+        <w:t xml:space="preserve"> }}</w:t>
       </w:r>
       <w:r>
         <w:rPr>
@@ -9047,6 +8747,7 @@
   <w:style w:type="character" w:default="1" w:styleId="Fuentedeprrafopredeter">
     <w:name w:val="Default Paragraph Font"/>
     <w:uiPriority w:val="1"/>
+    <w:semiHidden/>
     <w:unhideWhenUsed/>
   </w:style>
   <w:style w:type="table" w:default="1" w:styleId="Tablanormal">

</xml_diff>

<commit_message>
Actualización de extracción de escritura, notario y cónyuge en services y main CORREGIDO.
</commit_message>
<xml_diff>
--- a/backend/templates/EDOMEX_AP_M_SOLTERA.docx
+++ b/backend/templates/EDOMEX_AP_M_SOLTERA.docx
@@ -1516,7 +1516,7 @@
           <w:szCs w:val="14"/>
           <w:lang w:val="es-MX"/>
         </w:rPr>
-        <w:t>_e</w:t>
+        <w:t>_</w:t>
       </w:r>
       <w:r>
         <w:rPr>
@@ -1525,7 +1525,7 @@
           <w:szCs w:val="14"/>
           <w:lang w:val="es-MX"/>
         </w:rPr>
-        <w:t>sctirura</w:t>
+        <w:t>escritura</w:t>
       </w:r>
       <w:proofErr w:type="spellEnd"/>
       <w:r>

</xml_diff>

<commit_message>
Actualización completa: conversión a letras para número de escritura, fechas, VSM, inmuebles, folio real, notario y menciones federales
</commit_message>
<xml_diff>
--- a/backend/templates/EDOMEX_AP_M_SOLTERA.docx
+++ b/backend/templates/EDOMEX_AP_M_SOLTERA.docx
@@ -549,6 +549,7 @@
         </w:rPr>
         <w:t xml:space="preserve">A FAVOR DE LA SEÑORA </w:t>
       </w:r>
+      <w:proofErr w:type="gramStart"/>
       <w:r>
         <w:rPr>
           <w:rFonts w:ascii="Arial" w:hAnsi="Arial" w:cs="Arial"/>
@@ -568,7 +569,29 @@
           <w:szCs w:val="14"/>
           <w:lang w:val="es-MX"/>
         </w:rPr>
-        <w:t>nombre_acreditado</w:t>
+        <w:t>nombre</w:t>
+      </w:r>
+      <w:proofErr w:type="gramEnd"/>
+      <w:r>
+        <w:rPr>
+          <w:rFonts w:ascii="Arial" w:hAnsi="Arial" w:cs="Arial"/>
+          <w:b/>
+          <w:sz w:val="14"/>
+          <w:szCs w:val="14"/>
+          <w:lang w:val="es-MX"/>
+        </w:rPr>
+        <w:t>_</w:t>
+      </w:r>
+      <w:proofErr w:type="gramStart"/>
+      <w:r>
+        <w:rPr>
+          <w:rFonts w:ascii="Arial" w:hAnsi="Arial" w:cs="Arial"/>
+          <w:b/>
+          <w:sz w:val="14"/>
+          <w:szCs w:val="14"/>
+          <w:lang w:val="es-MX"/>
+        </w:rPr>
+        <w:t>acreditado</w:t>
       </w:r>
       <w:proofErr w:type="spellEnd"/>
       <w:r>
@@ -579,7 +602,18 @@
           <w:szCs w:val="14"/>
           <w:lang w:val="es-MX"/>
         </w:rPr>
-        <w:t xml:space="preserve"> }}</w:t>
+        <w:t xml:space="preserve"> }</w:t>
+      </w:r>
+      <w:proofErr w:type="gramEnd"/>
+      <w:r>
+        <w:rPr>
+          <w:rFonts w:ascii="Arial" w:hAnsi="Arial" w:cs="Arial"/>
+          <w:b/>
+          <w:sz w:val="14"/>
+          <w:szCs w:val="14"/>
+          <w:lang w:val="es-MX"/>
+        </w:rPr>
+        <w:t>}</w:t>
       </w:r>
       <w:r>
         <w:rPr>
@@ -2008,8 +2042,6 @@
       <w:r>
         <w:rPr>
           <w:rFonts w:ascii="Arial" w:eastAsia="Batang" w:hAnsi="Arial" w:cs="Arial"/>
-          <w:b/>
-          <w:bCs/>
           <w:iCs/>
           <w:sz w:val="14"/>
           <w:szCs w:val="14"/>
@@ -2020,8 +2052,6 @@
       <w:r>
         <w:rPr>
           <w:rFonts w:ascii="Arial" w:eastAsia="Batang" w:hAnsi="Arial" w:cs="Arial"/>
-          <w:b/>
-          <w:bCs/>
           <w:iCs/>
           <w:sz w:val="14"/>
           <w:szCs w:val="14"/>
@@ -2284,6 +2314,7 @@
         </w:rPr>
         <w:t xml:space="preserve"> </w:t>
       </w:r>
+      <w:proofErr w:type="gramStart"/>
       <w:r>
         <w:rPr>
           <w:rFonts w:ascii="Arial" w:eastAsia="Batang" w:hAnsi="Arial" w:cs="Arial"/>
@@ -2305,7 +2336,31 @@
           <w:szCs w:val="14"/>
           <w:lang w:val="es-MX"/>
         </w:rPr>
-        <w:t>datos_inmueble</w:t>
+        <w:t>datos</w:t>
+      </w:r>
+      <w:proofErr w:type="gramEnd"/>
+      <w:r>
+        <w:rPr>
+          <w:rFonts w:ascii="Arial" w:eastAsia="Batang" w:hAnsi="Arial" w:cs="Arial"/>
+          <w:b/>
+          <w:bCs/>
+          <w:sz w:val="14"/>
+          <w:szCs w:val="14"/>
+          <w:lang w:val="es-MX"/>
+        </w:rPr>
+        <w:t>_</w:t>
+      </w:r>
+      <w:proofErr w:type="gramStart"/>
+      <w:r>
+        <w:rPr>
+          <w:rFonts w:ascii="Arial" w:eastAsia="Batang" w:hAnsi="Arial" w:cs="Arial"/>
+          <w:b/>
+          <w:bCs/>
+          <w:sz w:val="14"/>
+          <w:szCs w:val="14"/>
+          <w:lang w:val="es-MX"/>
+        </w:rPr>
+        <w:t>inmueble</w:t>
       </w:r>
       <w:proofErr w:type="spellEnd"/>
       <w:r>
@@ -2317,7 +2372,19 @@
           <w:szCs w:val="14"/>
           <w:lang w:val="es-MX"/>
         </w:rPr>
-        <w:t xml:space="preserve"> }}</w:t>
+        <w:t xml:space="preserve"> }</w:t>
+      </w:r>
+      <w:proofErr w:type="gramEnd"/>
+      <w:r>
+        <w:rPr>
+          <w:rFonts w:ascii="Arial" w:eastAsia="Batang" w:hAnsi="Arial" w:cs="Arial"/>
+          <w:b/>
+          <w:bCs/>
+          <w:sz w:val="14"/>
+          <w:szCs w:val="14"/>
+          <w:lang w:val="es-MX"/>
+        </w:rPr>
+        <w:t>}</w:t>
       </w:r>
       <w:r>
         <w:rPr>
@@ -2568,7 +2635,17 @@
           <w:szCs w:val="14"/>
           <w:lang w:val="es-ES"/>
         </w:rPr>
-        <w:t xml:space="preserve">e {{ </w:t>
+        <w:t xml:space="preserve">e </w:t>
+      </w:r>
+      <w:proofErr w:type="gramStart"/>
+      <w:r>
+        <w:rPr>
+          <w:rFonts w:ascii="Arial" w:hAnsi="Arial" w:cs="Arial"/>
+          <w:sz w:val="14"/>
+          <w:szCs w:val="14"/>
+          <w:lang w:val="es-ES"/>
+        </w:rPr>
+        <w:t xml:space="preserve">{{ </w:t>
       </w:r>
       <w:proofErr w:type="spellStart"/>
       <w:r>
@@ -2578,7 +2655,27 @@
           <w:szCs w:val="14"/>
           <w:lang w:val="es-ES"/>
         </w:rPr>
-        <w:t>oficina_registral</w:t>
+        <w:t>oficina</w:t>
+      </w:r>
+      <w:proofErr w:type="gramEnd"/>
+      <w:r>
+        <w:rPr>
+          <w:rFonts w:ascii="Arial" w:hAnsi="Arial" w:cs="Arial"/>
+          <w:sz w:val="14"/>
+          <w:szCs w:val="14"/>
+          <w:lang w:val="es-ES"/>
+        </w:rPr>
+        <w:t>_</w:t>
+      </w:r>
+      <w:proofErr w:type="gramStart"/>
+      <w:r>
+        <w:rPr>
+          <w:rFonts w:ascii="Arial" w:hAnsi="Arial" w:cs="Arial"/>
+          <w:sz w:val="14"/>
+          <w:szCs w:val="14"/>
+          <w:lang w:val="es-ES"/>
+        </w:rPr>
+        <w:t>registral</w:t>
       </w:r>
       <w:proofErr w:type="spellEnd"/>
       <w:r>
@@ -2588,8 +2685,9 @@
           <w:szCs w:val="14"/>
           <w:lang w:val="es-ES"/>
         </w:rPr>
-        <w:t xml:space="preserve"> }}</w:t>
-      </w:r>
+        <w:t xml:space="preserve"> }</w:t>
+      </w:r>
+      <w:proofErr w:type="gramEnd"/>
       <w:r>
         <w:rPr>
           <w:rFonts w:ascii="Arial" w:hAnsi="Arial" w:cs="Arial"/>
@@ -2597,7 +2695,36 @@
           <w:szCs w:val="14"/>
           <w:lang w:val="es-ES"/>
         </w:rPr>
-        <w:t xml:space="preserve">, en el libro primero, sección primera, volumen número   y bajo la partida número      , en el libro segundo, sección primera, volumen número  </w:t>
+        <w:t>}</w:t>
+      </w:r>
+      <w:r>
+        <w:rPr>
+          <w:rFonts w:ascii="Arial" w:hAnsi="Arial" w:cs="Arial"/>
+          <w:sz w:val="14"/>
+          <w:szCs w:val="14"/>
+          <w:lang w:val="es-ES"/>
+        </w:rPr>
+        <w:t xml:space="preserve">, en el libro primero, sección primera, volumen número   y bajo la partida número    </w:t>
+      </w:r>
+      <w:proofErr w:type="gramStart"/>
+      <w:r>
+        <w:rPr>
+          <w:rFonts w:ascii="Arial" w:hAnsi="Arial" w:cs="Arial"/>
+          <w:sz w:val="14"/>
+          <w:szCs w:val="14"/>
+          <w:lang w:val="es-ES"/>
+        </w:rPr>
+        <w:t xml:space="preserve">  ,</w:t>
+      </w:r>
+      <w:proofErr w:type="gramEnd"/>
+      <w:r>
+        <w:rPr>
+          <w:rFonts w:ascii="Arial" w:hAnsi="Arial" w:cs="Arial"/>
+          <w:sz w:val="14"/>
+          <w:szCs w:val="14"/>
+          <w:lang w:val="es-ES"/>
+        </w:rPr>
+        <w:t xml:space="preserve"> en el libro segundo, sección primera, volumen número  </w:t>
       </w:r>
     </w:p>
     <w:p>
@@ -2727,7 +2854,19 @@
           <w:szCs w:val="14"/>
           <w:lang w:val="es-MX"/>
         </w:rPr>
-        <w:t xml:space="preserve">“{{ </w:t>
+        <w:t>“</w:t>
+      </w:r>
+      <w:proofErr w:type="gramStart"/>
+      <w:r>
+        <w:rPr>
+          <w:rFonts w:ascii="Arial" w:hAnsi="Arial" w:cs="Arial"/>
+          <w:b/>
+          <w:bCs/>
+          <w:sz w:val="14"/>
+          <w:szCs w:val="14"/>
+          <w:lang w:val="es-MX"/>
+        </w:rPr>
+        <w:t xml:space="preserve">{{ </w:t>
       </w:r>
       <w:proofErr w:type="spellStart"/>
       <w:r>
@@ -2739,7 +2878,31 @@
           <w:szCs w:val="14"/>
           <w:lang w:val="es-MX"/>
         </w:rPr>
-        <w:t>folio_real</w:t>
+        <w:t>folio</w:t>
+      </w:r>
+      <w:proofErr w:type="gramEnd"/>
+      <w:r>
+        <w:rPr>
+          <w:rFonts w:ascii="Arial" w:hAnsi="Arial" w:cs="Arial"/>
+          <w:b/>
+          <w:bCs/>
+          <w:sz w:val="14"/>
+          <w:szCs w:val="14"/>
+          <w:lang w:val="es-MX"/>
+        </w:rPr>
+        <w:t>_</w:t>
+      </w:r>
+      <w:proofErr w:type="gramStart"/>
+      <w:r>
+        <w:rPr>
+          <w:rFonts w:ascii="Arial" w:hAnsi="Arial" w:cs="Arial"/>
+          <w:b/>
+          <w:bCs/>
+          <w:sz w:val="14"/>
+          <w:szCs w:val="14"/>
+          <w:lang w:val="es-MX"/>
+        </w:rPr>
+        <w:t>real</w:t>
       </w:r>
       <w:proofErr w:type="spellEnd"/>
       <w:r>
@@ -2751,7 +2914,19 @@
           <w:szCs w:val="14"/>
           <w:lang w:val="es-MX"/>
         </w:rPr>
-        <w:t xml:space="preserve"> }}”</w:t>
+        <w:t xml:space="preserve"> }</w:t>
+      </w:r>
+      <w:proofErr w:type="gramEnd"/>
+      <w:r>
+        <w:rPr>
+          <w:rFonts w:ascii="Arial" w:hAnsi="Arial" w:cs="Arial"/>
+          <w:b/>
+          <w:bCs/>
+          <w:sz w:val="14"/>
+          <w:szCs w:val="14"/>
+          <w:lang w:val="es-MX"/>
+        </w:rPr>
+        <w:t>}”</w:t>
       </w:r>
       <w:r>
         <w:rPr>
@@ -2830,6 +3005,7 @@
         </w:rPr>
         <w:t xml:space="preserve">a </w:t>
       </w:r>
+      <w:proofErr w:type="gramStart"/>
       <w:r>
         <w:rPr>
           <w:rFonts w:ascii="Arial" w:hAnsi="Arial" w:cs="Arial"/>
@@ -2845,7 +3021,25 @@
           <w:sz w:val="14"/>
           <w:szCs w:val="14"/>
         </w:rPr>
-        <w:t>fecha_expedicion</w:t>
+        <w:t>fecha</w:t>
+      </w:r>
+      <w:proofErr w:type="gramEnd"/>
+      <w:r>
+        <w:rPr>
+          <w:rFonts w:ascii="Arial" w:hAnsi="Arial" w:cs="Arial"/>
+          <w:sz w:val="14"/>
+          <w:szCs w:val="14"/>
+        </w:rPr>
+        <w:t>_</w:t>
+      </w:r>
+      <w:proofErr w:type="gramStart"/>
+      <w:r>
+        <w:rPr>
+          <w:rFonts w:ascii="Arial" w:hAnsi="Arial" w:cs="Arial"/>
+          <w:sz w:val="14"/>
+          <w:szCs w:val="14"/>
+        </w:rPr>
+        <w:t>expedicion</w:t>
       </w:r>
       <w:proofErr w:type="spellEnd"/>
       <w:r>
@@ -2854,7 +3048,16 @@
           <w:sz w:val="14"/>
           <w:szCs w:val="14"/>
         </w:rPr>
-        <w:t xml:space="preserve"> }}</w:t>
+        <w:t xml:space="preserve"> }</w:t>
+      </w:r>
+      <w:proofErr w:type="gramEnd"/>
+      <w:r>
+        <w:rPr>
+          <w:rFonts w:ascii="Arial" w:hAnsi="Arial" w:cs="Arial"/>
+          <w:sz w:val="14"/>
+          <w:szCs w:val="14"/>
+        </w:rPr>
+        <w:t>}</w:t>
       </w:r>
       <w:r>
         <w:rPr>
@@ -2907,6 +3110,7 @@
         <w:t xml:space="preserve"> </w:t>
       </w:r>
       <w:bookmarkEnd w:id="5"/>
+      <w:proofErr w:type="gramStart"/>
       <w:r>
         <w:rPr>
           <w:rFonts w:ascii="Arial" w:hAnsi="Arial" w:cs="Arial"/>
@@ -2926,7 +3130,29 @@
           <w:sz w:val="14"/>
           <w:szCs w:val="14"/>
         </w:rPr>
-        <w:t>numero_carta</w:t>
+        <w:t>numero</w:t>
+      </w:r>
+      <w:proofErr w:type="gramEnd"/>
+      <w:r>
+        <w:rPr>
+          <w:rFonts w:ascii="Arial" w:hAnsi="Arial" w:cs="Arial"/>
+          <w:b/>
+          <w:bCs/>
+          <w:sz w:val="14"/>
+          <w:szCs w:val="14"/>
+        </w:rPr>
+        <w:t>_</w:t>
+      </w:r>
+      <w:proofErr w:type="gramStart"/>
+      <w:r>
+        <w:rPr>
+          <w:rFonts w:ascii="Arial" w:hAnsi="Arial" w:cs="Arial"/>
+          <w:b/>
+          <w:bCs/>
+          <w:sz w:val="14"/>
+          <w:szCs w:val="14"/>
+        </w:rPr>
+        <w:t>carta</w:t>
       </w:r>
       <w:proofErr w:type="spellEnd"/>
       <w:r>
@@ -2937,7 +3163,18 @@
           <w:sz w:val="14"/>
           <w:szCs w:val="14"/>
         </w:rPr>
-        <w:t xml:space="preserve"> }}</w:t>
+        <w:t xml:space="preserve"> }</w:t>
+      </w:r>
+      <w:proofErr w:type="gramEnd"/>
+      <w:r>
+        <w:rPr>
+          <w:rFonts w:ascii="Arial" w:hAnsi="Arial" w:cs="Arial"/>
+          <w:b/>
+          <w:bCs/>
+          <w:sz w:val="14"/>
+          <w:szCs w:val="14"/>
+        </w:rPr>
+        <w:t>}</w:t>
       </w:r>
       <w:r>
         <w:rPr>
@@ -3095,6 +3332,7 @@
         </w:rPr>
         <w:t xml:space="preserve"> </w:t>
       </w:r>
+      <w:proofErr w:type="gramStart"/>
       <w:r>
         <w:rPr>
           <w:rFonts w:ascii="Arial" w:hAnsi="Arial" w:cs="Arial"/>
@@ -3114,7 +3352,29 @@
           <w:sz w:val="14"/>
           <w:szCs w:val="14"/>
         </w:rPr>
-        <w:t>fecha_liquidacion</w:t>
+        <w:t>fecha</w:t>
+      </w:r>
+      <w:proofErr w:type="gramEnd"/>
+      <w:r>
+        <w:rPr>
+          <w:rFonts w:ascii="Arial" w:hAnsi="Arial" w:cs="Arial"/>
+          <w:b/>
+          <w:bCs/>
+          <w:sz w:val="14"/>
+          <w:szCs w:val="14"/>
+        </w:rPr>
+        <w:t>_</w:t>
+      </w:r>
+      <w:proofErr w:type="gramStart"/>
+      <w:r>
+        <w:rPr>
+          <w:rFonts w:ascii="Arial" w:hAnsi="Arial" w:cs="Arial"/>
+          <w:b/>
+          <w:bCs/>
+          <w:sz w:val="14"/>
+          <w:szCs w:val="14"/>
+        </w:rPr>
+        <w:t>liquidacion</w:t>
       </w:r>
       <w:proofErr w:type="spellEnd"/>
       <w:r>
@@ -3125,7 +3385,18 @@
           <w:sz w:val="14"/>
           <w:szCs w:val="14"/>
         </w:rPr>
-        <w:t xml:space="preserve"> }}</w:t>
+        <w:t xml:space="preserve"> }</w:t>
+      </w:r>
+      <w:proofErr w:type="gramEnd"/>
+      <w:r>
+        <w:rPr>
+          <w:rFonts w:ascii="Arial" w:hAnsi="Arial" w:cs="Arial"/>
+          <w:b/>
+          <w:bCs/>
+          <w:sz w:val="14"/>
+          <w:szCs w:val="14"/>
+        </w:rPr>
+        <w:t>}</w:t>
       </w:r>
     </w:p>
     <w:p>
@@ -5363,6 +5634,7 @@
         </w:rPr>
         <w:t xml:space="preserve">-------- </w:t>
       </w:r>
+      <w:proofErr w:type="gramStart"/>
       <w:r>
         <w:rPr>
           <w:rFonts w:ascii="Arial" w:eastAsia="MS Mincho" w:hAnsi="Arial" w:cs="Arial"/>
@@ -5370,7 +5642,17 @@
           <w:szCs w:val="14"/>
           <w:lang w:val="es-MX"/>
         </w:rPr>
-        <w:t xml:space="preserve">VI.- Que leí este instrumento a la compareciente, a quien le expliqué su valor, fuerza y las consecuencias legales de su contenido, manifestando su conformidad con el mismo, por lo que lo otorga, ratifica y </w:t>
+        <w:t>VI.-</w:t>
+      </w:r>
+      <w:proofErr w:type="gramEnd"/>
+      <w:r>
+        <w:rPr>
+          <w:rFonts w:ascii="Arial" w:eastAsia="MS Mincho" w:hAnsi="Arial" w:cs="Arial"/>
+          <w:sz w:val="14"/>
+          <w:szCs w:val="14"/>
+          <w:lang w:val="es-MX"/>
+        </w:rPr>
+        <w:t xml:space="preserve"> Que leí este instrumento a la compareciente, a quien le expliqué su valor, fuerza y las consecuencias legales de su contenido, manifestando su conformidad con el mismo, por lo que lo otorga, ratifica y </w:t>
       </w:r>
       <w:r>
         <w:rPr>
@@ -6346,6 +6628,7 @@
         </w:rPr>
         <w:t xml:space="preserve"> </w:t>
       </w:r>
+      <w:proofErr w:type="gramStart"/>
       <w:r>
         <w:rPr>
           <w:rFonts w:ascii="Arial" w:hAnsi="Arial" w:cs="Arial"/>
@@ -6365,7 +6648,29 @@
           <w:szCs w:val="14"/>
           <w:u w:val="single"/>
         </w:rPr>
-        <w:t>nombre_acreditado</w:t>
+        <w:t>nombre</w:t>
+      </w:r>
+      <w:proofErr w:type="gramEnd"/>
+      <w:r>
+        <w:rPr>
+          <w:rFonts w:ascii="Arial" w:hAnsi="Arial" w:cs="Arial"/>
+          <w:b/>
+          <w:sz w:val="14"/>
+          <w:szCs w:val="14"/>
+          <w:u w:val="single"/>
+        </w:rPr>
+        <w:t>_</w:t>
+      </w:r>
+      <w:proofErr w:type="gramStart"/>
+      <w:r>
+        <w:rPr>
+          <w:rFonts w:ascii="Arial" w:hAnsi="Arial" w:cs="Arial"/>
+          <w:b/>
+          <w:sz w:val="14"/>
+          <w:szCs w:val="14"/>
+          <w:u w:val="single"/>
+        </w:rPr>
+        <w:t>acreditado</w:t>
       </w:r>
       <w:proofErr w:type="spellEnd"/>
       <w:r>
@@ -6376,7 +6681,18 @@
           <w:szCs w:val="14"/>
           <w:u w:val="single"/>
         </w:rPr>
-        <w:t xml:space="preserve"> }}</w:t>
+        <w:t xml:space="preserve"> }</w:t>
+      </w:r>
+      <w:proofErr w:type="gramEnd"/>
+      <w:r>
+        <w:rPr>
+          <w:rFonts w:ascii="Arial" w:hAnsi="Arial" w:cs="Arial"/>
+          <w:b/>
+          <w:sz w:val="14"/>
+          <w:szCs w:val="14"/>
+          <w:u w:val="single"/>
+        </w:rPr>
+        <w:t>}</w:t>
       </w:r>
       <w:r>
         <w:rPr>

</xml_diff>